<commit_message>
update methodology + render docx/pdf
</commit_message>
<xml_diff>
--- a/word-docs/urednici-shrnuti_2026.docx
+++ b/word-docs/urednici-shrnuti_2026.docx
@@ -11,18 +11,18 @@
           <wp:inline>
             <wp:extent cx="3712464" cy="989291"/>
             <wp:effectExtent b="0" l="0" r="0" t="0"/>
-            <wp:docPr descr="" title="" id="46" name="Picture"/>
+            <wp:docPr descr="" title="" id="59" name="Picture"/>
             <a:graphic>
               <a:graphicData uri="http://schemas.openxmlformats.org/drawingml/2006/picture">
                 <pic:pic>
                   <pic:nvPicPr>
-                    <pic:cNvPr descr="word-templates/idea-logo.png" id="47" name="Picture"/>
+                    <pic:cNvPr descr="word-templates/idea-logo.png" id="60" name="Picture"/>
                     <pic:cNvPicPr>
                       <a:picLocks noChangeArrowheads="1" noChangeAspect="1"/>
                     </pic:cNvPicPr>
                   </pic:nvPicPr>
                   <pic:blipFill>
-                    <a:blip r:embed="rId45"/>
+                    <a:blip r:embed="rId58"/>
                     <a:stretch>
                       <a:fillRect/>
                     </a:stretch>
@@ -58,7 +58,7 @@
           <w:i/>
           <w:iCs/>
         </w:rPr>
-        <w:t xml:space="preserve">Interaktivní aplikace/2025</w:t>
+        <w:t xml:space="preserve">Interaktivní aplikace/2026</w:t>
       </w:r>
       <w:r>
         <w:t xml:space="preserve"> </w:t>
@@ -77,19 +77,19 @@
         <w:pStyle w:val="IDEAtitle0"/>
       </w:pPr>
       <w:r>
-        <w:t xml:space="preserve">Zaměstnanci státu a státní úředníci:</w:t>
+        <w:t xml:space="preserve">Zaměstnanci státu a jejich platy v roce 2025:</w:t>
       </w:r>
       <w:r>
         <w:br/>
       </w:r>
       <w:r>
-        <w:t xml:space="preserve">kde pracují a za kolik?</w:t>
+        <w:t xml:space="preserve">pád relativních platů se zastavil.</w:t>
       </w:r>
       <w:r>
         <w:rPr>
           <w:rStyle w:val="FootnoteReference"/>
         </w:rPr>
-        <w:footnoteReference w:id="48"/>
+        <w:footnoteReference w:id="61"/>
       </w:r>
     </w:p>
     <w:p>
@@ -145,13 +145,13 @@
         <w:t xml:space="preserve"> </w:t>
       </w:r>
     </w:p>
-    <w:bookmarkStart w:id="69" w:name="X80d1447286f4bf3b0de81997e34c38f3afee990"/>
+    <w:bookmarkStart w:id="82" w:name="shrnutí-klíčových-poznatků"/>
     <w:p>
       <w:pPr>
         <w:pStyle w:val="Heading1"/>
       </w:pPr>
       <w:r>
-        <w:t xml:space="preserve">Shrnutí klíčových poznatků z interaktivní datové aplikace</w:t>
+        <w:t xml:space="preserve">Shrnutí klíčových poznatků</w:t>
       </w:r>
     </w:p>
     <w:p>
@@ -163,39 +163,12 @@
         </w:numPr>
       </w:pPr>
       <w:r>
-        <w:rPr>
-          <w:b/>
-          <w:bCs/>
-        </w:rPr>
-        <w:t xml:space="preserve">Interaktivní</w:t>
-      </w:r>
-      <w:r>
-        <w:rPr>
-          <w:b/>
-          <w:bCs/>
-        </w:rPr>
-        <w:t xml:space="preserve"> </w:t>
-      </w:r>
-      <w:hyperlink r:id="rId50">
-        <w:r>
-          <w:rPr>
-            <w:rStyle w:val="Hyperlink"/>
-            <w:b/>
-            <w:bCs/>
-          </w:rPr>
-          <w:t xml:space="preserve">on-line aplikaci</w:t>
-        </w:r>
-      </w:hyperlink>
-      <w:r>
-        <w:t xml:space="preserve"> </w:t>
-      </w:r>
-      <w:r>
-        <w:t xml:space="preserve">každoročně aktualizujeme o nejnovější údaje o počtech zaměstnanců státu, jejich platech a nákladech na ně, a to na základě údajů z každoročního</w:t>
-      </w:r>
-      <w:r>
-        <w:t xml:space="preserve"> </w:t>
-      </w:r>
-      <w:hyperlink r:id="rId51">
+        <w:t xml:space="preserve">Srovnávací analýza představuje každoroční aktualizaci vývoje počtu zaměstnanců státu, jejich platů a nákladů na ně v roce 2025 a to na základě údajů</w:t>
+      </w:r>
+      <w:r>
+        <w:t xml:space="preserve"> </w:t>
+      </w:r>
+      <w:hyperlink r:id="rId63">
         <w:r>
           <w:rPr>
             <w:rStyle w:val="Hyperlink"/>
@@ -204,22 +177,13 @@
         </w:r>
       </w:hyperlink>
       <w:r>
+        <w:rPr>
+          <w:rStyle w:val="FootnoteReference"/>
+        </w:rPr>
+        <w:footnoteReference w:id="64"/>
+      </w:r>
+      <w:r>
         <w:t xml:space="preserve">.</w:t>
-      </w:r>
-      <w:r>
-        <w:t xml:space="preserve"> </w:t>
-      </w:r>
-      <w:r>
-        <w:t xml:space="preserve">Níže uvádíme přehled klíčových zjištění.</w:t>
-      </w:r>
-    </w:p>
-    <w:bookmarkStart w:id="52" w:name="vývoj-v-roce-2025-ve-stručnosti"/>
-    <w:p>
-      <w:pPr>
-        <w:pStyle w:val="Heading2"/>
-      </w:pPr>
-      <w:r>
-        <w:t xml:space="preserve">Vývoj v roce 2025 ve stručnosti</w:t>
       </w:r>
     </w:p>
     <w:p>
@@ -227,11 +191,11 @@
         <w:pStyle w:val="Compact"/>
         <w:numPr>
           <w:ilvl w:val="0"/>
-          <w:numId w:val="1002"/>
+          <w:numId w:val="1001"/>
         </w:numPr>
       </w:pPr>
       <w:r>
-        <w:t xml:space="preserve">Počet zaměstnanců státu za poslední rok narostl o cca 4 000 (0,8 %), přibylo především zaměstnanců škol a vojáků.</w:t>
+        <w:t xml:space="preserve">Počet zaměstnanců státu vzrostl o zhruba 4 000 (+0,8 %), přibylo především zaměstnanců ve školství a v armádě. Státních úředníků naopak o zhruba 300 ubylo (-0,4 %).</w:t>
       </w:r>
     </w:p>
     <w:p>
@@ -239,23 +203,11 @@
         <w:pStyle w:val="Compact"/>
         <w:numPr>
           <w:ilvl w:val="0"/>
-          <w:numId w:val="1002"/>
+          <w:numId w:val="1001"/>
         </w:numPr>
       </w:pPr>
       <w:r>
-        <w:t xml:space="preserve">Naopak státních úředníků cca 300 ubylo (0,4 %).</w:t>
-      </w:r>
-    </w:p>
-    <w:p>
-      <w:pPr>
-        <w:pStyle w:val="Compact"/>
-        <w:numPr>
-          <w:ilvl w:val="0"/>
-          <w:numId w:val="1002"/>
-        </w:numPr>
-      </w:pPr>
-      <w:r>
-        <w:t xml:space="preserve">Průměrné platy ve skupině</w:t>
+        <w:t xml:space="preserve">Průměrné platy v reálém vyjádření ve skupině</w:t>
       </w:r>
       <w:r>
         <w:t xml:space="preserve"> </w:t>
@@ -271,7 +223,7 @@
         <w:t xml:space="preserve"> </w:t>
       </w:r>
       <w:r>
-        <w:t xml:space="preserve">poprvé od roku 2020 vzrostly v reálném vyjádření.</w:t>
+        <w:t xml:space="preserve">poprvé od roku 2020 vzrostly. Vývoj platů zhruba kopíroval vývoj mezd v celé ekonomice a tedy se zastavilo delší období oslabování platové konkurenceschopnosti státních úřadů.</w:t>
       </w:r>
     </w:p>
     <w:p>
@@ -279,11 +231,11 @@
         <w:pStyle w:val="Compact"/>
         <w:numPr>
           <w:ilvl w:val="0"/>
-          <w:numId w:val="1002"/>
+          <w:numId w:val="1001"/>
         </w:numPr>
       </w:pPr>
       <w:r>
-        <w:t xml:space="preserve">Vývoj platů úředníků zhruba kopíroval ekonomiku, tj. téměř se zastavil pokles platové konkurenceschopnosti státních úřadů vyjádřené relativními platy vůči ekonomice.</w:t>
+        <w:t xml:space="preserve">V širším sektoru zaměstnanců státu pak vzrostla platová konkurenceschopnost v oblasti armády a příslušníků bezpečnostních sborů. Mírně naopak opět poklesla u zaměstnanců v regionálním školství</w:t>
       </w:r>
     </w:p>
     <w:p>
@@ -291,36 +243,43 @@
         <w:pStyle w:val="Compact"/>
         <w:numPr>
           <w:ilvl w:val="0"/>
-          <w:numId w:val="1002"/>
+          <w:numId w:val="1001"/>
         </w:numPr>
       </w:pPr>
       <w:r>
-        <w:t xml:space="preserve">V širším sektoru státních zaměstnanců pak vzrostla platová konkurenceschopst vojáků i příslušníků bezpečnostních sborů, mírně klesla u zaměstnanců regionálního školství.</w:t>
+        <w:t xml:space="preserve">Mnoho dalších informací poskytuje</w:t>
+      </w:r>
+      <w:r>
+        <w:t xml:space="preserve"> </w:t>
+      </w:r>
+      <w:hyperlink r:id="rId65">
+        <w:r>
+          <w:rPr>
+            <w:rStyle w:val="Hyperlink"/>
+            <w:b/>
+            <w:bCs/>
+          </w:rPr>
+          <w:t xml:space="preserve">on-line aplikace</w:t>
+        </w:r>
+      </w:hyperlink>
+      <w:r>
+        <w:t xml:space="preserve">. Ta letos uživatelům nově nabízí interaktivní nástroj analýzy dlouhodobých trendů.</w:t>
+      </w:r>
+    </w:p>
+    <w:bookmarkStart w:id="68" w:name="kdo-jsou-zaměstnanci-státu"/>
+    <w:p>
+      <w:pPr>
+        <w:pStyle w:val="Heading2"/>
+      </w:pPr>
+      <w:r>
+        <w:t xml:space="preserve">Kdo jsou zaměstnanci státu</w:t>
       </w:r>
     </w:p>
     <w:p>
       <w:pPr>
-        <w:pStyle w:val="FirstParagraph"/>
-      </w:pPr>
-      <w:r>
-        <w:t xml:space="preserve">Aplikace nově obsahuje interaktivní prohlížečku, kde je možné vybrat kategorie institucí a skupiny zaměstnanců pro srovnání a nastavit, co, zda a s čím se srovnává - ať už jde o platy, náklady nebo počty zaměstnanců.</w:t>
-      </w:r>
-    </w:p>
-    <w:bookmarkEnd w:id="52"/>
-    <w:bookmarkStart w:id="55" w:name="kdo-jsou-zaměstnanci-státu"/>
-    <w:p>
-      <w:pPr>
-        <w:pStyle w:val="Heading2"/>
-      </w:pPr>
-      <w:r>
-        <w:t xml:space="preserve">Kdo jsou zaměstnanci státu</w:t>
-      </w:r>
-    </w:p>
-    <w:p>
-      <w:pPr>
         <w:numPr>
           <w:ilvl w:val="0"/>
-          <w:numId w:val="1003"/>
+          <w:numId w:val="1002"/>
         </w:numPr>
       </w:pPr>
       <w:r>
@@ -334,7 +293,7 @@
         <w:t xml:space="preserve"> </w:t>
       </w:r>
       <w:r>
-        <w:t xml:space="preserve">ty, jejichž zaměstnanost reguluje a financuje státní rozpočet (SR), a je jich téměř půl milionu.</w:t>
+        <w:t xml:space="preserve">ty, jejichž zaměstnanost reguluje a financuje státní rozpočet (SR). Těch je téměř půl milionu.</w:t>
       </w:r>
       <w:r>
         <w:t xml:space="preserve"> </w:t>
@@ -357,7 +316,13 @@
           <w:numId w:val="1000"/>
         </w:numPr>
       </w:pPr>
-      <w:hyperlink r:id="rId53">
+      <w:r>
+        <w:t xml:space="preserve">→</w:t>
+      </w:r>
+      <w:r>
+        <w:t xml:space="preserve"> </w:t>
+      </w:r>
+      <w:hyperlink r:id="rId66">
         <w:r>
           <w:rPr>
             <w:rStyle w:val="Hyperlink"/>
@@ -374,7 +339,13 @@
           <w:numId w:val="1000"/>
         </w:numPr>
       </w:pPr>
-      <w:hyperlink r:id="rId54">
+      <w:r>
+        <w:t xml:space="preserve">→</w:t>
+      </w:r>
+      <w:r>
+        <w:t xml:space="preserve"> </w:t>
+      </w:r>
+      <w:hyperlink r:id="rId67">
         <w:r>
           <w:rPr>
             <w:rStyle w:val="Hyperlink"/>
@@ -383,8 +354,8 @@
         </w:r>
       </w:hyperlink>
     </w:p>
-    <w:bookmarkEnd w:id="55"/>
-    <w:bookmarkStart w:id="60" w:name="počty-zaměstnanců-státu"/>
+    <w:bookmarkEnd w:id="68"/>
+    <w:bookmarkStart w:id="73" w:name="počty-zaměstnanců-státu"/>
     <w:p>
       <w:pPr>
         <w:pStyle w:val="Heading2"/>
@@ -397,7 +368,7 @@
       <w:pPr>
         <w:numPr>
           <w:ilvl w:val="0"/>
-          <w:numId w:val="1004"/>
+          <w:numId w:val="1003"/>
         </w:numPr>
       </w:pPr>
       <w:r>
@@ -422,7 +393,13 @@
           <w:numId w:val="1000"/>
         </w:numPr>
       </w:pPr>
-      <w:hyperlink r:id="rId56">
+      <w:r>
+        <w:t xml:space="preserve">→</w:t>
+      </w:r>
+      <w:r>
+        <w:t xml:space="preserve"> </w:t>
+      </w:r>
+      <w:hyperlink r:id="rId69">
         <w:r>
           <w:rPr>
             <w:rStyle w:val="Hyperlink"/>
@@ -435,7 +412,7 @@
       <w:pPr>
         <w:numPr>
           <w:ilvl w:val="1"/>
-          <w:numId w:val="1005"/>
+          <w:numId w:val="1004"/>
         </w:numPr>
       </w:pPr>
       <w:r>
@@ -446,7 +423,7 @@
       <w:pPr>
         <w:numPr>
           <w:ilvl w:val="1"/>
-          <w:numId w:val="1005"/>
+          <w:numId w:val="1004"/>
         </w:numPr>
       </w:pPr>
       <w:r>
@@ -457,7 +434,7 @@
       <w:pPr>
         <w:numPr>
           <w:ilvl w:val="1"/>
-          <w:numId w:val="1005"/>
+          <w:numId w:val="1004"/>
         </w:numPr>
       </w:pPr>
       <w:r>
@@ -468,7 +445,7 @@
       <w:pPr>
         <w:numPr>
           <w:ilvl w:val="1"/>
-          <w:numId w:val="1005"/>
+          <w:numId w:val="1004"/>
         </w:numPr>
       </w:pPr>
       <w:r>
@@ -479,7 +456,7 @@
       <w:pPr>
         <w:numPr>
           <w:ilvl w:val="0"/>
-          <w:numId w:val="1004"/>
+          <w:numId w:val="1003"/>
         </w:numPr>
       </w:pPr>
       <w:r>
@@ -493,7 +470,7 @@
         <w:t xml:space="preserve"> </w:t>
       </w:r>
       <w:r>
-        <w:t xml:space="preserve">Od roku 2017 se meziroční nárůsty pohybovaly mezi 3,8 až 14,9 tisíci zaměstnanců, což ale s ohledem na vysoké počty zaměstnanců znamená růsty pouze v řádu 1 % až 3 %.</w:t>
+        <w:t xml:space="preserve">Od roku 2017 se meziroční nárůsty pohybovaly mezi 3,8 až 14,9 tisíci zaměstnanců, což ale s ohledem na celkově vysoké počty zaměstnanců znamená růsty pouze v řádu 1 % až 3 %.</w:t>
       </w:r>
       <w:r>
         <w:t xml:space="preserve"> </w:t>
@@ -510,7 +487,13 @@
           <w:numId w:val="1000"/>
         </w:numPr>
       </w:pPr>
-      <w:hyperlink r:id="rId56">
+      <w:r>
+        <w:t xml:space="preserve">→</w:t>
+      </w:r>
+      <w:r>
+        <w:t xml:space="preserve"> </w:t>
+      </w:r>
+      <w:hyperlink r:id="rId69">
         <w:r>
           <w:rPr>
             <w:rStyle w:val="Hyperlink"/>
@@ -523,7 +506,7 @@
       <w:pPr>
         <w:numPr>
           <w:ilvl w:val="0"/>
-          <w:numId w:val="1004"/>
+          <w:numId w:val="1003"/>
         </w:numPr>
       </w:pPr>
       <w:r>
@@ -563,7 +546,13 @@
           <w:numId w:val="1000"/>
         </w:numPr>
       </w:pPr>
-      <w:hyperlink r:id="rId53">
+      <w:r>
+        <w:t xml:space="preserve">→</w:t>
+      </w:r>
+      <w:r>
+        <w:t xml:space="preserve"> </w:t>
+      </w:r>
+      <w:hyperlink r:id="rId66">
         <w:r>
           <w:rPr>
             <w:rStyle w:val="Hyperlink"/>
@@ -580,7 +569,13 @@
           <w:numId w:val="1000"/>
         </w:numPr>
       </w:pPr>
-      <w:hyperlink r:id="rId57">
+      <w:r>
+        <w:t xml:space="preserve">→</w:t>
+      </w:r>
+      <w:r>
+        <w:t xml:space="preserve"> </w:t>
+      </w:r>
+      <w:hyperlink r:id="rId70">
         <w:r>
           <w:rPr>
             <w:rStyle w:val="Hyperlink"/>
@@ -597,7 +592,13 @@
           <w:numId w:val="1000"/>
         </w:numPr>
       </w:pPr>
-      <w:hyperlink r:id="rId58">
+      <w:r>
+        <w:t xml:space="preserve">→</w:t>
+      </w:r>
+      <w:r>
+        <w:t xml:space="preserve"> </w:t>
+      </w:r>
+      <w:hyperlink r:id="rId71">
         <w:r>
           <w:rPr>
             <w:rStyle w:val="Hyperlink"/>
@@ -610,7 +611,7 @@
       <w:pPr>
         <w:numPr>
           <w:ilvl w:val="0"/>
-          <w:numId w:val="1004"/>
+          <w:numId w:val="1003"/>
         </w:numPr>
       </w:pPr>
       <w:r>
@@ -665,7 +666,13 @@
           <w:numId w:val="1000"/>
         </w:numPr>
       </w:pPr>
-      <w:hyperlink r:id="rId58">
+      <w:r>
+        <w:t xml:space="preserve">→</w:t>
+      </w:r>
+      <w:r>
+        <w:t xml:space="preserve"> </w:t>
+      </w:r>
+      <w:hyperlink r:id="rId71">
         <w:r>
           <w:rPr>
             <w:rStyle w:val="Hyperlink"/>
@@ -678,7 +685,7 @@
       <w:pPr>
         <w:numPr>
           <w:ilvl w:val="0"/>
-          <w:numId w:val="1004"/>
+          <w:numId w:val="1003"/>
         </w:numPr>
       </w:pPr>
       <w:r>
@@ -695,7 +702,13 @@
         <w:t xml:space="preserve"> </w:t>
       </w:r>
       <w:r>
-        <w:t xml:space="preserve">Zaměstnanost v takto definovaném sektoru dlouhodobě představuje zhruba 1 milion osob, tedy necelou pětinu pracovní síly v české ekonomice. Tento počet dlouhodobě mírně roste; v roce 2025 narostl o 14 tisíc (1,6 %) a za zhruba dvěma třetinami tohoto nárůstu stojí samosprávy, kde jsou započteny i nárůsty počtu zaměstnanců v regionálním školství. K nárůstu v ústředním státu přispívá i mírný setrvalý růst počtu vojáků.</w:t>
+        <w:t xml:space="preserve">Zaměstnanost v takto definovaném sektoru dlouhodobě představuje zhruba 1 milion osob, tedy necelou pětinu pracovní síly v české ekonomice. Tento počet dlouhodobě mírně roste; v roce 2025 narostl o 14 tisíc (1,6 %) a za zhruba dvěma třetinami tohoto nárůstu stojí samosprávy, kde jsou započteny i nárůsty počtu zaměstnanců v regionálním školství.</w:t>
+      </w:r>
+      <w:r>
+        <w:t xml:space="preserve"> </w:t>
+      </w:r>
+      <w:r>
+        <w:t xml:space="preserve">K nárůstu v ústředním státu přispívá i mírný setrvalý růst počtu vojáků.</w:t>
       </w:r>
     </w:p>
     <w:p>
@@ -706,7 +719,13 @@
           <w:numId w:val="1000"/>
         </w:numPr>
       </w:pPr>
-      <w:hyperlink r:id="rId59">
+      <w:r>
+        <w:t xml:space="preserve">→</w:t>
+      </w:r>
+      <w:r>
+        <w:t xml:space="preserve"> </w:t>
+      </w:r>
+      <w:hyperlink r:id="rId72">
         <w:r>
           <w:rPr>
             <w:rStyle w:val="Hyperlink"/>
@@ -715,8 +734,8 @@
         </w:r>
       </w:hyperlink>
     </w:p>
-    <w:bookmarkEnd w:id="60"/>
-    <w:bookmarkStart w:id="65" w:name="platy-zaměstnanců-státu"/>
+    <w:bookmarkEnd w:id="73"/>
+    <w:bookmarkStart w:id="78" w:name="platy-zaměstnanců-státu"/>
     <w:p>
       <w:pPr>
         <w:pStyle w:val="Heading2"/>
@@ -729,7 +748,7 @@
       <w:pPr>
         <w:numPr>
           <w:ilvl w:val="0"/>
-          <w:numId w:val="1006"/>
+          <w:numId w:val="1005"/>
         </w:numPr>
       </w:pPr>
       <w:r>
@@ -749,13 +768,31 @@
         <w:t xml:space="preserve"> </w:t>
       </w:r>
       <w:r>
-        <w:t xml:space="preserve">Platy na neministerských ústředních orgánech rostly (4,5 %) o něco rychleji než na neústředních úřadech (3,4 %) a ministerstvech (3,2 %). K tomuto relativně rychlejším nárůstu v početně malé skupině zaměstnanců ostatních ústředních orgánů přispěl růst průměrného platu na Digitální a informační agentuře, spojený s nárůstem počtu jejích zaměstnanců.</w:t>
-      </w:r>
-      <w:r>
-        <w:t xml:space="preserve"> </w:t>
-      </w:r>
-      <w:r>
-        <w:t xml:space="preserve">Průměrné platy státních úředníků ale stále klesaly – byť mírněji než v minulých letech – vůči průměrné mzdě v ekonomice, protože v jiných částech ekonomiky platy rostly rychleji. Nejvíce se vůči konkurenčním mzdám propadla ministerstva a naopak mírně se zlepšila pozice ústředních orgánů, které je třeba srovnávat s platy v Praze. Platová úroveň ministerstev a ústředních úřadů nyní dosahuje cca 95 % resp. 87 % pražského průměru, a to i přesto, že v těchto úřadech pracuje vyšší podíl např. vysokoškolsky vzdělaných lidí, než na celém trhu práce v Praze.</w:t>
+        <w:t xml:space="preserve">Platy na neministerských ústředních orgánech rostly (4,5 %) o něco rychleji než na neústředních úřadech (3,4 %) a ministerstvech (3,2 %).</w:t>
+      </w:r>
+      <w:r>
+        <w:t xml:space="preserve"> </w:t>
+      </w:r>
+      <w:r>
+        <w:t xml:space="preserve">K tomuto relativně rychlejším nárůstu v početně malé skupině zaměstnanců ostatních ústředních orgánů přispěl růst průměrného platu v Digitální a informační agentuře, spojený s nárůstem počtu jejích zaměstnanců.</w:t>
+      </w:r>
+      <w:r>
+        <w:t xml:space="preserve"> </w:t>
+      </w:r>
+      <w:r>
+        <w:t xml:space="preserve">Průměrné platy státních úředníků vůči průměrné mzdě v ekonomice ale opět poklesly– byť mírněji než v minulých letech – protože průměrná mzda v celé ekonomice rostla opět rychleji.</w:t>
+      </w:r>
+      <w:r>
+        <w:t xml:space="preserve"> </w:t>
+      </w:r>
+      <w:r>
+        <w:t xml:space="preserve">Nejvíce se propadly relativní mzdy na ministerstvech. Naopak se mírně zvýšily v ústředních orgánech, které je třeba srovnávat s platy v Praze.</w:t>
+      </w:r>
+      <w:r>
+        <w:t xml:space="preserve"> </w:t>
+      </w:r>
+      <w:r>
+        <w:t xml:space="preserve">Platová úroveň ministerstev a ústředních úřadů nyní dosahuje cca 95 % resp. 87 % pražského průměru, a to i přesto, že v těchto úřadech pracuje vyšší podíl např. vysokoškolsky vzdělaných lidí, než na celém trhu práce v Praze.</w:t>
       </w:r>
     </w:p>
     <w:p>
@@ -766,7 +803,13 @@
           <w:numId w:val="1000"/>
         </w:numPr>
       </w:pPr>
-      <w:hyperlink r:id="rId61">
+      <w:r>
+        <w:t xml:space="preserve">→</w:t>
+      </w:r>
+      <w:r>
+        <w:t xml:space="preserve"> </w:t>
+      </w:r>
+      <w:hyperlink r:id="rId74">
         <w:r>
           <w:rPr>
             <w:rStyle w:val="Hyperlink"/>
@@ -779,7 +822,7 @@
       <w:pPr>
         <w:numPr>
           <w:ilvl w:val="0"/>
-          <w:numId w:val="1006"/>
+          <w:numId w:val="1005"/>
         </w:numPr>
       </w:pPr>
       <w:r>
@@ -813,7 +856,13 @@
           <w:numId w:val="1000"/>
         </w:numPr>
       </w:pPr>
-      <w:hyperlink r:id="rId62">
+      <w:r>
+        <w:t xml:space="preserve">→</w:t>
+      </w:r>
+      <w:r>
+        <w:t xml:space="preserve"> </w:t>
+      </w:r>
+      <w:hyperlink r:id="rId75">
         <w:r>
           <w:rPr>
             <w:rStyle w:val="Hyperlink"/>
@@ -826,7 +875,7 @@
       <w:pPr>
         <w:numPr>
           <w:ilvl w:val="0"/>
-          <w:numId w:val="1006"/>
+          <w:numId w:val="1005"/>
         </w:numPr>
       </w:pPr>
       <w:r>
@@ -875,7 +924,13 @@
           <w:numId w:val="1000"/>
         </w:numPr>
       </w:pPr>
-      <w:hyperlink r:id="rId61">
+      <w:r>
+        <w:t xml:space="preserve">→</w:t>
+      </w:r>
+      <w:r>
+        <w:t xml:space="preserve"> </w:t>
+      </w:r>
+      <w:hyperlink r:id="rId74">
         <w:r>
           <w:rPr>
             <w:rStyle w:val="Hyperlink"/>
@@ -888,7 +943,7 @@
       <w:pPr>
         <w:numPr>
           <w:ilvl w:val="0"/>
-          <w:numId w:val="1006"/>
+          <w:numId w:val="1005"/>
         </w:numPr>
       </w:pPr>
       <w:r>
@@ -935,7 +990,7 @@
       <w:r>
         <w:t xml:space="preserve"> </w:t>
       </w:r>
-      <w:hyperlink r:id="rId63">
+      <w:hyperlink r:id="rId76">
         <w:r>
           <w:rPr>
             <w:rStyle w:val="Hyperlink"/>
@@ -955,7 +1010,13 @@
           <w:numId w:val="1000"/>
         </w:numPr>
       </w:pPr>
-      <w:hyperlink r:id="rId64">
+      <w:r>
+        <w:t xml:space="preserve">→</w:t>
+      </w:r>
+      <w:r>
+        <w:t xml:space="preserve"> </w:t>
+      </w:r>
+      <w:hyperlink r:id="rId77">
         <w:r>
           <w:rPr>
             <w:rStyle w:val="Hyperlink"/>
@@ -968,7 +1029,7 @@
       <w:pPr>
         <w:numPr>
           <w:ilvl w:val="0"/>
-          <w:numId w:val="1006"/>
+          <w:numId w:val="1005"/>
         </w:numPr>
       </w:pPr>
       <w:r>
@@ -1005,7 +1066,13 @@
           <w:numId w:val="1000"/>
         </w:numPr>
       </w:pPr>
-      <w:hyperlink r:id="rId64">
+      <w:r>
+        <w:t xml:space="preserve">→</w:t>
+      </w:r>
+      <w:r>
+        <w:t xml:space="preserve"> </w:t>
+      </w:r>
+      <w:hyperlink r:id="rId77">
         <w:r>
           <w:rPr>
             <w:rStyle w:val="Hyperlink"/>
@@ -1018,7 +1085,7 @@
       <w:pPr>
         <w:numPr>
           <w:ilvl w:val="0"/>
-          <w:numId w:val="1006"/>
+          <w:numId w:val="1005"/>
         </w:numPr>
       </w:pPr>
       <w:r>
@@ -1055,7 +1122,13 @@
           <w:numId w:val="1000"/>
         </w:numPr>
       </w:pPr>
-      <w:hyperlink r:id="rId64">
+      <w:r>
+        <w:t xml:space="preserve">→</w:t>
+      </w:r>
+      <w:r>
+        <w:t xml:space="preserve"> </w:t>
+      </w:r>
+      <w:hyperlink r:id="rId77">
         <w:r>
           <w:rPr>
             <w:rStyle w:val="Hyperlink"/>
@@ -1064,8 +1137,8 @@
         </w:r>
       </w:hyperlink>
     </w:p>
-    <w:bookmarkEnd w:id="65"/>
-    <w:bookmarkStart w:id="68" w:name="výdaje-na-platy-zaměstnanců-státu"/>
+    <w:bookmarkEnd w:id="78"/>
+    <w:bookmarkStart w:id="81" w:name="výdaje-na-platy-zaměstnanců-státu"/>
     <w:p>
       <w:pPr>
         <w:pStyle w:val="Heading2"/>
@@ -1078,7 +1151,7 @@
       <w:pPr>
         <w:numPr>
           <w:ilvl w:val="0"/>
-          <w:numId w:val="1007"/>
+          <w:numId w:val="1006"/>
         </w:numPr>
       </w:pPr>
       <w:r>
@@ -1109,7 +1182,13 @@
           <w:numId w:val="1000"/>
         </w:numPr>
       </w:pPr>
-      <w:hyperlink r:id="rId66">
+      <w:r>
+        <w:t xml:space="preserve">→</w:t>
+      </w:r>
+      <w:r>
+        <w:t xml:space="preserve"> </w:t>
+      </w:r>
+      <w:hyperlink r:id="rId79">
         <w:r>
           <w:rPr>
             <w:rStyle w:val="Hyperlink"/>
@@ -1122,7 +1201,7 @@
       <w:pPr>
         <w:numPr>
           <w:ilvl w:val="0"/>
-          <w:numId w:val="1007"/>
+          <w:numId w:val="1006"/>
         </w:numPr>
       </w:pPr>
       <w:r>
@@ -1153,7 +1232,13 @@
           <w:numId w:val="1000"/>
         </w:numPr>
       </w:pPr>
-      <w:hyperlink r:id="rId66">
+      <w:r>
+        <w:t xml:space="preserve">→</w:t>
+      </w:r>
+      <w:r>
+        <w:t xml:space="preserve"> </w:t>
+      </w:r>
+      <w:hyperlink r:id="rId79">
         <w:r>
           <w:rPr>
             <w:rStyle w:val="Hyperlink"/>
@@ -1166,7 +1251,7 @@
       <w:pPr>
         <w:numPr>
           <w:ilvl w:val="0"/>
-          <w:numId w:val="1007"/>
+          <w:numId w:val="1006"/>
         </w:numPr>
       </w:pPr>
       <w:r>
@@ -1209,7 +1294,13 @@
           <w:numId w:val="1000"/>
         </w:numPr>
       </w:pPr>
-      <w:hyperlink r:id="rId67">
+      <w:r>
+        <w:t xml:space="preserve">→</w:t>
+      </w:r>
+      <w:r>
+        <w:t xml:space="preserve"> </w:t>
+      </w:r>
+      <w:hyperlink r:id="rId80">
         <w:r>
           <w:rPr>
             <w:rStyle w:val="Hyperlink"/>
@@ -1222,7 +1313,7 @@
       <w:pPr>
         <w:numPr>
           <w:ilvl w:val="0"/>
-          <w:numId w:val="1007"/>
+          <w:numId w:val="1006"/>
         </w:numPr>
       </w:pPr>
       <w:r>
@@ -1265,7 +1356,13 @@
           <w:numId w:val="1000"/>
         </w:numPr>
       </w:pPr>
-      <w:hyperlink r:id="rId61">
+      <w:r>
+        <w:t xml:space="preserve">→</w:t>
+      </w:r>
+      <w:r>
+        <w:t xml:space="preserve"> </w:t>
+      </w:r>
+      <w:hyperlink r:id="rId74">
         <w:r>
           <w:rPr>
             <w:rStyle w:val="Hyperlink"/>
@@ -1274,13 +1371,13 @@
         </w:r>
       </w:hyperlink>
     </w:p>
-    <w:bookmarkEnd w:id="68"/>
-    <w:bookmarkEnd w:id="69"/>
+    <w:bookmarkEnd w:id="81"/>
+    <w:bookmarkEnd w:id="82"/>
     <w:sectPr>
-      <w:headerReference r:id="rId33" w:type="default"/>
-      <w:footerReference r:id="rId34" w:type="default"/>
-      <w:headerReference r:id="rId35" w:type="first"/>
-      <w:footerReference r:id="rId36" w:type="first"/>
+      <w:headerReference r:id="rId46" w:type="default"/>
+      <w:footerReference r:id="rId47" w:type="default"/>
+      <w:headerReference r:id="rId48" w:type="first"/>
+      <w:footerReference r:id="rId49" w:type="first"/>
       <w:pgSz w:code="9" w:h="16838" w:w="11906"/>
       <w:pgMar w:bottom="1247" w:footer="567" w:gutter="0" w:header="737" w:left="1247" w:right="1247" w:top="1247"/>
       <w:cols w:space="708"/>
@@ -1296,7 +1393,7 @@
 </file>
 
 <file path=word/footer1.xml><?xml version="1.0" encoding="utf-8"?>
-<w:ftr xmlns:wpc="http://schemas.microsoft.com/office/word/2010/wordprocessingCanvas" xmlns:cx="http://schemas.microsoft.com/office/drawing/2014/chartex" xmlns:cx1="http://schemas.microsoft.com/office/drawing/2015/9/8/chartex" xmlns:cx2="http://schemas.microsoft.com/office/drawing/2015/10/21/chartex" xmlns:cx3="http://schemas.microsoft.com/office/drawing/2016/5/9/chartex" xmlns:cx4="http://schemas.microsoft.com/office/drawing/2016/5/10/chartex" xmlns:cx5="http://schemas.microsoft.com/office/drawing/2016/5/11/chartex" xmlns:cx6="http://schemas.microsoft.com/office/drawing/2016/5/12/chartex" xmlns:cx7="http://schemas.microsoft.com/office/drawing/2016/5/13/chartex" xmlns:cx8="http://schemas.microsoft.com/office/drawing/2016/5/14/chartex" xmlns:mc="http://schemas.openxmlformats.org/markup-compatibility/2006" xmlns:m="http://schemas.openxmlformats.org/officeDocument/2006/math" xmlns:aink="http://schemas.microsoft.com/office/drawing/2016/ink" xmlns:am3d="http://schemas.microsoft.com/office/drawing/2017/model3d" xmlns:oel="http://schemas.microsoft.com/office/2019/extlst" xmlns:r="http://schemas.openxmlformats.org/officeDocument/2006/relationships" xmlns:wp14="http://schemas.microsoft.com/office/word/2010/wordprocessingDrawing" xmlns:wp="http://schemas.openxmlformats.org/drawingml/2006/wordprocessingDrawing" xmlns:wpg="http://schemas.microsoft.com/office/word/2010/wordprocessingGroup" xmlns:wpi="http://schemas.microsoft.com/office/word/2010/wordprocessingInk" xmlns:wps="http://schemas.microsoft.com/office/word/2010/wordprocessingShape" xmlns:o="urn:schemas-microsoft-com:office:office" xmlns:v="urn:schemas-microsoft-com:vml" xmlns:w10="urn:schemas-microsoft-com:office:word" xmlns:w="http://schemas.openxmlformats.org/wordprocessingml/2006/main" xmlns:w14="http://schemas.microsoft.com/office/word/2010/wordml" xmlns:w15="http://schemas.microsoft.com/office/word/2012/wordml" xmlns:w16cex="http://schemas.microsoft.com/office/word/2018/wordml/cex" xmlns:w16cid="http://schemas.microsoft.com/office/word/2016/wordml/cid" xmlns:w16="http://schemas.microsoft.com/office/word/2018/wordml" xmlns:w16sdtdh="http://schemas.microsoft.com/office/word/2020/wordml/sdtdatahash" xmlns:w16sdtfl="http://schemas.microsoft.com/office/word/2024/wordml/sdtformatlock" xmlns:w16se="http://schemas.microsoft.com/office/word/2015/wordml/symex" xmlns:w16du="http://schemas.microsoft.com/office/word/2023/wordml/word16du" xmlns:wne="http://schemas.microsoft.com/office/word/2006/wordml" mc:Ignorable="w14 w15 w16se w16cid w16 w16cex w16sdtdh w16sdtfl w16du wp14">
+<w:ftr xmlns:wpc="http://schemas.microsoft.com/office/word/2010/wordprocessingCanvas" xmlns:cx="http://schemas.microsoft.com/office/drawing/2014/chartex" xmlns:cx1="http://schemas.microsoft.com/office/drawing/2015/9/8/chartex" xmlns:cx2="http://schemas.microsoft.com/office/drawing/2015/10/21/chartex" xmlns:cx3="http://schemas.microsoft.com/office/drawing/2016/5/9/chartex" xmlns:cx4="http://schemas.microsoft.com/office/drawing/2016/5/10/chartex" xmlns:cx5="http://schemas.microsoft.com/office/drawing/2016/5/11/chartex" xmlns:cx6="http://schemas.microsoft.com/office/drawing/2016/5/12/chartex" xmlns:cx7="http://schemas.microsoft.com/office/drawing/2016/5/13/chartex" xmlns:cx8="http://schemas.microsoft.com/office/drawing/2016/5/14/chartex" xmlns:mc="http://schemas.openxmlformats.org/markup-compatibility/2006" xmlns:m="http://schemas.openxmlformats.org/officeDocument/2006/math" xmlns:aink="http://schemas.microsoft.com/office/drawing/2016/ink" xmlns:am3d="http://schemas.microsoft.com/office/drawing/2017/model3d" xmlns:oel="http://schemas.microsoft.com/office/2019/extlst" xmlns:r="http://schemas.openxmlformats.org/officeDocument/2006/relationships" xmlns:wp14="http://schemas.microsoft.com/office/word/2010/wordprocessingDrawing" xmlns:wp="http://schemas.openxmlformats.org/drawingml/2006/wordprocessingDrawing" xmlns:wpg="http://schemas.microsoft.com/office/word/2010/wordprocessingGroup" xmlns:wpi="http://schemas.microsoft.com/office/word/2010/wordprocessingInk" xmlns:wps="http://schemas.microsoft.com/office/word/2010/wordprocessingShape" xmlns:o="urn:schemas-microsoft-com:office:office" xmlns:v="urn:schemas-microsoft-com:vml" xmlns:w10="urn:schemas-microsoft-com:office:word" xmlns:w="http://schemas.openxmlformats.org/wordprocessingml/2006/main" xmlns:w14="http://schemas.microsoft.com/office/word/2010/wordml" xmlns:w15="http://schemas.microsoft.com/office/word/2012/wordml" xmlns:w16cei="http://schemas.microsoft.com/office/word/2026/wordml/cei" xmlns:w16cex="http://schemas.microsoft.com/office/word/2018/wordml/cex" xmlns:w16cid="http://schemas.microsoft.com/office/word/2016/wordml/cid" xmlns:w16="http://schemas.microsoft.com/office/word/2018/wordml" xmlns:w16sdtdh="http://schemas.microsoft.com/office/word/2020/wordml/sdtdatahash" xmlns:w16sdtfl="http://schemas.microsoft.com/office/word/2024/wordml/sdtformatlock" xmlns:w16se="http://schemas.microsoft.com/office/word/2015/wordml/symex" xmlns:w16du="http://schemas.microsoft.com/office/word/2023/wordml/word16du" xmlns:wne="http://schemas.microsoft.com/office/word/2006/wordml" mc:Ignorable="w14 w15 w16se w16cid w16 w16cex w16sdtdh w16sdtfl w16du wp14">
   <w:sdt>
     <w:sdtPr>
       <w:id w:val="1589121001"/>
@@ -1336,7 +1433,7 @@
 </file>
 
 <file path=word/footer2.xml><?xml version="1.0" encoding="utf-8"?>
-<w:ftr xmlns:wpc="http://schemas.microsoft.com/office/word/2010/wordprocessingCanvas" xmlns:cx="http://schemas.microsoft.com/office/drawing/2014/chartex" xmlns:cx1="http://schemas.microsoft.com/office/drawing/2015/9/8/chartex" xmlns:cx2="http://schemas.microsoft.com/office/drawing/2015/10/21/chartex" xmlns:cx3="http://schemas.microsoft.com/office/drawing/2016/5/9/chartex" xmlns:cx4="http://schemas.microsoft.com/office/drawing/2016/5/10/chartex" xmlns:cx5="http://schemas.microsoft.com/office/drawing/2016/5/11/chartex" xmlns:cx6="http://schemas.microsoft.com/office/drawing/2016/5/12/chartex" xmlns:cx7="http://schemas.microsoft.com/office/drawing/2016/5/13/chartex" xmlns:cx8="http://schemas.microsoft.com/office/drawing/2016/5/14/chartex" xmlns:mc="http://schemas.openxmlformats.org/markup-compatibility/2006" xmlns:m="http://schemas.openxmlformats.org/officeDocument/2006/math" xmlns:aink="http://schemas.microsoft.com/office/drawing/2016/ink" xmlns:am3d="http://schemas.microsoft.com/office/drawing/2017/model3d" xmlns:oel="http://schemas.microsoft.com/office/2019/extlst" xmlns:r="http://schemas.openxmlformats.org/officeDocument/2006/relationships" xmlns:wp14="http://schemas.microsoft.com/office/word/2010/wordprocessingDrawing" xmlns:wp="http://schemas.openxmlformats.org/drawingml/2006/wordprocessingDrawing" xmlns:wpg="http://schemas.microsoft.com/office/word/2010/wordprocessingGroup" xmlns:wpi="http://schemas.microsoft.com/office/word/2010/wordprocessingInk" xmlns:wps="http://schemas.microsoft.com/office/word/2010/wordprocessingShape" xmlns:o="urn:schemas-microsoft-com:office:office" xmlns:v="urn:schemas-microsoft-com:vml" xmlns:w10="urn:schemas-microsoft-com:office:word" xmlns:w="http://schemas.openxmlformats.org/wordprocessingml/2006/main" xmlns:w14="http://schemas.microsoft.com/office/word/2010/wordml" xmlns:w15="http://schemas.microsoft.com/office/word/2012/wordml" xmlns:w16cex="http://schemas.microsoft.com/office/word/2018/wordml/cex" xmlns:w16cid="http://schemas.microsoft.com/office/word/2016/wordml/cid" xmlns:w16="http://schemas.microsoft.com/office/word/2018/wordml" xmlns:w16sdtdh="http://schemas.microsoft.com/office/word/2020/wordml/sdtdatahash" xmlns:w16sdtfl="http://schemas.microsoft.com/office/word/2024/wordml/sdtformatlock" xmlns:w16se="http://schemas.microsoft.com/office/word/2015/wordml/symex" xmlns:w16du="http://schemas.microsoft.com/office/word/2023/wordml/word16du" xmlns:wne="http://schemas.microsoft.com/office/word/2006/wordml" mc:Ignorable="w14 w15 w16se w16cid w16 w16cex w16sdtdh w16sdtfl w16du wp14">
+<w:ftr xmlns:wpc="http://schemas.microsoft.com/office/word/2010/wordprocessingCanvas" xmlns:cx="http://schemas.microsoft.com/office/drawing/2014/chartex" xmlns:cx1="http://schemas.microsoft.com/office/drawing/2015/9/8/chartex" xmlns:cx2="http://schemas.microsoft.com/office/drawing/2015/10/21/chartex" xmlns:cx3="http://schemas.microsoft.com/office/drawing/2016/5/9/chartex" xmlns:cx4="http://schemas.microsoft.com/office/drawing/2016/5/10/chartex" xmlns:cx5="http://schemas.microsoft.com/office/drawing/2016/5/11/chartex" xmlns:cx6="http://schemas.microsoft.com/office/drawing/2016/5/12/chartex" xmlns:cx7="http://schemas.microsoft.com/office/drawing/2016/5/13/chartex" xmlns:cx8="http://schemas.microsoft.com/office/drawing/2016/5/14/chartex" xmlns:mc="http://schemas.openxmlformats.org/markup-compatibility/2006" xmlns:m="http://schemas.openxmlformats.org/officeDocument/2006/math" xmlns:aink="http://schemas.microsoft.com/office/drawing/2016/ink" xmlns:am3d="http://schemas.microsoft.com/office/drawing/2017/model3d" xmlns:oel="http://schemas.microsoft.com/office/2019/extlst" xmlns:r="http://schemas.openxmlformats.org/officeDocument/2006/relationships" xmlns:wp14="http://schemas.microsoft.com/office/word/2010/wordprocessingDrawing" xmlns:wp="http://schemas.openxmlformats.org/drawingml/2006/wordprocessingDrawing" xmlns:wpg="http://schemas.microsoft.com/office/word/2010/wordprocessingGroup" xmlns:wpi="http://schemas.microsoft.com/office/word/2010/wordprocessingInk" xmlns:wps="http://schemas.microsoft.com/office/word/2010/wordprocessingShape" xmlns:o="urn:schemas-microsoft-com:office:office" xmlns:v="urn:schemas-microsoft-com:vml" xmlns:w10="urn:schemas-microsoft-com:office:word" xmlns:w="http://schemas.openxmlformats.org/wordprocessingml/2006/main" xmlns:w14="http://schemas.microsoft.com/office/word/2010/wordml" xmlns:w15="http://schemas.microsoft.com/office/word/2012/wordml" xmlns:w16cei="http://schemas.microsoft.com/office/word/2026/wordml/cei" xmlns:w16cex="http://schemas.microsoft.com/office/word/2018/wordml/cex" xmlns:w16cid="http://schemas.microsoft.com/office/word/2016/wordml/cid" xmlns:w16="http://schemas.microsoft.com/office/word/2018/wordml" xmlns:w16sdtdh="http://schemas.microsoft.com/office/word/2020/wordml/sdtdatahash" xmlns:w16sdtfl="http://schemas.microsoft.com/office/word/2024/wordml/sdtformatlock" xmlns:w16se="http://schemas.microsoft.com/office/word/2015/wordml/symex" xmlns:w16du="http://schemas.microsoft.com/office/word/2023/wordml/word16du" xmlns:wne="http://schemas.microsoft.com/office/word/2006/wordml" mc:Ignorable="w14 w15 w16se w16cid w16 w16cex w16sdtdh w16sdtfl w16du wp14">
   <w:sdt>
     <w:sdtPr>
       <w:id w:val="-378481179"/>
@@ -1391,7 +1488,7 @@
       </w:r>
     </w:p>
   </w:footnote>
-  <w:footnote w:id="48">
+  <w:footnote w:id="61">
     <w:p>
       <w:pPr>
         <w:pStyle w:val="FootnoteText"/>
@@ -1417,7 +1514,7 @@
       <w:r>
         <w:t xml:space="preserve"> </w:t>
       </w:r>
-      <w:hyperlink r:id="rId49">
+      <w:hyperlink r:id="rId62">
         <w:r>
           <w:rPr>
             <w:rStyle w:val="Hyperlink"/>
@@ -1441,11 +1538,30 @@
       </w:r>
     </w:p>
   </w:footnote>
+  <w:footnote w:id="64">
+    <w:p>
+      <w:pPr>
+        <w:pStyle w:val="FootnoteText"/>
+      </w:pPr>
+      <w:r>
+        <w:rPr>
+          <w:rStyle w:val="FootnoteReference"/>
+        </w:rPr>
+        <w:footnoteRef/>
+      </w:r>
+      <w:r>
+        <w:t xml:space="preserve"> </w:t>
+      </w:r>
+      <w:r>
+        <w:t xml:space="preserve">https://www.mfcr.cz/cs/rozpoctova-politika/statni-rozpocet/plneni-statniho-rozpoctu</w:t>
+      </w:r>
+    </w:p>
+  </w:footnote>
 </w:footnotes>
 </file>
 
 <file path=word/header1.xml><?xml version="1.0" encoding="utf-8"?>
-<w:hdr xmlns:wpc="http://schemas.microsoft.com/office/word/2010/wordprocessingCanvas" xmlns:cx="http://schemas.microsoft.com/office/drawing/2014/chartex" xmlns:cx1="http://schemas.microsoft.com/office/drawing/2015/9/8/chartex" xmlns:cx2="http://schemas.microsoft.com/office/drawing/2015/10/21/chartex" xmlns:cx3="http://schemas.microsoft.com/office/drawing/2016/5/9/chartex" xmlns:cx4="http://schemas.microsoft.com/office/drawing/2016/5/10/chartex" xmlns:cx5="http://schemas.microsoft.com/office/drawing/2016/5/11/chartex" xmlns:cx6="http://schemas.microsoft.com/office/drawing/2016/5/12/chartex" xmlns:cx7="http://schemas.microsoft.com/office/drawing/2016/5/13/chartex" xmlns:cx8="http://schemas.microsoft.com/office/drawing/2016/5/14/chartex" xmlns:mc="http://schemas.openxmlformats.org/markup-compatibility/2006" xmlns:m="http://schemas.openxmlformats.org/officeDocument/2006/math" xmlns:aink="http://schemas.microsoft.com/office/drawing/2016/ink" xmlns:am3d="http://schemas.microsoft.com/office/drawing/2017/model3d" xmlns:oel="http://schemas.microsoft.com/office/2019/extlst" xmlns:r="http://schemas.openxmlformats.org/officeDocument/2006/relationships" xmlns:wp14="http://schemas.microsoft.com/office/word/2010/wordprocessingDrawing" xmlns:wp="http://schemas.openxmlformats.org/drawingml/2006/wordprocessingDrawing" xmlns:wpg="http://schemas.microsoft.com/office/word/2010/wordprocessingGroup" xmlns:wpi="http://schemas.microsoft.com/office/word/2010/wordprocessingInk" xmlns:wps="http://schemas.microsoft.com/office/word/2010/wordprocessingShape" xmlns:o="urn:schemas-microsoft-com:office:office" xmlns:v="urn:schemas-microsoft-com:vml" xmlns:w10="urn:schemas-microsoft-com:office:word" xmlns:w="http://schemas.openxmlformats.org/wordprocessingml/2006/main" xmlns:w14="http://schemas.microsoft.com/office/word/2010/wordml" xmlns:w15="http://schemas.microsoft.com/office/word/2012/wordml" xmlns:w16cex="http://schemas.microsoft.com/office/word/2018/wordml/cex" xmlns:w16cid="http://schemas.microsoft.com/office/word/2016/wordml/cid" xmlns:w16="http://schemas.microsoft.com/office/word/2018/wordml" xmlns:w16sdtdh="http://schemas.microsoft.com/office/word/2020/wordml/sdtdatahash" xmlns:w16sdtfl="http://schemas.microsoft.com/office/word/2024/wordml/sdtformatlock" xmlns:w16se="http://schemas.microsoft.com/office/word/2015/wordml/symex" xmlns:w16du="http://schemas.microsoft.com/office/word/2023/wordml/word16du" xmlns:wne="http://schemas.microsoft.com/office/word/2006/wordml" mc:Ignorable="w14 w15 w16se w16cid w16 w16cex w16sdtdh w16sdtfl w16du wp14">
+<w:hdr xmlns:wpc="http://schemas.microsoft.com/office/word/2010/wordprocessingCanvas" xmlns:cx="http://schemas.microsoft.com/office/drawing/2014/chartex" xmlns:cx1="http://schemas.microsoft.com/office/drawing/2015/9/8/chartex" xmlns:cx2="http://schemas.microsoft.com/office/drawing/2015/10/21/chartex" xmlns:cx3="http://schemas.microsoft.com/office/drawing/2016/5/9/chartex" xmlns:cx4="http://schemas.microsoft.com/office/drawing/2016/5/10/chartex" xmlns:cx5="http://schemas.microsoft.com/office/drawing/2016/5/11/chartex" xmlns:cx6="http://schemas.microsoft.com/office/drawing/2016/5/12/chartex" xmlns:cx7="http://schemas.microsoft.com/office/drawing/2016/5/13/chartex" xmlns:cx8="http://schemas.microsoft.com/office/drawing/2016/5/14/chartex" xmlns:mc="http://schemas.openxmlformats.org/markup-compatibility/2006" xmlns:m="http://schemas.openxmlformats.org/officeDocument/2006/math" xmlns:aink="http://schemas.microsoft.com/office/drawing/2016/ink" xmlns:am3d="http://schemas.microsoft.com/office/drawing/2017/model3d" xmlns:oel="http://schemas.microsoft.com/office/2019/extlst" xmlns:r="http://schemas.openxmlformats.org/officeDocument/2006/relationships" xmlns:wp14="http://schemas.microsoft.com/office/word/2010/wordprocessingDrawing" xmlns:wp="http://schemas.openxmlformats.org/drawingml/2006/wordprocessingDrawing" xmlns:wpg="http://schemas.microsoft.com/office/word/2010/wordprocessingGroup" xmlns:wpi="http://schemas.microsoft.com/office/word/2010/wordprocessingInk" xmlns:wps="http://schemas.microsoft.com/office/word/2010/wordprocessingShape" xmlns:o="urn:schemas-microsoft-com:office:office" xmlns:v="urn:schemas-microsoft-com:vml" xmlns:w10="urn:schemas-microsoft-com:office:word" xmlns:w="http://schemas.openxmlformats.org/wordprocessingml/2006/main" xmlns:w14="http://schemas.microsoft.com/office/word/2010/wordml" xmlns:w15="http://schemas.microsoft.com/office/word/2012/wordml" xmlns:w16cei="http://schemas.microsoft.com/office/word/2026/wordml/cei" xmlns:w16cex="http://schemas.microsoft.com/office/word/2018/wordml/cex" xmlns:w16cid="http://schemas.microsoft.com/office/word/2016/wordml/cid" xmlns:w16="http://schemas.microsoft.com/office/word/2018/wordml" xmlns:w16sdtdh="http://schemas.microsoft.com/office/word/2020/wordml/sdtdatahash" xmlns:w16sdtfl="http://schemas.microsoft.com/office/word/2024/wordml/sdtformatlock" xmlns:w16se="http://schemas.microsoft.com/office/word/2015/wordml/symex" xmlns:w16du="http://schemas.microsoft.com/office/word/2023/wordml/word16du" xmlns:wne="http://schemas.microsoft.com/office/word/2006/wordml" mc:Ignorable="w14 w15 w16se w16cid w16 w16cex w16sdtdh w16sdtfl w16du wp14">
   <w:p>
     <w:pPr>
       <w:pBdr>
@@ -1520,7 +1636,7 @@
         <w:sz w:val="16"/>
         <w:szCs w:val="16"/>
       </w:rPr>
-      <w:t xml:space="preserve">            </w:t>
+      <w:t xml:space="preserve">           </w:t>
     </w:r>
     <w:r>
       <w:rPr>
@@ -1550,7 +1666,7 @@
         <w:sz w:val="16"/>
         <w:szCs w:val="16"/>
       </w:rPr>
-      <w:t>5</w:t>
+      <w:t>6</w:t>
     </w:r>
   </w:p>
   <w:p>
@@ -1562,7 +1678,7 @@
 </file>
 
 <file path=word/header2.xml><?xml version="1.0" encoding="utf-8"?>
-<w:hdr xmlns:wpc="http://schemas.microsoft.com/office/word/2010/wordprocessingCanvas" xmlns:cx="http://schemas.microsoft.com/office/drawing/2014/chartex" xmlns:cx1="http://schemas.microsoft.com/office/drawing/2015/9/8/chartex" xmlns:cx2="http://schemas.microsoft.com/office/drawing/2015/10/21/chartex" xmlns:cx3="http://schemas.microsoft.com/office/drawing/2016/5/9/chartex" xmlns:cx4="http://schemas.microsoft.com/office/drawing/2016/5/10/chartex" xmlns:cx5="http://schemas.microsoft.com/office/drawing/2016/5/11/chartex" xmlns:cx6="http://schemas.microsoft.com/office/drawing/2016/5/12/chartex" xmlns:cx7="http://schemas.microsoft.com/office/drawing/2016/5/13/chartex" xmlns:cx8="http://schemas.microsoft.com/office/drawing/2016/5/14/chartex" xmlns:mc="http://schemas.openxmlformats.org/markup-compatibility/2006" xmlns:m="http://schemas.openxmlformats.org/officeDocument/2006/math" xmlns:aink="http://schemas.microsoft.com/office/drawing/2016/ink" xmlns:am3d="http://schemas.microsoft.com/office/drawing/2017/model3d" xmlns:oel="http://schemas.microsoft.com/office/2019/extlst" xmlns:r="http://schemas.openxmlformats.org/officeDocument/2006/relationships" xmlns:wp14="http://schemas.microsoft.com/office/word/2010/wordprocessingDrawing" xmlns:wp="http://schemas.openxmlformats.org/drawingml/2006/wordprocessingDrawing" xmlns:wpg="http://schemas.microsoft.com/office/word/2010/wordprocessingGroup" xmlns:wpi="http://schemas.microsoft.com/office/word/2010/wordprocessingInk" xmlns:wps="http://schemas.microsoft.com/office/word/2010/wordprocessingShape" xmlns:o="urn:schemas-microsoft-com:office:office" xmlns:v="urn:schemas-microsoft-com:vml" xmlns:w10="urn:schemas-microsoft-com:office:word" xmlns:w="http://schemas.openxmlformats.org/wordprocessingml/2006/main" xmlns:w14="http://schemas.microsoft.com/office/word/2010/wordml" xmlns:w15="http://schemas.microsoft.com/office/word/2012/wordml" xmlns:w16cex="http://schemas.microsoft.com/office/word/2018/wordml/cex" xmlns:w16cid="http://schemas.microsoft.com/office/word/2016/wordml/cid" xmlns:w16="http://schemas.microsoft.com/office/word/2018/wordml" xmlns:w16sdtdh="http://schemas.microsoft.com/office/word/2020/wordml/sdtdatahash" xmlns:w16sdtfl="http://schemas.microsoft.com/office/word/2024/wordml/sdtformatlock" xmlns:w16se="http://schemas.microsoft.com/office/word/2015/wordml/symex" xmlns:w16du="http://schemas.microsoft.com/office/word/2023/wordml/word16du" xmlns:wne="http://schemas.microsoft.com/office/word/2006/wordml" mc:Ignorable="w14 w15 w16se w16cid w16 w16cex w16sdtdh w16sdtfl w16du wp14">
+<w:hdr xmlns:wpc="http://schemas.microsoft.com/office/word/2010/wordprocessingCanvas" xmlns:cx="http://schemas.microsoft.com/office/drawing/2014/chartex" xmlns:cx1="http://schemas.microsoft.com/office/drawing/2015/9/8/chartex" xmlns:cx2="http://schemas.microsoft.com/office/drawing/2015/10/21/chartex" xmlns:cx3="http://schemas.microsoft.com/office/drawing/2016/5/9/chartex" xmlns:cx4="http://schemas.microsoft.com/office/drawing/2016/5/10/chartex" xmlns:cx5="http://schemas.microsoft.com/office/drawing/2016/5/11/chartex" xmlns:cx6="http://schemas.microsoft.com/office/drawing/2016/5/12/chartex" xmlns:cx7="http://schemas.microsoft.com/office/drawing/2016/5/13/chartex" xmlns:cx8="http://schemas.microsoft.com/office/drawing/2016/5/14/chartex" xmlns:mc="http://schemas.openxmlformats.org/markup-compatibility/2006" xmlns:m="http://schemas.openxmlformats.org/officeDocument/2006/math" xmlns:aink="http://schemas.microsoft.com/office/drawing/2016/ink" xmlns:am3d="http://schemas.microsoft.com/office/drawing/2017/model3d" xmlns:oel="http://schemas.microsoft.com/office/2019/extlst" xmlns:r="http://schemas.openxmlformats.org/officeDocument/2006/relationships" xmlns:wp14="http://schemas.microsoft.com/office/word/2010/wordprocessingDrawing" xmlns:wp="http://schemas.openxmlformats.org/drawingml/2006/wordprocessingDrawing" xmlns:wpg="http://schemas.microsoft.com/office/word/2010/wordprocessingGroup" xmlns:wpi="http://schemas.microsoft.com/office/word/2010/wordprocessingInk" xmlns:wps="http://schemas.microsoft.com/office/word/2010/wordprocessingShape" xmlns:o="urn:schemas-microsoft-com:office:office" xmlns:v="urn:schemas-microsoft-com:vml" xmlns:w10="urn:schemas-microsoft-com:office:word" xmlns:w="http://schemas.openxmlformats.org/wordprocessingml/2006/main" xmlns:w14="http://schemas.microsoft.com/office/word/2010/wordml" xmlns:w15="http://schemas.microsoft.com/office/word/2012/wordml" xmlns:w16cei="http://schemas.microsoft.com/office/word/2026/wordml/cei" xmlns:w16cex="http://schemas.microsoft.com/office/word/2018/wordml/cex" xmlns:w16cid="http://schemas.microsoft.com/office/word/2016/wordml/cid" xmlns:w16="http://schemas.microsoft.com/office/word/2018/wordml" xmlns:w16sdtdh="http://schemas.microsoft.com/office/word/2020/wordml/sdtdatahash" xmlns:w16sdtfl="http://schemas.microsoft.com/office/word/2024/wordml/sdtformatlock" xmlns:w16se="http://schemas.microsoft.com/office/word/2015/wordml/symex" xmlns:w16du="http://schemas.microsoft.com/office/word/2023/wordml/word16du" xmlns:wne="http://schemas.microsoft.com/office/word/2006/wordml" mc:Ignorable="w14 w15 w16se w16cid w16 w16cex w16sdtdh w16sdtfl w16du wp14">
   <w:p>
     <w:pPr>
       <w:pStyle w:val="Header"/>
@@ -1581,7 +1697,7 @@
 </file>
 
 <file path=word/numbering.xml><?xml version="1.0" encoding="utf-8"?>
-<w:numbering xmlns:aink="http://schemas.microsoft.com/office/drawing/2016/ink" xmlns:am3d="http://schemas.microsoft.com/office/drawing/2017/model3d" xmlns:cx="http://schemas.microsoft.com/office/drawing/2014/chartex" xmlns:cx1="http://schemas.microsoft.com/office/drawing/2015/9/8/chartex" xmlns:cx2="http://schemas.microsoft.com/office/drawing/2015/10/21/chartex" xmlns:cx3="http://schemas.microsoft.com/office/drawing/2016/5/9/chartex" xmlns:cx4="http://schemas.microsoft.com/office/drawing/2016/5/10/chartex" xmlns:cx5="http://schemas.microsoft.com/office/drawing/2016/5/11/chartex" xmlns:cx6="http://schemas.microsoft.com/office/drawing/2016/5/12/chartex" xmlns:cx7="http://schemas.microsoft.com/office/drawing/2016/5/13/chartex" xmlns:cx8="http://schemas.microsoft.com/office/drawing/2016/5/14/chartex" xmlns:m="http://schemas.openxmlformats.org/officeDocument/2006/math" xmlns:mc="http://schemas.openxmlformats.org/markup-compatibility/2006" xmlns:o="urn:schemas-microsoft-com:office:office" xmlns:oel="http://schemas.microsoft.com/office/2019/extlst" xmlns:r="http://schemas.openxmlformats.org/officeDocument/2006/relationships" xmlns:v="urn:schemas-microsoft-com:vml" xmlns:w="http://schemas.openxmlformats.org/wordprocessingml/2006/main" xmlns:w10="urn:schemas-microsoft-com:office:word" xmlns:w14="http://schemas.microsoft.com/office/word/2010/wordml" xmlns:w15="http://schemas.microsoft.com/office/word/2012/wordml" xmlns:w16="http://schemas.microsoft.com/office/word/2018/wordml" xmlns:w16cex="http://schemas.microsoft.com/office/word/2018/wordml/cex" xmlns:w16cid="http://schemas.microsoft.com/office/word/2016/wordml/cid" xmlns:w16du="http://schemas.microsoft.com/office/word/2023/wordml/word16du" xmlns:w16sdtdh="http://schemas.microsoft.com/office/word/2020/wordml/sdtdatahash" xmlns:w16sdtfl="http://schemas.microsoft.com/office/word/2024/wordml/sdtformatlock" xmlns:w16se="http://schemas.microsoft.com/office/word/2015/wordml/symex" xmlns:wne="http://schemas.microsoft.com/office/word/2006/wordml" xmlns:wp="http://schemas.openxmlformats.org/drawingml/2006/wordprocessingDrawing" xmlns:wp14="http://schemas.microsoft.com/office/word/2010/wordprocessingDrawing" xmlns:wpc="http://schemas.microsoft.com/office/word/2010/wordprocessingCanvas" xmlns:wpg="http://schemas.microsoft.com/office/word/2010/wordprocessingGroup" xmlns:wpi="http://schemas.microsoft.com/office/word/2010/wordprocessingInk" xmlns:wps="http://schemas.microsoft.com/office/word/2010/wordprocessingShape" mc:Ignorable="w14 w15 w16se w16cid w16 w16cex w16sdtdh w16sdtfl w16du wp14">
+<w:numbering xmlns:aink="http://schemas.microsoft.com/office/drawing/2016/ink" xmlns:am3d="http://schemas.microsoft.com/office/drawing/2017/model3d" xmlns:cx="http://schemas.microsoft.com/office/drawing/2014/chartex" xmlns:cx1="http://schemas.microsoft.com/office/drawing/2015/9/8/chartex" xmlns:cx2="http://schemas.microsoft.com/office/drawing/2015/10/21/chartex" xmlns:cx3="http://schemas.microsoft.com/office/drawing/2016/5/9/chartex" xmlns:cx4="http://schemas.microsoft.com/office/drawing/2016/5/10/chartex" xmlns:cx5="http://schemas.microsoft.com/office/drawing/2016/5/11/chartex" xmlns:cx6="http://schemas.microsoft.com/office/drawing/2016/5/12/chartex" xmlns:cx7="http://schemas.microsoft.com/office/drawing/2016/5/13/chartex" xmlns:cx8="http://schemas.microsoft.com/office/drawing/2016/5/14/chartex" xmlns:m="http://schemas.openxmlformats.org/officeDocument/2006/math" xmlns:mc="http://schemas.openxmlformats.org/markup-compatibility/2006" xmlns:o="urn:schemas-microsoft-com:office:office" xmlns:oel="http://schemas.microsoft.com/office/2019/extlst" xmlns:r="http://schemas.openxmlformats.org/officeDocument/2006/relationships" xmlns:v="urn:schemas-microsoft-com:vml" xmlns:w="http://schemas.openxmlformats.org/wordprocessingml/2006/main" xmlns:w10="urn:schemas-microsoft-com:office:word" xmlns:w14="http://schemas.microsoft.com/office/word/2010/wordml" xmlns:w15="http://schemas.microsoft.com/office/word/2012/wordml" xmlns:w16="http://schemas.microsoft.com/office/word/2018/wordml" xmlns:w16cei="http://schemas.microsoft.com/office/word/2026/wordml/cei" xmlns:w16cex="http://schemas.microsoft.com/office/word/2018/wordml/cex" xmlns:w16cid="http://schemas.microsoft.com/office/word/2016/wordml/cid" xmlns:w16du="http://schemas.microsoft.com/office/word/2023/wordml/word16du" xmlns:w16sdtdh="http://schemas.microsoft.com/office/word/2020/wordml/sdtdatahash" xmlns:w16sdtfl="http://schemas.microsoft.com/office/word/2024/wordml/sdtformatlock" xmlns:w16se="http://schemas.microsoft.com/office/word/2015/wordml/symex" xmlns:wne="http://schemas.microsoft.com/office/word/2006/wordml" xmlns:wp="http://schemas.openxmlformats.org/drawingml/2006/wordprocessingDrawing" xmlns:wp14="http://schemas.microsoft.com/office/word/2010/wordprocessingDrawing" xmlns:wpc="http://schemas.microsoft.com/office/word/2010/wordprocessingCanvas" xmlns:wpg="http://schemas.microsoft.com/office/word/2010/wordprocessingGroup" xmlns:wpi="http://schemas.microsoft.com/office/word/2010/wordprocessingInk" xmlns:wps="http://schemas.microsoft.com/office/word/2010/wordprocessingShape" mc:Ignorable="w14 w15 w16se w16cid w16 w16cex w16sdtdh w16sdtfl w16du wp14">
   <w:abstractNum w15:restartNumberingAfterBreak="0" w:abstractNumId="0">
     <w:nsid w:val="B455C341"/>
     <w:multiLevelType w:val="multilevel"/>
@@ -1675,6 +1791,188 @@
     </w:lvl>
   </w:abstractNum>
   <w:abstractNum w15:restartNumberingAfterBreak="0" w:abstractNumId="1">
+    <w:nsid w:val="0000A990"/>
+    <w:multiLevelType w:val="multilevel"/>
+    <w:tmpl w:val="821E4FC2"/>
+    <w:lvl w:ilvl="0">
+      <w:numFmt w:val="bullet"/>
+      <w:lvlText w:val=" "/>
+      <w:lvlJc w:val="left"/>
+      <w:pPr>
+        <w:ind w:hanging="360" w:left="720"/>
+      </w:pPr>
+    </w:lvl>
+    <w:lvl w:ilvl="1">
+      <w:numFmt w:val="bullet"/>
+      <w:lvlText w:val=" "/>
+      <w:lvlJc w:val="left"/>
+      <w:pPr>
+        <w:ind w:hanging="360" w:left="1440"/>
+      </w:pPr>
+    </w:lvl>
+    <w:lvl w:ilvl="2">
+      <w:numFmt w:val="bullet"/>
+      <w:lvlText w:val=" "/>
+      <w:lvlJc w:val="left"/>
+      <w:pPr>
+        <w:ind w:hanging="360" w:left="2160"/>
+      </w:pPr>
+    </w:lvl>
+    <w:lvl w:ilvl="3">
+      <w:numFmt w:val="bullet"/>
+      <w:lvlText w:val=" "/>
+      <w:lvlJc w:val="left"/>
+      <w:pPr>
+        <w:ind w:hanging="360" w:left="2880"/>
+      </w:pPr>
+    </w:lvl>
+    <w:lvl w:ilvl="4">
+      <w:numFmt w:val="bullet"/>
+      <w:lvlText w:val=" "/>
+      <w:lvlJc w:val="left"/>
+      <w:pPr>
+        <w:ind w:hanging="360" w:left="3600"/>
+      </w:pPr>
+    </w:lvl>
+    <w:lvl w:ilvl="5">
+      <w:numFmt w:val="bullet"/>
+      <w:lvlText w:val=" "/>
+      <w:lvlJc w:val="left"/>
+      <w:pPr>
+        <w:ind w:hanging="360" w:left="4320"/>
+      </w:pPr>
+    </w:lvl>
+    <w:lvl w:ilvl="6">
+      <w:numFmt w:val="bullet"/>
+      <w:lvlText w:val=" "/>
+      <w:lvlJc w:val="left"/>
+      <w:pPr>
+        <w:ind w:hanging="360" w:left="5040"/>
+      </w:pPr>
+    </w:lvl>
+    <w:lvl w:ilvl="7">
+      <w:numFmt w:val="bullet"/>
+      <w:lvlText w:val=" "/>
+      <w:lvlJc w:val="left"/>
+      <w:pPr>
+        <w:ind w:hanging="360" w:left="5760"/>
+      </w:pPr>
+    </w:lvl>
+    <w:lvl w:ilvl="8">
+      <w:numFmt w:val="bullet"/>
+      <w:lvlText w:val=" "/>
+      <w:lvlJc w:val="left"/>
+      <w:pPr>
+        <w:ind w:hanging="360" w:left="6480"/>
+      </w:pPr>
+    </w:lvl>
+  </w:abstractNum>
+  <w:abstractNum w15:restartNumberingAfterBreak="0" w:abstractNumId="2">
+    <w:nsid w:val="0000A991"/>
+    <w:multiLevelType w:val="multilevel"/>
+    <w:tmpl w:val="8C1C997E"/>
+    <w:lvl w:ilvl="0">
+      <w:numFmt w:val="bullet"/>
+      <w:pStyle w:val="Compact"/>
+      <w:lvlText w:val=""/>
+      <w:lvlJc w:val="left"/>
+      <w:pPr>
+        <w:ind w:hanging="360" w:left="720"/>
+      </w:pPr>
+      <w:rPr>
+        <w:rFonts w:ascii="Symbol" w:cs="Symbol" w:hAnsi="Symbol" w:hint="default"/>
+      </w:rPr>
+    </w:lvl>
+    <w:lvl w:ilvl="1">
+      <w:numFmt w:val="bullet"/>
+      <w:lvlText w:val="o"/>
+      <w:lvlJc w:val="left"/>
+      <w:pPr>
+        <w:ind w:hanging="360" w:left="1440"/>
+      </w:pPr>
+      <w:rPr>
+        <w:rFonts w:ascii="Courier New" w:cs="Courier New" w:hAnsi="Courier New" w:hint="default"/>
+      </w:rPr>
+    </w:lvl>
+    <w:lvl w:ilvl="2">
+      <w:numFmt w:val="bullet"/>
+      <w:lvlText w:val=""/>
+      <w:lvlJc w:val="left"/>
+      <w:pPr>
+        <w:ind w:hanging="360" w:left="2160"/>
+      </w:pPr>
+      <w:rPr>
+        <w:rFonts w:ascii="Wingdings" w:cs="Wingdings" w:hAnsi="Wingdings" w:hint="default"/>
+      </w:rPr>
+    </w:lvl>
+    <w:lvl w:ilvl="3">
+      <w:numFmt w:val="bullet"/>
+      <w:lvlText w:val=""/>
+      <w:lvlJc w:val="left"/>
+      <w:pPr>
+        <w:ind w:hanging="360" w:left="2880"/>
+      </w:pPr>
+      <w:rPr>
+        <w:rFonts w:ascii="Symbol" w:cs="Symbol" w:hAnsi="Symbol" w:hint="default"/>
+      </w:rPr>
+    </w:lvl>
+    <w:lvl w:ilvl="4">
+      <w:numFmt w:val="bullet"/>
+      <w:lvlText w:val="o"/>
+      <w:lvlJc w:val="left"/>
+      <w:pPr>
+        <w:ind w:hanging="360" w:left="3600"/>
+      </w:pPr>
+      <w:rPr>
+        <w:rFonts w:ascii="Courier New" w:cs="Courier New" w:hAnsi="Courier New" w:hint="default"/>
+      </w:rPr>
+    </w:lvl>
+    <w:lvl w:ilvl="5">
+      <w:numFmt w:val="bullet"/>
+      <w:lvlText w:val=""/>
+      <w:lvlJc w:val="left"/>
+      <w:pPr>
+        <w:ind w:hanging="360" w:left="4320"/>
+      </w:pPr>
+      <w:rPr>
+        <w:rFonts w:ascii="Wingdings" w:cs="Wingdings" w:hAnsi="Wingdings" w:hint="default"/>
+      </w:rPr>
+    </w:lvl>
+    <w:lvl w:ilvl="6">
+      <w:numFmt w:val="bullet"/>
+      <w:lvlText w:val=""/>
+      <w:lvlJc w:val="left"/>
+      <w:pPr>
+        <w:ind w:hanging="360" w:left="5040"/>
+      </w:pPr>
+      <w:rPr>
+        <w:rFonts w:ascii="Symbol" w:cs="Symbol" w:hAnsi="Symbol" w:hint="default"/>
+      </w:rPr>
+    </w:lvl>
+    <w:lvl w:ilvl="7">
+      <w:numFmt w:val="bullet"/>
+      <w:lvlText w:val="o"/>
+      <w:lvlJc w:val="left"/>
+      <w:pPr>
+        <w:ind w:hanging="360" w:left="5760"/>
+      </w:pPr>
+      <w:rPr>
+        <w:rFonts w:ascii="Courier New" w:cs="Courier New" w:hAnsi="Courier New" w:hint="default"/>
+      </w:rPr>
+    </w:lvl>
+    <w:lvl w:ilvl="8">
+      <w:numFmt w:val="bullet"/>
+      <w:lvlText w:val=""/>
+      <w:lvlJc w:val="left"/>
+      <w:pPr>
+        <w:ind w:hanging="360" w:left="6480"/>
+      </w:pPr>
+      <w:rPr>
+        <w:rFonts w:ascii="Wingdings" w:cs="Wingdings" w:hAnsi="Wingdings" w:hint="default"/>
+      </w:rPr>
+    </w:lvl>
+  </w:abstractNum>
+  <w:abstractNum w15:restartNumberingAfterBreak="0" w:abstractNumId="3">
     <w:nsid w:val="01C04ED9"/>
     <w:multiLevelType w:val="multilevel"/>
     <w:tmpl w:val="26807968"/>
@@ -1772,7 +2070,7 @@
       <w:lvlJc w:val="left"/>
     </w:lvl>
   </w:abstractNum>
-  <w:abstractNum w15:restartNumberingAfterBreak="0" w:abstractNumId="2">
+  <w:abstractNum w15:restartNumberingAfterBreak="0" w:abstractNumId="4">
     <w:nsid w:val="044A3D75"/>
     <w:multiLevelType w:val="hybridMultilevel"/>
     <w:tmpl w:val="E090ABCC"/>
@@ -1887,7 +2185,7 @@
       </w:rPr>
     </w:lvl>
   </w:abstractNum>
-  <w:abstractNum w15:restartNumberingAfterBreak="0" w:abstractNumId="3">
+  <w:abstractNum w15:restartNumberingAfterBreak="0" w:abstractNumId="5">
     <w:nsid w:val="04987C3E"/>
     <w:multiLevelType w:val="hybridMultilevel"/>
     <w:tmpl w:val="74A8C594"/>
@@ -2002,7 +2300,7 @@
       </w:rPr>
     </w:lvl>
   </w:abstractNum>
-  <w:abstractNum w15:restartNumberingAfterBreak="0" w:abstractNumId="4">
+  <w:abstractNum w15:restartNumberingAfterBreak="0" w:abstractNumId="6">
     <w:nsid w:val="0DAC3FC2"/>
     <w:multiLevelType w:val="hybridMultilevel"/>
     <w:tmpl w:val="C92A0BFA"/>
@@ -2091,7 +2389,7 @@
       </w:pPr>
     </w:lvl>
   </w:abstractNum>
-  <w:abstractNum w15:restartNumberingAfterBreak="0" w:abstractNumId="5">
+  <w:abstractNum w15:restartNumberingAfterBreak="0" w:abstractNumId="7">
     <w:nsid w:val="12946667"/>
     <w:multiLevelType w:val="hybridMultilevel"/>
     <w:tmpl w:val="5EA8BA1E"/>
@@ -2181,7 +2479,7 @@
       </w:pPr>
     </w:lvl>
   </w:abstractNum>
-  <w:abstractNum w15:restartNumberingAfterBreak="0" w:abstractNumId="6">
+  <w:abstractNum w15:restartNumberingAfterBreak="0" w:abstractNumId="8">
     <w:nsid w:val="148B56F7"/>
     <w:multiLevelType w:val="hybridMultilevel"/>
     <w:tmpl w:val="6F3CC09A"/>
@@ -2305,7 +2603,7 @@
       </w:rPr>
     </w:lvl>
   </w:abstractNum>
-  <w:abstractNum w15:restartNumberingAfterBreak="0" w:abstractNumId="7">
+  <w:abstractNum w15:restartNumberingAfterBreak="0" w:abstractNumId="9">
     <w:nsid w:val="1831483D"/>
     <w:multiLevelType w:val="multilevel"/>
     <w:tmpl w:val="23CEF48A"/>
@@ -2403,7 +2701,7 @@
       <w:lvlJc w:val="left"/>
     </w:lvl>
   </w:abstractNum>
-  <w:abstractNum w15:restartNumberingAfterBreak="0" w:abstractNumId="8">
+  <w:abstractNum w15:restartNumberingAfterBreak="0" w:abstractNumId="10">
     <w:nsid w:val="1A392C21"/>
     <w:multiLevelType w:val="hybridMultilevel"/>
     <w:tmpl w:val="5E8EF64A"/>
@@ -2496,7 +2794,7 @@
       </w:pPr>
     </w:lvl>
   </w:abstractNum>
-  <w:abstractNum w15:restartNumberingAfterBreak="0" w:abstractNumId="9">
+  <w:abstractNum w15:restartNumberingAfterBreak="0" w:abstractNumId="11">
     <w:nsid w:val="1A683556"/>
     <w:multiLevelType w:val="hybridMultilevel"/>
     <w:tmpl w:val="A03CB8DA"/>
@@ -2609,7 +2907,7 @@
       </w:rPr>
     </w:lvl>
   </w:abstractNum>
-  <w:abstractNum w15:restartNumberingAfterBreak="0" w:abstractNumId="10">
+  <w:abstractNum w15:restartNumberingAfterBreak="0" w:abstractNumId="12">
     <w:nsid w:val="1CCD140B"/>
     <w:multiLevelType w:val="hybridMultilevel"/>
     <w:tmpl w:val="3F8AE48C"/>
@@ -2725,7 +3023,7 @@
       </w:rPr>
     </w:lvl>
   </w:abstractNum>
-  <w:abstractNum w15:restartNumberingAfterBreak="0" w:abstractNumId="11">
+  <w:abstractNum w15:restartNumberingAfterBreak="0" w:abstractNumId="13">
     <w:nsid w:val="22D73C3C"/>
     <w:multiLevelType w:val="hybridMultilevel"/>
     <w:tmpl w:val="E25C7A0A"/>
@@ -2939,7 +3237,7 @@
       </w:rPr>
     </w:lvl>
   </w:abstractNum>
-  <w:abstractNum w15:restartNumberingAfterBreak="0" w:abstractNumId="12">
+  <w:abstractNum w15:restartNumberingAfterBreak="0" w:abstractNumId="14">
     <w:nsid w:val="25BE2B0A"/>
     <w:multiLevelType w:val="hybridMultilevel"/>
     <w:tmpl w:val="C52A818A"/>
@@ -3030,7 +3328,7 @@
       </w:pPr>
     </w:lvl>
   </w:abstractNum>
-  <w:abstractNum w15:restartNumberingAfterBreak="0" w:abstractNumId="13">
+  <w:abstractNum w15:restartNumberingAfterBreak="0" w:abstractNumId="15">
     <w:nsid w:val="28B968A7"/>
     <w:multiLevelType w:val="hybridMultilevel"/>
     <w:tmpl w:val="9C865630"/>
@@ -3144,7 +3442,7 @@
       </w:rPr>
     </w:lvl>
   </w:abstractNum>
-  <w:abstractNum w15:restartNumberingAfterBreak="0" w:abstractNumId="14">
+  <w:abstractNum w15:restartNumberingAfterBreak="0" w:abstractNumId="16">
     <w:nsid w:val="31344998"/>
     <w:multiLevelType w:val="hybridMultilevel"/>
     <w:tmpl w:val="902C661C"/>
@@ -3264,7 +3562,7 @@
       </w:rPr>
     </w:lvl>
   </w:abstractNum>
-  <w:abstractNum w15:restartNumberingAfterBreak="0" w:abstractNumId="15">
+  <w:abstractNum w15:restartNumberingAfterBreak="0" w:abstractNumId="17">
     <w:nsid w:val="330A3796"/>
     <w:multiLevelType w:val="hybridMultilevel"/>
     <w:tmpl w:val="76ECAD60"/>
@@ -3377,7 +3675,7 @@
       </w:rPr>
     </w:lvl>
   </w:abstractNum>
-  <w:abstractNum w15:restartNumberingAfterBreak="0" w:abstractNumId="16">
+  <w:abstractNum w15:restartNumberingAfterBreak="0" w:abstractNumId="18">
     <w:nsid w:val="35BD5DD5"/>
     <w:multiLevelType w:val="hybridMultilevel"/>
     <w:tmpl w:val="F77ABAE6"/>
@@ -3492,7 +3790,7 @@
       </w:rPr>
     </w:lvl>
   </w:abstractNum>
-  <w:abstractNum w15:restartNumberingAfterBreak="0" w:abstractNumId="17">
+  <w:abstractNum w15:restartNumberingAfterBreak="0" w:abstractNumId="19">
     <w:nsid w:val="37EE7412"/>
     <w:multiLevelType w:val="hybridMultilevel"/>
     <w:tmpl w:val="CB54E218"/>
@@ -3706,7 +4004,7 @@
       </w:rPr>
     </w:lvl>
   </w:abstractNum>
-  <w:abstractNum w15:restartNumberingAfterBreak="0" w:abstractNumId="18">
+  <w:abstractNum w15:restartNumberingAfterBreak="0" w:abstractNumId="20">
     <w:nsid w:val="3B7C562F"/>
     <w:multiLevelType w:val="hybridMultilevel"/>
     <w:tmpl w:val="7FA206F4"/>
@@ -3823,7 +4121,7 @@
       </w:rPr>
     </w:lvl>
   </w:abstractNum>
-  <w:abstractNum w15:restartNumberingAfterBreak="0" w:abstractNumId="19">
+  <w:abstractNum w15:restartNumberingAfterBreak="0" w:abstractNumId="21">
     <w:nsid w:val="49E7569F"/>
     <w:multiLevelType w:val="hybridMultilevel"/>
     <w:tmpl w:val="6D001996"/>
@@ -3915,7 +4213,7 @@
       </w:pPr>
     </w:lvl>
   </w:abstractNum>
-  <w:abstractNum w15:restartNumberingAfterBreak="0" w:abstractNumId="20">
+  <w:abstractNum w15:restartNumberingAfterBreak="0" w:abstractNumId="22">
     <w:nsid w:val="4B3573AD"/>
     <w:multiLevelType w:val="hybridMultilevel"/>
     <w:tmpl w:val="D92E6F12"/>
@@ -4036,7 +4334,7 @@
       </w:rPr>
     </w:lvl>
   </w:abstractNum>
-  <w:abstractNum w15:restartNumberingAfterBreak="0" w:abstractNumId="21">
+  <w:abstractNum w15:restartNumberingAfterBreak="0" w:abstractNumId="23">
     <w:nsid w:val="50D247D0"/>
     <w:multiLevelType w:val="hybridMultilevel"/>
     <w:tmpl w:val="6166FB42"/>
@@ -4153,7 +4451,7 @@
       </w:rPr>
     </w:lvl>
   </w:abstractNum>
-  <w:abstractNum w15:restartNumberingAfterBreak="0" w:abstractNumId="22">
+  <w:abstractNum w15:restartNumberingAfterBreak="0" w:abstractNumId="24">
     <w:nsid w:val="54741CF7"/>
     <w:multiLevelType w:val="hybridMultilevel"/>
     <w:tmpl w:val="F0EAC25E"/>
@@ -4266,7 +4564,7 @@
       </w:rPr>
     </w:lvl>
   </w:abstractNum>
-  <w:abstractNum w15:restartNumberingAfterBreak="0" w:abstractNumId="23">
+  <w:abstractNum w15:restartNumberingAfterBreak="0" w:abstractNumId="25">
     <w:nsid w:val="54796D7F"/>
     <w:multiLevelType w:val="hybridMultilevel"/>
     <w:tmpl w:val="1DB02BD4"/>
@@ -4480,7 +4778,7 @@
       </w:rPr>
     </w:lvl>
   </w:abstractNum>
-  <w:abstractNum w15:restartNumberingAfterBreak="0" w:abstractNumId="24">
+  <w:abstractNum w15:restartNumberingAfterBreak="0" w:abstractNumId="26">
     <w:nsid w:val="550B5D70"/>
     <w:multiLevelType w:val="multilevel"/>
     <w:tmpl w:val="B4E41376"/>
@@ -4578,7 +4876,7 @@
       <w:lvlJc w:val="left"/>
     </w:lvl>
   </w:abstractNum>
-  <w:abstractNum w15:restartNumberingAfterBreak="0" w:abstractNumId="25">
+  <w:abstractNum w15:restartNumberingAfterBreak="0" w:abstractNumId="27">
     <w:nsid w:val="55EE46DA"/>
     <w:multiLevelType w:val="hybridMultilevel"/>
     <w:tmpl w:val="BCB4EAF8"/>
@@ -4693,7 +4991,7 @@
       </w:rPr>
     </w:lvl>
   </w:abstractNum>
-  <w:abstractNum w15:restartNumberingAfterBreak="0" w:abstractNumId="26">
+  <w:abstractNum w15:restartNumberingAfterBreak="0" w:abstractNumId="28">
     <w:nsid w:val="56C21714"/>
     <w:multiLevelType w:val="hybridMultilevel"/>
     <w:tmpl w:val="1C381334"/>
@@ -4813,7 +5111,7 @@
       </w:rPr>
     </w:lvl>
   </w:abstractNum>
-  <w:abstractNum w15:restartNumberingAfterBreak="0" w:abstractNumId="27">
+  <w:abstractNum w15:restartNumberingAfterBreak="0" w:abstractNumId="29">
     <w:nsid w:val="5AC1617B"/>
     <w:multiLevelType w:val="hybridMultilevel"/>
     <w:tmpl w:val="1F9CF6D8"/>
@@ -4939,7 +5237,7 @@
       </w:rPr>
     </w:lvl>
   </w:abstractNum>
-  <w:abstractNum w15:restartNumberingAfterBreak="0" w:abstractNumId="28">
+  <w:abstractNum w15:restartNumberingAfterBreak="0" w:abstractNumId="30">
     <w:nsid w:val="631E3CF8"/>
     <w:multiLevelType w:val="hybridMultilevel"/>
     <w:tmpl w:val="C096EF6A"/>
@@ -5029,7 +5327,7 @@
       </w:pPr>
     </w:lvl>
   </w:abstractNum>
-  <w:abstractNum w15:restartNumberingAfterBreak="0" w:abstractNumId="29">
+  <w:abstractNum w15:restartNumberingAfterBreak="0" w:abstractNumId="31">
     <w:nsid w:val="67C54D4B"/>
     <w:multiLevelType w:val="hybridMultilevel"/>
     <w:tmpl w:val="A7760210"/>
@@ -5149,7 +5447,7 @@
       </w:rPr>
     </w:lvl>
   </w:abstractNum>
-  <w:abstractNum w15:restartNumberingAfterBreak="0" w:abstractNumId="30">
+  <w:abstractNum w15:restartNumberingAfterBreak="0" w:abstractNumId="32">
     <w:nsid w:val="6CF67B3B"/>
     <w:multiLevelType w:val="multilevel"/>
     <w:tmpl w:val="D1B6B0D8"/>
@@ -5247,7 +5545,7 @@
       <w:lvlJc w:val="left"/>
     </w:lvl>
   </w:abstractNum>
-  <w:abstractNum w15:restartNumberingAfterBreak="0" w:abstractNumId="31">
+  <w:abstractNum w15:restartNumberingAfterBreak="0" w:abstractNumId="33">
     <w:nsid w:val="72044117"/>
     <w:multiLevelType w:val="hybridMultilevel"/>
     <w:tmpl w:val="91F03070"/>
@@ -5337,7 +5635,7 @@
       </w:pPr>
     </w:lvl>
   </w:abstractNum>
-  <w:abstractNum w15:restartNumberingAfterBreak="0" w:abstractNumId="32">
+  <w:abstractNum w15:restartNumberingAfterBreak="0" w:abstractNumId="34">
     <w:nsid w:val="759474E8"/>
     <w:multiLevelType w:val="hybridMultilevel"/>
     <w:tmpl w:val="A96E61DC"/>
@@ -5426,7 +5724,7 @@
       </w:pPr>
     </w:lvl>
   </w:abstractNum>
-  <w:abstractNum w15:restartNumberingAfterBreak="0" w:abstractNumId="33">
+  <w:abstractNum w15:restartNumberingAfterBreak="0" w:abstractNumId="35">
     <w:nsid w:val="766F4EB0"/>
     <w:multiLevelType w:val="hybridMultilevel"/>
     <w:tmpl w:val="FA8C71E8"/>
@@ -5547,7 +5845,7 @@
       </w:rPr>
     </w:lvl>
   </w:abstractNum>
-  <w:abstractNum w15:restartNumberingAfterBreak="0" w:abstractNumId="34">
+  <w:abstractNum w15:restartNumberingAfterBreak="0" w:abstractNumId="36">
     <w:nsid w:val="7A2F2215"/>
     <w:multiLevelType w:val="hybridMultilevel"/>
     <w:tmpl w:val="67D26144"/>
@@ -5840,115 +6138,124 @@
     </w:lvl>
   </w:abstractNum>
   <w:num w16cid:durableId="1232809915" w:numId="1">
-    <w:abstractNumId w:val="15"/>
+    <w:abstractNumId w:val="17"/>
   </w:num>
   <w:num w16cid:durableId="632105287" w:numId="2">
-    <w:abstractNumId w:val="9"/>
+    <w:abstractNumId w:val="11"/>
   </w:num>
   <w:num w16cid:durableId="712844753" w:numId="3">
-    <w:abstractNumId w:val="3"/>
+    <w:abstractNumId w:val="5"/>
   </w:num>
   <w:num w16cid:durableId="1656950136" w:numId="4">
     <w:abstractNumId w:val="0"/>
   </w:num>
   <w:num w16cid:durableId="624233240" w:numId="5">
+    <w:abstractNumId w:val="3"/>
+  </w:num>
+  <w:num w16cid:durableId="1656296525" w:numId="6">
+    <w:abstractNumId w:val="9"/>
+  </w:num>
+  <w:num w16cid:durableId="1743137740" w:numId="7">
+    <w:abstractNumId w:val="32"/>
+  </w:num>
+  <w:num w16cid:durableId="1441683422" w:numId="8">
+    <w:abstractNumId w:val="26"/>
+  </w:num>
+  <w:num w16cid:durableId="1346591669" w:numId="9">
+    <w:abstractNumId w:val="27"/>
+  </w:num>
+  <w:num w16cid:durableId="1172141746" w:numId="10">
+    <w:abstractNumId w:val="24"/>
+  </w:num>
+  <w:num w16cid:durableId="1151947565" w:numId="11">
+    <w:abstractNumId w:val="20"/>
+  </w:num>
+  <w:num w16cid:durableId="1539509613" w:numId="12">
+    <w:abstractNumId w:val="23"/>
+  </w:num>
+  <w:num w16cid:durableId="616255005" w:numId="13">
+    <w:abstractNumId w:val="34"/>
+  </w:num>
+  <w:num w16cid:durableId="684941011" w:numId="14">
+    <w:abstractNumId w:val="6"/>
+  </w:num>
+  <w:num w16cid:durableId="1130778624" w:numId="15">
+    <w:abstractNumId w:val="12"/>
+  </w:num>
+  <w:num w16cid:durableId="100995807" w:numId="16">
+    <w:abstractNumId w:val="21"/>
+  </w:num>
+  <w:num w16cid:durableId="120535820" w:numId="17">
+    <w:abstractNumId w:val="14"/>
+  </w:num>
+  <w:num w16cid:durableId="71969155" w:numId="18">
+    <w:abstractNumId w:val="22"/>
+  </w:num>
+  <w:num w16cid:durableId="799301217" w:numId="19">
+    <w:abstractNumId w:val="35"/>
+  </w:num>
+  <w:num w16cid:durableId="1836022915" w:numId="20">
+    <w:abstractNumId w:val="36"/>
+  </w:num>
+  <w:num w16cid:durableId="944456116" w:numId="21">
+    <w:abstractNumId w:val="16"/>
+  </w:num>
+  <w:num w16cid:durableId="513809156" w:numId="22">
+    <w:abstractNumId w:val="28"/>
+  </w:num>
+  <w:num w16cid:durableId="429470865" w:numId="23">
+    <w:abstractNumId w:val="18"/>
+  </w:num>
+  <w:num w16cid:durableId="1551838634" w:numId="24">
+    <w:abstractNumId w:val="10"/>
+  </w:num>
+  <w:num w16cid:durableId="1994024615" w:numId="25">
+    <w:abstractNumId w:val="33"/>
+  </w:num>
+  <w:num w16cid:durableId="97530209" w:numId="26">
+    <w:abstractNumId w:val="7"/>
+  </w:num>
+  <w:num w16cid:durableId="2045516502" w:numId="27">
+    <w:abstractNumId w:val="30"/>
+  </w:num>
+  <w:num w16cid:durableId="645739292" w:numId="28">
+    <w:abstractNumId w:val="4"/>
+  </w:num>
+  <w:num w16cid:durableId="139732602" w:numId="29">
+    <w:abstractNumId w:val="15"/>
+  </w:num>
+  <w:num w16cid:durableId="2000648194" w:numId="30">
+    <w:abstractNumId w:val="31"/>
+  </w:num>
+  <w:num w16cid:durableId="133986227" w:numId="31">
+    <w:abstractNumId w:val="8"/>
+  </w:num>
+  <w:num w16cid:durableId="227233131" w:numId="32">
+    <w:abstractNumId w:val="25"/>
+  </w:num>
+  <w:num w16cid:durableId="1321471397" w:numId="33">
+    <w:abstractNumId w:val="13"/>
+  </w:num>
+  <w:num w16cid:durableId="527912720" w:numId="34">
+    <w:abstractNumId w:val="19"/>
+  </w:num>
+  <w:num w16cid:durableId="998463730" w:numId="35">
+    <w:abstractNumId w:val="29"/>
+  </w:num>
+  <w:num w16cid:durableId="2103529750" w:numId="36">
+    <w:abstractNumId w:val="20"/>
+  </w:num>
+  <w:num w16cid:durableId="824779347" w:numId="37">
+    <w:abstractNumId w:val="20"/>
+  </w:num>
+  <w:num w16cid:durableId="1474637741" w:numId="38">
     <w:abstractNumId w:val="1"/>
   </w:num>
-  <w:num w16cid:durableId="1656296525" w:numId="6">
-    <w:abstractNumId w:val="7"/>
-  </w:num>
-  <w:num w16cid:durableId="1743137740" w:numId="7">
-    <w:abstractNumId w:val="30"/>
-  </w:num>
-  <w:num w16cid:durableId="1441683422" w:numId="8">
-    <w:abstractNumId w:val="24"/>
-  </w:num>
-  <w:num w16cid:durableId="1346591669" w:numId="9">
-    <w:abstractNumId w:val="25"/>
-  </w:num>
-  <w:num w16cid:durableId="1172141746" w:numId="10">
-    <w:abstractNumId w:val="22"/>
-  </w:num>
-  <w:num w16cid:durableId="1151947565" w:numId="11">
-    <w:abstractNumId w:val="18"/>
-  </w:num>
-  <w:num w16cid:durableId="1539509613" w:numId="12">
-    <w:abstractNumId w:val="21"/>
-  </w:num>
-  <w:num w16cid:durableId="616255005" w:numId="13">
-    <w:abstractNumId w:val="32"/>
-  </w:num>
-  <w:num w16cid:durableId="684941011" w:numId="14">
-    <w:abstractNumId w:val="4"/>
-  </w:num>
-  <w:num w16cid:durableId="1130778624" w:numId="15">
-    <w:abstractNumId w:val="10"/>
-  </w:num>
-  <w:num w16cid:durableId="100995807" w:numId="16">
-    <w:abstractNumId w:val="19"/>
-  </w:num>
-  <w:num w16cid:durableId="120535820" w:numId="17">
-    <w:abstractNumId w:val="12"/>
-  </w:num>
-  <w:num w16cid:durableId="71969155" w:numId="18">
-    <w:abstractNumId w:val="20"/>
-  </w:num>
-  <w:num w16cid:durableId="799301217" w:numId="19">
-    <w:abstractNumId w:val="33"/>
-  </w:num>
-  <w:num w16cid:durableId="1836022915" w:numId="20">
-    <w:abstractNumId w:val="34"/>
-  </w:num>
-  <w:num w16cid:durableId="944456116" w:numId="21">
-    <w:abstractNumId w:val="14"/>
-  </w:num>
-  <w:num w16cid:durableId="513809156" w:numId="22">
-    <w:abstractNumId w:val="26"/>
-  </w:num>
-  <w:num w16cid:durableId="429470865" w:numId="23">
-    <w:abstractNumId w:val="16"/>
-  </w:num>
-  <w:num w16cid:durableId="1551838634" w:numId="24">
-    <w:abstractNumId w:val="8"/>
-  </w:num>
-  <w:num w16cid:durableId="1994024615" w:numId="25">
-    <w:abstractNumId w:val="31"/>
-  </w:num>
-  <w:num w16cid:durableId="97530209" w:numId="26">
-    <w:abstractNumId w:val="5"/>
-  </w:num>
-  <w:num w16cid:durableId="2045516502" w:numId="27">
-    <w:abstractNumId w:val="28"/>
-  </w:num>
-  <w:num w16cid:durableId="645739292" w:numId="28">
+  <w:num w16cid:durableId="558828393" w:numId="39">
     <w:abstractNumId w:val="2"/>
   </w:num>
-  <w:num w16cid:durableId="139732602" w:numId="29">
-    <w:abstractNumId w:val="13"/>
-  </w:num>
-  <w:num w16cid:durableId="2000648194" w:numId="30">
-    <w:abstractNumId w:val="29"/>
-  </w:num>
-  <w:num w16cid:durableId="133986227" w:numId="31">
-    <w:abstractNumId w:val="6"/>
-  </w:num>
-  <w:num w16cid:durableId="227233131" w:numId="32">
-    <w:abstractNumId w:val="23"/>
-  </w:num>
-  <w:num w16cid:durableId="1321471397" w:numId="33">
-    <w:abstractNumId w:val="11"/>
-  </w:num>
-  <w:num w16cid:durableId="527912720" w:numId="34">
-    <w:abstractNumId w:val="17"/>
-  </w:num>
-  <w:num w16cid:durableId="998463730" w:numId="35">
-    <w:abstractNumId w:val="27"/>
-  </w:num>
-  <w:num w16cid:durableId="2103529750" w:numId="36">
-    <w:abstractNumId w:val="18"/>
-  </w:num>
-  <w:num w16cid:durableId="824779347" w:numId="37">
-    <w:abstractNumId w:val="18"/>
+  <w:num w16cid:durableId="288821908" w:numId="40">
+    <w:abstractNumId w:val="2"/>
   </w:num>
   <w:num w:numId="1000">
     <w:abstractNumId w:val="990"/>
@@ -5971,9 +6278,6 @@
   <w:num w:numId="1006">
     <w:abstractNumId w:val="991"/>
   </w:num>
-  <w:num w:numId="1007">
-    <w:abstractNumId w:val="991"/>
-  </w:num>
 </w:numbering>
 </file>
 
@@ -5985,7 +6289,7 @@
         <w:rFonts w:asciiTheme="minorHAnsi" w:cstheme="minorBidi" w:eastAsiaTheme="minorHAnsi" w:hAnsiTheme="minorHAnsi"/>
         <w:sz w:val="22"/>
         <w:szCs w:val="22"/>
-        <w:lang w:bidi="ar-SA" w:eastAsia="en-US" w:val="en-GB"/>
+        <w:lang w:bidi="ar-SA" w:eastAsia="en-US" w:val="cs"/>
       </w:rPr>
     </w:rPrDefault>
     <w:pPrDefault>
@@ -6381,7 +6685,6 @@
     </w:pPr>
     <w:rPr>
       <w:rFonts w:ascii="Georgia" w:hAnsi="Georgia"/>
-      <w:lang w:val="cs-CZ"/>
     </w:rPr>
   </w:style>
   <w:style w:styleId="Heading1" w:type="paragraph">
@@ -6401,7 +6704,6 @@
     <w:rPr>
       <w:b/>
       <w:sz w:val="28"/>
-      <w:lang w:val="cs-CZ"/>
     </w:rPr>
   </w:style>
   <w:style w:styleId="Heading2" w:type="paragraph">
@@ -6451,7 +6753,6 @@
       <w:bCs/>
       <w:color w:val="2526A9"/>
       <w:szCs w:val="28"/>
-      <w:lang w:val="en-US"/>
     </w:rPr>
   </w:style>
   <w:style w:styleId="Heading4" w:type="paragraph">
@@ -6474,7 +6775,6 @@
       <w:bCs/>
       <w:color w:themeColor="accent1" w:val="4472C4"/>
       <w:szCs w:val="24"/>
-      <w:lang w:val="en-US"/>
     </w:rPr>
   </w:style>
   <w:style w:default="1" w:styleId="DefaultParagraphFont" w:type="character">
@@ -6609,7 +6909,6 @@
     <w:rPr>
       <w:rFonts w:ascii="Times New Roman" w:cs="Times New Roman" w:eastAsia="Times New Roman" w:hAnsi="Times New Roman"/>
       <w:szCs w:val="24"/>
-      <w:lang w:val="en-US"/>
     </w:rPr>
   </w:style>
   <w:style w:styleId="CommentReference" w:type="character">
@@ -6757,27 +7056,15 @@
     <w:name w:val="Body Text"/>
     <w:basedOn w:val="Normal"/>
     <w:link w:val="BodyTextChar"/>
-    <w:rsid w:val="00A56A7D"/>
-    <w:pPr>
-      <w:spacing w:after="120"/>
-      <w:jc w:val="both"/>
-    </w:pPr>
-    <w:rPr>
-      <w:rFonts w:cs="Times New Roman" w:eastAsia="SimSun"/>
-      <w:szCs w:val="24"/>
-      <w:lang w:bidi="ar-AE" w:eastAsia="en-GB"/>
-    </w:rPr>
+    <w:rsid w:val="008B491F"/>
   </w:style>
   <w:style w:customStyle="1" w:styleId="BodyTextChar" w:type="character">
     <w:name w:val="Body Text Char"/>
     <w:basedOn w:val="DefaultParagraphFont"/>
     <w:link w:val="BodyText"/>
-    <w:rsid w:val="00A56A7D"/>
+    <w:rsid w:val="008B491F"/>
     <w:rPr>
-      <w:rFonts w:ascii="Georgia" w:cs="Times New Roman" w:eastAsia="SimSun" w:hAnsi="Georgia"/>
-      <w:sz w:val="24"/>
-      <w:szCs w:val="24"/>
-      <w:lang w:bidi="ar-AE" w:eastAsia="en-GB"/>
+      <w:rFonts w:ascii="Georgia" w:hAnsi="Georgia"/>
     </w:rPr>
   </w:style>
   <w:style w:customStyle="1" w:styleId="Nevyeenzmnka1" w:type="character">
@@ -6805,7 +7092,7 @@
       <w:color w:val="2526A9"/>
       <w:sz w:val="24"/>
       <w:szCs w:val="28"/>
-      <w:lang w:val="en-US"/>
+      <w:lang w:val="cs"/>
     </w:rPr>
   </w:style>
   <w:style w:customStyle="1" w:styleId="Heading4Char" w:type="character">
@@ -6821,35 +7108,25 @@
       <w:color w:themeColor="accent1" w:val="4472C4"/>
       <w:sz w:val="24"/>
       <w:szCs w:val="24"/>
-      <w:lang w:val="en-US"/>
+      <w:lang w:val="cs"/>
     </w:rPr>
   </w:style>
   <w:style w:customStyle="1" w:styleId="FirstParagraph" w:type="paragraph">
     <w:name w:val="First Paragraph"/>
-    <w:basedOn w:val="BodyText"/>
+    <w:basedOn w:val="Normal"/>
     <w:next w:val="BodyText"/>
-    <w:rsid w:val="00D47753"/>
-    <w:pPr>
-      <w:spacing w:after="180" w:before="180" w:line="240" w:lineRule="auto"/>
-      <w:jc w:val="left"/>
-    </w:pPr>
-    <w:rPr>
-      <w:rFonts w:asciiTheme="minorHAnsi" w:cstheme="minorBidi" w:eastAsiaTheme="minorHAnsi" w:hAnsiTheme="minorHAnsi"/>
-      <w:lang w:bidi="ar-SA" w:eastAsia="en-US" w:val="en-US"/>
-    </w:rPr>
+    <w:rsid w:val="008B491F"/>
   </w:style>
   <w:style w:customStyle="1" w:styleId="Compact" w:type="paragraph">
     <w:name w:val="Compact"/>
     <w:basedOn w:val="BodyText"/>
-    <w:rsid w:val="00D47753"/>
+    <w:rsid w:val="008B491F"/>
     <w:pPr>
+      <w:numPr>
+        <w:numId w:val="40"/>
+      </w:numPr>
       <w:spacing w:after="36" w:before="36" w:line="240" w:lineRule="auto"/>
-      <w:jc w:val="left"/>
     </w:pPr>
-    <w:rPr>
-      <w:rFonts w:asciiTheme="minorHAnsi" w:cstheme="minorBidi" w:eastAsiaTheme="minorHAnsi" w:hAnsiTheme="minorHAnsi"/>
-      <w:lang w:bidi="ar-SA" w:eastAsia="en-US" w:val="en-US"/>
-    </w:rPr>
   </w:style>
   <w:style w:styleId="Caption" w:type="paragraph">
     <w:name w:val="caption"/>
@@ -6891,7 +7168,7 @@
       <w:color w:val="2526A9"/>
       <w:sz w:val="28"/>
       <w:szCs w:val="28"/>
-      <w:lang w:val="cs-CZ"/>
+      <w:lang w:val="cs"/>
     </w:rPr>
   </w:style>
   <w:style w:customStyle="1" w:styleId="Heading2Char" w:type="character">
@@ -6908,7 +7185,7 @@
       <w:color w:val="2526A9"/>
       <w:sz w:val="24"/>
       <w:szCs w:val="24"/>
-      <w:lang w:val="cs-CZ"/>
+      <w:lang w:val="cs"/>
     </w:rPr>
   </w:style>
   <w:style w:customStyle="1" w:styleId="IDEAseznam" w:type="paragraph">
@@ -6950,7 +7227,7 @@
       <w:rFonts w:ascii="Georgia" w:cs="Times New Roman" w:eastAsia="Calibri" w:hAnsi="Georgia"/>
       <w:sz w:val="20"/>
       <w:szCs w:val="20"/>
-      <w:lang w:val="cs-CZ"/>
+      <w:lang w:val="cs"/>
     </w:rPr>
   </w:style>
   <w:style w:customStyle="1" w:styleId="Pa35" w:type="paragraph">
@@ -7016,7 +7293,6 @@
     <w:rPr>
       <w:rFonts w:ascii="Georgia" w:hAnsi="Georgia"/>
       <w:sz w:val="24"/>
-      <w:lang w:val="cs-CZ"/>
     </w:rPr>
   </w:style>
   <w:style w:styleId="NormalWeb" w:type="paragraph">
@@ -7032,7 +7308,6 @@
     <w:rPr>
       <w:rFonts w:ascii="Times New Roman" w:cs="Times New Roman" w:eastAsia="Times New Roman" w:hAnsi="Times New Roman"/>
       <w:szCs w:val="24"/>
-      <w:lang w:val="en-US"/>
     </w:rPr>
   </w:style>
   <w:style w:styleId="TableGrid" w:type="table">
@@ -7081,7 +7356,7 @@
       <w:rFonts w:ascii="Georgia" w:hAnsi="Georgia"/>
       <w:sz w:val="20"/>
       <w:szCs w:val="20"/>
-      <w:lang w:val="cs-CZ"/>
+      <w:lang w:val="cs"/>
     </w:rPr>
   </w:style>
   <w:style w:styleId="EndnoteReference" w:type="character">
@@ -7121,7 +7396,6 @@
       <w:rFonts w:ascii="Georgia" w:hAnsi="Georgia"/>
       <w:sz w:val="48"/>
       <w:szCs w:val="48"/>
-      <w:lang w:val="cs-CZ"/>
     </w:rPr>
   </w:style>
   <w:style w:customStyle="1" w:styleId="Nadpis2" w:type="paragraph">
@@ -7142,13 +7416,13 @@
     <w:name w:val="IDEA Title"/>
     <w:basedOn w:val="Normal"/>
     <w:qFormat/>
-    <w:rsid w:val="00C91A8F"/>
+    <w:rsid w:val="008E2FC8"/>
     <w:pPr>
       <w:spacing w:after="240" w:before="240" w:line="240" w:lineRule="auto"/>
       <w:jc w:val="center"/>
     </w:pPr>
     <w:rPr>
-      <w:sz w:val="48"/>
+      <w:sz w:val="46"/>
       <w:szCs w:val="48"/>
     </w:rPr>
   </w:style>
@@ -7167,14 +7441,13 @@
   <w:style w:customStyle="1" w:styleId="IDEAtitle0" w:type="paragraph">
     <w:name w:val="IDEA title"/>
     <w:basedOn w:val="Normal"/>
-    <w:qFormat/>
-    <w:rsid w:val="00A343FC"/>
+    <w:rsid w:val="00130856"/>
     <w:pPr>
       <w:spacing w:after="240" w:before="240" w:line="240" w:lineRule="auto"/>
       <w:jc w:val="center"/>
     </w:pPr>
     <w:rPr>
-      <w:sz w:val="48"/>
+      <w:sz w:val="46"/>
       <w:szCs w:val="48"/>
     </w:rPr>
   </w:style>
@@ -7209,266 +7482,254 @@
       <w:szCs w:val="32"/>
     </w:rPr>
   </w:style>
-  <w:style w:type="paragraph" w:customStyle="1" w:styleId="SourceCode">
+  <w:style w:customStyle="1" w:styleId="SourceCode" w:type="paragraph">
     <w:name w:val="Source Code"/>
     <w:basedOn w:val="Normal"/>
-    <w:link w:val="VerbatimChar"/>
     <w:pPr>
-      <w:wordWrap w:val="off"/>
-      <w:shd w:val="clear" w:fill="f1f3f5"/>
+      <w:shd w:color="auto" w:fill="F1F3F5" w:val="clear"/>
+      <w:wordWrap w:val="0"/>
     </w:pPr>
   </w:style>
-  <w:style w:type="character" w:customStyle="1" w:styleId="KeywordTok">
+  <w:style w:customStyle="1" w:styleId="KeywordTok" w:type="character">
     <w:name w:val="KeywordTok"/>
-    <w:basedOn w:val="VerbatimChar"/>
     <w:rPr>
       <w:b/>
-      <w:color w:val="003b4f"/>
-      <w:shd w:val="clear" w:fill="f1f3f5"/>
+      <w:color w:val="003B4F"/>
+      <w:shd w:color="auto" w:fill="F1F3F5" w:val="clear"/>
     </w:rPr>
   </w:style>
-  <w:style w:type="character" w:customStyle="1" w:styleId="DataTypeTok">
+  <w:style w:customStyle="1" w:styleId="DataTypeTok" w:type="character">
     <w:name w:val="DataTypeTok"/>
-    <w:basedOn w:val="VerbatimChar"/>
     <w:rPr>
-      <w:color w:val="ad0000"/>
-      <w:shd w:val="clear" w:fill="f1f3f5"/>
+      <w:color w:val="AD0000"/>
+      <w:shd w:color="auto" w:fill="F1F3F5" w:val="clear"/>
     </w:rPr>
   </w:style>
-  <w:style w:type="character" w:customStyle="1" w:styleId="DecValTok">
+  <w:style w:customStyle="1" w:styleId="DecValTok" w:type="character">
     <w:name w:val="DecValTok"/>
-    <w:basedOn w:val="VerbatimChar"/>
     <w:rPr>
-      <w:color w:val="ad0000"/>
-      <w:shd w:val="clear" w:fill="f1f3f5"/>
+      <w:color w:val="AD0000"/>
+      <w:shd w:color="auto" w:fill="F1F3F5" w:val="clear"/>
     </w:rPr>
   </w:style>
-  <w:style w:type="character" w:customStyle="1" w:styleId="BaseNTok">
+  <w:style w:customStyle="1" w:styleId="BaseNTok" w:type="character">
     <w:name w:val="BaseNTok"/>
-    <w:basedOn w:val="VerbatimChar"/>
     <w:rPr>
-      <w:color w:val="ad0000"/>
-      <w:shd w:val="clear" w:fill="f1f3f5"/>
+      <w:color w:val="AD0000"/>
+      <w:shd w:color="auto" w:fill="F1F3F5" w:val="clear"/>
     </w:rPr>
   </w:style>
-  <w:style w:type="character" w:customStyle="1" w:styleId="FloatTok">
+  <w:style w:customStyle="1" w:styleId="FloatTok" w:type="character">
     <w:name w:val="FloatTok"/>
-    <w:basedOn w:val="VerbatimChar"/>
     <w:rPr>
-      <w:color w:val="ad0000"/>
-      <w:shd w:val="clear" w:fill="f1f3f5"/>
+      <w:color w:val="AD0000"/>
+      <w:shd w:color="auto" w:fill="F1F3F5" w:val="clear"/>
     </w:rPr>
   </w:style>
-  <w:style w:type="character" w:customStyle="1" w:styleId="ConstantTok">
+  <w:style w:customStyle="1" w:styleId="ConstantTok" w:type="character">
     <w:name w:val="ConstantTok"/>
-    <w:basedOn w:val="VerbatimChar"/>
     <w:rPr>
-      <w:color w:val="8f5902"/>
-      <w:shd w:val="clear" w:fill="f1f3f5"/>
+      <w:color w:val="8F5902"/>
+      <w:shd w:color="auto" w:fill="F1F3F5" w:val="clear"/>
     </w:rPr>
   </w:style>
-  <w:style w:type="character" w:customStyle="1" w:styleId="CharTok">
+  <w:style w:customStyle="1" w:styleId="CharTok" w:type="character">
     <w:name w:val="CharTok"/>
-    <w:basedOn w:val="VerbatimChar"/>
     <w:rPr>
-      <w:color w:val="20794d"/>
-      <w:shd w:val="clear" w:fill="f1f3f5"/>
+      <w:color w:val="20794D"/>
+      <w:shd w:color="auto" w:fill="F1F3F5" w:val="clear"/>
     </w:rPr>
   </w:style>
-  <w:style w:type="character" w:customStyle="1" w:styleId="SpecialCharTok">
+  <w:style w:customStyle="1" w:styleId="SpecialCharTok" w:type="character">
     <w:name w:val="SpecialCharTok"/>
-    <w:basedOn w:val="VerbatimChar"/>
     <w:rPr>
-      <w:color w:val="5e5e5e"/>
-      <w:shd w:val="clear" w:fill="f1f3f5"/>
+      <w:color w:val="5E5E5E"/>
+      <w:shd w:color="auto" w:fill="F1F3F5" w:val="clear"/>
     </w:rPr>
   </w:style>
-  <w:style w:type="character" w:customStyle="1" w:styleId="StringTok">
+  <w:style w:customStyle="1" w:styleId="StringTok" w:type="character">
     <w:name w:val="StringTok"/>
-    <w:basedOn w:val="VerbatimChar"/>
     <w:rPr>
-      <w:color w:val="20794d"/>
-      <w:shd w:val="clear" w:fill="f1f3f5"/>
+      <w:color w:val="20794D"/>
+      <w:shd w:color="auto" w:fill="F1F3F5" w:val="clear"/>
     </w:rPr>
   </w:style>
-  <w:style w:type="character" w:customStyle="1" w:styleId="VerbatimStringTok">
+  <w:style w:customStyle="1" w:styleId="VerbatimStringTok" w:type="character">
     <w:name w:val="VerbatimStringTok"/>
-    <w:basedOn w:val="VerbatimChar"/>
     <w:rPr>
-      <w:color w:val="20794d"/>
-      <w:shd w:val="clear" w:fill="f1f3f5"/>
+      <w:color w:val="20794D"/>
+      <w:shd w:color="auto" w:fill="F1F3F5" w:val="clear"/>
     </w:rPr>
   </w:style>
-  <w:style w:type="character" w:customStyle="1" w:styleId="SpecialStringTok">
+  <w:style w:customStyle="1" w:styleId="SpecialStringTok" w:type="character">
     <w:name w:val="SpecialStringTok"/>
-    <w:basedOn w:val="VerbatimChar"/>
     <w:rPr>
-      <w:color w:val="20794d"/>
-      <w:shd w:val="clear" w:fill="f1f3f5"/>
+      <w:color w:val="20794D"/>
+      <w:shd w:color="auto" w:fill="F1F3F5" w:val="clear"/>
     </w:rPr>
   </w:style>
-  <w:style w:type="character" w:customStyle="1" w:styleId="ImportTok">
+  <w:style w:customStyle="1" w:styleId="ImportTok" w:type="character">
     <w:name w:val="ImportTok"/>
-    <w:basedOn w:val="VerbatimChar"/>
     <w:rPr>
-      <w:color w:val="00769e"/>
-      <w:shd w:val="clear" w:fill="f1f3f5"/>
+      <w:color w:val="00769E"/>
+      <w:shd w:color="auto" w:fill="F1F3F5" w:val="clear"/>
     </w:rPr>
   </w:style>
-  <w:style w:type="character" w:customStyle="1" w:styleId="CommentTok">
+  <w:style w:customStyle="1" w:styleId="CommentTok" w:type="character">
     <w:name w:val="CommentTok"/>
-    <w:basedOn w:val="VerbatimChar"/>
     <w:rPr>
-      <w:color w:val="5e5e5e"/>
-      <w:shd w:val="clear" w:fill="f1f3f5"/>
+      <w:color w:val="5E5E5E"/>
+      <w:shd w:color="auto" w:fill="F1F3F5" w:val="clear"/>
     </w:rPr>
   </w:style>
-  <w:style w:type="character" w:customStyle="1" w:styleId="DocumentationTok">
+  <w:style w:customStyle="1" w:styleId="DocumentationTok" w:type="character">
     <w:name w:val="DocumentationTok"/>
-    <w:basedOn w:val="VerbatimChar"/>
     <w:rPr>
       <w:i/>
-      <w:color w:val="5e5e5e"/>
-      <w:shd w:val="clear" w:fill="f1f3f5"/>
+      <w:color w:val="5E5E5E"/>
+      <w:shd w:color="auto" w:fill="F1F3F5" w:val="clear"/>
     </w:rPr>
   </w:style>
-  <w:style w:type="character" w:customStyle="1" w:styleId="AnnotationTok">
+  <w:style w:customStyle="1" w:styleId="AnnotationTok" w:type="character">
     <w:name w:val="AnnotationTok"/>
-    <w:basedOn w:val="VerbatimChar"/>
     <w:rPr>
-      <w:color w:val="5e5e5e"/>
-      <w:shd w:val="clear" w:fill="f1f3f5"/>
+      <w:color w:val="5E5E5E"/>
+      <w:shd w:color="auto" w:fill="F1F3F5" w:val="clear"/>
     </w:rPr>
   </w:style>
-  <w:style w:type="character" w:customStyle="1" w:styleId="CommentVarTok">
+  <w:style w:customStyle="1" w:styleId="CommentVarTok" w:type="character">
     <w:name w:val="CommentVarTok"/>
-    <w:basedOn w:val="VerbatimChar"/>
     <w:rPr>
       <w:i/>
-      <w:color w:val="5e5e5e"/>
-      <w:shd w:val="clear" w:fill="f1f3f5"/>
+      <w:color w:val="5E5E5E"/>
+      <w:shd w:color="auto" w:fill="F1F3F5" w:val="clear"/>
     </w:rPr>
   </w:style>
-  <w:style w:type="character" w:customStyle="1" w:styleId="OtherTok">
+  <w:style w:customStyle="1" w:styleId="OtherTok" w:type="character">
     <w:name w:val="OtherTok"/>
-    <w:basedOn w:val="VerbatimChar"/>
     <w:rPr>
-      <w:color w:val="003b4f"/>
-      <w:shd w:val="clear" w:fill="f1f3f5"/>
+      <w:color w:val="003B4F"/>
+      <w:shd w:color="auto" w:fill="F1F3F5" w:val="clear"/>
     </w:rPr>
   </w:style>
-  <w:style w:type="character" w:customStyle="1" w:styleId="FunctionTok">
+  <w:style w:customStyle="1" w:styleId="FunctionTok" w:type="character">
     <w:name w:val="FunctionTok"/>
-    <w:basedOn w:val="VerbatimChar"/>
     <w:rPr>
-      <w:color w:val="4758ab"/>
-      <w:shd w:val="clear" w:fill="f1f3f5"/>
+      <w:color w:val="4758AB"/>
+      <w:shd w:color="auto" w:fill="F1F3F5" w:val="clear"/>
     </w:rPr>
   </w:style>
-  <w:style w:type="character" w:customStyle="1" w:styleId="VariableTok">
+  <w:style w:customStyle="1" w:styleId="VariableTok" w:type="character">
     <w:name w:val="VariableTok"/>
-    <w:basedOn w:val="VerbatimChar"/>
     <w:rPr>
       <w:color w:val="111111"/>
-      <w:shd w:val="clear" w:fill="f1f3f5"/>
+      <w:shd w:color="auto" w:fill="F1F3F5" w:val="clear"/>
     </w:rPr>
   </w:style>
-  <w:style w:type="character" w:customStyle="1" w:styleId="ControlFlowTok">
+  <w:style w:customStyle="1" w:styleId="ControlFlowTok" w:type="character">
     <w:name w:val="ControlFlowTok"/>
-    <w:basedOn w:val="VerbatimChar"/>
     <w:rPr>
       <w:b/>
-      <w:color w:val="003b4f"/>
-      <w:shd w:val="clear" w:fill="f1f3f5"/>
+      <w:color w:val="003B4F"/>
+      <w:shd w:color="auto" w:fill="F1F3F5" w:val="clear"/>
     </w:rPr>
   </w:style>
-  <w:style w:type="character" w:customStyle="1" w:styleId="OperatorTok">
+  <w:style w:customStyle="1" w:styleId="OperatorTok" w:type="character">
     <w:name w:val="OperatorTok"/>
-    <w:basedOn w:val="VerbatimChar"/>
     <w:rPr>
-      <w:color w:val="5e5e5e"/>
-      <w:shd w:val="clear" w:fill="f1f3f5"/>
+      <w:color w:val="5E5E5E"/>
+      <w:shd w:color="auto" w:fill="F1F3F5" w:val="clear"/>
     </w:rPr>
   </w:style>
-  <w:style w:type="character" w:customStyle="1" w:styleId="BuiltInTok">
+  <w:style w:customStyle="1" w:styleId="BuiltInTok" w:type="character">
     <w:name w:val="BuiltInTok"/>
-    <w:basedOn w:val="VerbatimChar"/>
     <w:rPr>
-      <w:color w:val="003b4f"/>
-      <w:shd w:val="clear" w:fill="f1f3f5"/>
+      <w:color w:val="003B4F"/>
+      <w:shd w:color="auto" w:fill="F1F3F5" w:val="clear"/>
     </w:rPr>
   </w:style>
-  <w:style w:type="character" w:customStyle="1" w:styleId="ExtensionTok">
+  <w:style w:customStyle="1" w:styleId="ExtensionTok" w:type="character">
     <w:name w:val="ExtensionTok"/>
-    <w:basedOn w:val="VerbatimChar"/>
     <w:rPr>
-      <w:color w:val="003b4f"/>
-      <w:shd w:val="clear" w:fill="f1f3f5"/>
+      <w:color w:val="003B4F"/>
+      <w:shd w:color="auto" w:fill="F1F3F5" w:val="clear"/>
     </w:rPr>
   </w:style>
-  <w:style w:type="character" w:customStyle="1" w:styleId="PreprocessorTok">
+  <w:style w:customStyle="1" w:styleId="PreprocessorTok" w:type="character">
     <w:name w:val="PreprocessorTok"/>
-    <w:basedOn w:val="VerbatimChar"/>
     <w:rPr>
-      <w:color w:val="ad0000"/>
-      <w:shd w:val="clear" w:fill="f1f3f5"/>
+      <w:color w:val="AD0000"/>
+      <w:shd w:color="auto" w:fill="F1F3F5" w:val="clear"/>
     </w:rPr>
   </w:style>
-  <w:style w:type="character" w:customStyle="1" w:styleId="AttributeTok">
+  <w:style w:customStyle="1" w:styleId="AttributeTok" w:type="character">
     <w:name w:val="AttributeTok"/>
-    <w:basedOn w:val="VerbatimChar"/>
     <w:rPr>
       <w:color w:val="657422"/>
-      <w:shd w:val="clear" w:fill="f1f3f5"/>
+      <w:shd w:color="auto" w:fill="F1F3F5" w:val="clear"/>
     </w:rPr>
   </w:style>
-  <w:style w:type="character" w:customStyle="1" w:styleId="RegionMarkerTok">
+  <w:style w:customStyle="1" w:styleId="RegionMarkerTok" w:type="character">
     <w:name w:val="RegionMarkerTok"/>
-    <w:basedOn w:val="VerbatimChar"/>
     <w:rPr>
-      <w:color w:val="003b4f"/>
-      <w:shd w:val="clear" w:fill="f1f3f5"/>
+      <w:color w:val="003B4F"/>
+      <w:shd w:color="auto" w:fill="F1F3F5" w:val="clear"/>
     </w:rPr>
   </w:style>
-  <w:style w:type="character" w:customStyle="1" w:styleId="InformationTok">
+  <w:style w:customStyle="1" w:styleId="InformationTok" w:type="character">
     <w:name w:val="InformationTok"/>
-    <w:basedOn w:val="VerbatimChar"/>
     <w:rPr>
-      <w:color w:val="5e5e5e"/>
-      <w:shd w:val="clear" w:fill="f1f3f5"/>
+      <w:color w:val="5E5E5E"/>
+      <w:shd w:color="auto" w:fill="F1F3F5" w:val="clear"/>
     </w:rPr>
   </w:style>
-  <w:style w:type="character" w:customStyle="1" w:styleId="WarningTok">
+  <w:style w:customStyle="1" w:styleId="WarningTok" w:type="character">
     <w:name w:val="WarningTok"/>
-    <w:basedOn w:val="VerbatimChar"/>
     <w:rPr>
       <w:i/>
-      <w:color w:val="5e5e5e"/>
-      <w:shd w:val="clear" w:fill="f1f3f5"/>
+      <w:color w:val="5E5E5E"/>
+      <w:shd w:color="auto" w:fill="F1F3F5" w:val="clear"/>
     </w:rPr>
   </w:style>
-  <w:style w:type="character" w:customStyle="1" w:styleId="AlertTok">
+  <w:style w:customStyle="1" w:styleId="AlertTok" w:type="character">
     <w:name w:val="AlertTok"/>
-    <w:basedOn w:val="VerbatimChar"/>
     <w:rPr>
-      <w:color w:val="ad0000"/>
-      <w:shd w:val="clear" w:fill="f1f3f5"/>
+      <w:color w:val="AD0000"/>
+      <w:shd w:color="auto" w:fill="F1F3F5" w:val="clear"/>
     </w:rPr>
   </w:style>
-  <w:style w:type="character" w:customStyle="1" w:styleId="ErrorTok">
+  <w:style w:customStyle="1" w:styleId="ErrorTok" w:type="character">
     <w:name w:val="ErrorTok"/>
-    <w:basedOn w:val="VerbatimChar"/>
     <w:rPr>
-      <w:color w:val="ad0000"/>
-      <w:shd w:val="clear" w:fill="f1f3f5"/>
+      <w:color w:val="AD0000"/>
+      <w:shd w:color="auto" w:fill="F1F3F5" w:val="clear"/>
     </w:rPr>
   </w:style>
-  <w:style w:type="character" w:customStyle="1" w:styleId="NormalTok">
+  <w:style w:customStyle="1" w:styleId="NormalTok" w:type="character">
     <w:name w:val="NormalTok"/>
-    <w:basedOn w:val="VerbatimChar"/>
     <w:rPr>
-      <w:color w:val="003b4f"/>
-      <w:shd w:val="clear" w:fill="f1f3f5"/>
+      <w:color w:val="003B4F"/>
+      <w:shd w:color="auto" w:fill="F1F3F5" w:val="clear"/>
+    </w:rPr>
+  </w:style>
+  <w:style w:styleId="Title" w:type="paragraph">
+    <w:name w:val="Title"/>
+    <w:basedOn w:val="IDEATitle"/>
+    <w:next w:val="Normal"/>
+    <w:link w:val="TitleChar"/>
+    <w:uiPriority w:val="10"/>
+    <w:rsid w:val="008B491F"/>
+  </w:style>
+  <w:style w:customStyle="1" w:styleId="TitleChar" w:type="character">
+    <w:name w:val="Title Char"/>
+    <w:basedOn w:val="DefaultParagraphFont"/>
+    <w:link w:val="Title"/>
+    <w:uiPriority w:val="10"/>
+    <w:rsid w:val="008B491F"/>
+    <w:rPr>
+      <w:rFonts w:ascii="Georgia" w:hAnsi="Georgia"/>
+      <w:sz w:val="48"/>
+      <w:szCs w:val="48"/>
     </w:rPr>
   </w:style>
 </w:styles>

</xml_diff>

<commit_message>
shrnuti fixes: typos, graf links
</commit_message>
<xml_diff>
--- a/word-docs/urednici-shrnuti_2026.docx
+++ b/word-docs/urednici-shrnuti_2026.docx
@@ -145,7 +145,7 @@
         <w:t xml:space="preserve"> </w:t>
       </w:r>
     </w:p>
-    <w:bookmarkStart w:id="82" w:name="shrnutí-klíčových-poznatků"/>
+    <w:bookmarkStart w:id="137" w:name="shrnutí-klíčových-poznatků"/>
     <w:p>
       <w:pPr>
         <w:pStyle w:val="Heading1"/>
@@ -195,7 +195,7 @@
         </w:numPr>
       </w:pPr>
       <w:r>
-        <w:t xml:space="preserve">Počet zaměstnanců státu vzrostl o zhruba 4 000 (+0,8 %), přibylo především zaměstnanců ve školství a v armádě. Státních úředníků naopak o zhruba 300 ubylo (-0,4 %).</w:t>
+        <w:t xml:space="preserve">Počet zaměstnanců státu vzrostl o zhruba 4 000 (+0,8 %), přibylo především zaměstnanců ve školství a v armádě. Státních úředníků naopak zhruba o 300 ubylo (-0,4 %).</w:t>
       </w:r>
     </w:p>
     <w:p>
@@ -235,7 +235,7 @@
         </w:numPr>
       </w:pPr>
       <w:r>
-        <w:t xml:space="preserve">V širším sektoru zaměstnanců státu pak vzrostla platová konkurenceschopnost v oblasti armády a příslušníků bezpečnostních sborů. Mírně naopak opět poklesla u zaměstnanců v regionálním školství</w:t>
+        <w:t xml:space="preserve">V širším sektoru zaměstnanců státu pak vzrostla platová konkurenceschopnost v oblasti armády a příslušníků bezpečnostních sborů. Mírně naopak opět poklesla u zaměstnanců v regionálním školství.</w:t>
       </w:r>
     </w:p>
     <w:p>
@@ -266,7 +266,7 @@
         <w:t xml:space="preserve">. Ta letos uživatelům nově nabízí interaktivní nástroj analýzy dlouhodobých trendů.</w:t>
       </w:r>
     </w:p>
-    <w:bookmarkStart w:id="68" w:name="kdo-jsou-zaměstnanci-státu"/>
+    <w:bookmarkStart w:id="75" w:name="kdo-jsou-zaměstnanci-státu"/>
     <w:p>
       <w:pPr>
         <w:pStyle w:val="Heading2"/>
@@ -316,20 +316,68 @@
           <w:numId w:val="1000"/>
         </w:numPr>
       </w:pPr>
-      <w:r>
-        <w:t xml:space="preserve">→</w:t>
-      </w:r>
-      <w:r>
-        <w:t xml:space="preserve"> </w:t>
-      </w:r>
       <w:hyperlink r:id="rId66">
         <w:r>
           <w:rPr>
             <w:rStyle w:val="Hyperlink"/>
           </w:rPr>
-          <w:t xml:space="preserve">Graf 1a. Počet zaměstnanců státu dle regulace zaměstnanosti</w:t>
+          <w:t xml:space="preserve">Graf 1a</w:t>
         </w:r>
       </w:hyperlink>
+      <w:r>
+        <w:t xml:space="preserve"> </w:t>
+      </w:r>
+      <w:r>
+        <w:drawing>
+          <wp:inline>
+            <wp:extent cx="114300" cy="114300"/>
+            <wp:effectExtent b="0" l="0" r="0" t="0"/>
+            <wp:docPr descr="" title="" id="68" name="Picture"/>
+            <a:graphic>
+              <a:graphicData uri="http://schemas.openxmlformats.org/drawingml/2006/picture">
+                <pic:pic>
+                  <pic:nvPicPr>
+                    <pic:cNvPr descr="report-files/sipka.svg" id="69" name="Picture"/>
+                    <pic:cNvPicPr>
+                      <a:picLocks noChangeArrowheads="1" noChangeAspect="1"/>
+                    </pic:cNvPicPr>
+                  </pic:nvPicPr>
+                  <pic:blipFill>
+                    <a:blip r:embed="rId70">
+                      <a:extLst>
+                        <a:ext uri="{28A0092B-C50C-407E-A947-70E740481C1C}">
+                          <a14:useLocalDpi xmlns:a14="http://schemas.microsoft.com/office/drawing/2010/main" val="0"/>
+                        </a:ext>
+                        <a:ext uri="{96DAC541-7B7A-43D3-8B79-37D633B846F1}">
+                          <asvg:svgBlip xmlns:asvg="http://schemas.microsoft.com/office/drawing/2016/SVG/main" r:embed="rId67"/>
+                        </a:ext>
+                      </a:extLst>
+                    </a:blip>
+                    <a:stretch>
+                      <a:fillRect/>
+                    </a:stretch>
+                  </pic:blipFill>
+                  <pic:spPr bwMode="auto">
+                    <a:xfrm>
+                      <a:off x="0" y="0"/>
+                      <a:ext cx="114300" cy="114300"/>
+                    </a:xfrm>
+                    <a:prstGeom prst="rect">
+                      <a:avLst/>
+                    </a:prstGeom>
+                    <a:noFill/>
+                    <a:ln w="9525">
+                      <a:noFill/>
+                      <a:headEnd/>
+                      <a:tailEnd/>
+                    </a:ln>
+                  </pic:spPr>
+                </pic:pic>
+              </a:graphicData>
+            </a:graphic>
+          </wp:inline>
+        </w:drawing>
+      </w:r>
     </w:p>
     <w:p>
       <w:pPr>
@@ -339,23 +387,71 @@
           <w:numId w:val="1000"/>
         </w:numPr>
       </w:pPr>
-      <w:r>
-        <w:t xml:space="preserve">→</w:t>
-      </w:r>
-      <w:r>
-        <w:t xml:space="preserve"> </w:t>
-      </w:r>
-      <w:hyperlink r:id="rId67">
+      <w:hyperlink r:id="rId71">
         <w:r>
           <w:rPr>
             <w:rStyle w:val="Hyperlink"/>
           </w:rPr>
-          <w:t xml:space="preserve">Graf 2a. Počet zaměstnanců státu dle rozpočtových kapitol</w:t>
+          <w:t xml:space="preserve">Graf 2a</w:t>
         </w:r>
       </w:hyperlink>
+      <w:r>
+        <w:t xml:space="preserve"> </w:t>
+      </w:r>
+      <w:r>
+        <w:drawing>
+          <wp:inline>
+            <wp:extent cx="114300" cy="114300"/>
+            <wp:effectExtent b="0" l="0" r="0" t="0"/>
+            <wp:docPr descr="" title="" id="72" name="Picture"/>
+            <a:graphic>
+              <a:graphicData uri="http://schemas.openxmlformats.org/drawingml/2006/picture">
+                <pic:pic>
+                  <pic:nvPicPr>
+                    <pic:cNvPr descr="report-files/sipka.svg" id="73" name="Picture"/>
+                    <pic:cNvPicPr>
+                      <a:picLocks noChangeArrowheads="1" noChangeAspect="1"/>
+                    </pic:cNvPicPr>
+                  </pic:nvPicPr>
+                  <pic:blipFill>
+                    <a:blip r:embed="rId74">
+                      <a:extLst>
+                        <a:ext uri="{28A0092B-C50C-407E-A947-70E740481C1C}">
+                          <a14:useLocalDpi xmlns:a14="http://schemas.microsoft.com/office/drawing/2010/main" val="0"/>
+                        </a:ext>
+                        <a:ext uri="{96DAC541-7B7A-43D3-8B79-37D633B846F1}">
+                          <asvg:svgBlip xmlns:asvg="http://schemas.microsoft.com/office/drawing/2016/SVG/main" r:embed="rId67"/>
+                        </a:ext>
+                      </a:extLst>
+                    </a:blip>
+                    <a:stretch>
+                      <a:fillRect/>
+                    </a:stretch>
+                  </pic:blipFill>
+                  <pic:spPr bwMode="auto">
+                    <a:xfrm>
+                      <a:off x="0" y="0"/>
+                      <a:ext cx="114300" cy="114300"/>
+                    </a:xfrm>
+                    <a:prstGeom prst="rect">
+                      <a:avLst/>
+                    </a:prstGeom>
+                    <a:noFill/>
+                    <a:ln w="9525">
+                      <a:noFill/>
+                      <a:headEnd/>
+                      <a:tailEnd/>
+                    </a:ln>
+                  </pic:spPr>
+                </pic:pic>
+              </a:graphicData>
+            </a:graphic>
+          </wp:inline>
+        </w:drawing>
+      </w:r>
     </w:p>
-    <w:bookmarkEnd w:id="68"/>
-    <w:bookmarkStart w:id="73" w:name="počty-zaměstnanců-státu"/>
+    <w:bookmarkEnd w:id="75"/>
+    <w:bookmarkStart w:id="98" w:name="počty-zaměstnanců-státu"/>
     <w:p>
       <w:pPr>
         <w:pStyle w:val="Heading2"/>
@@ -393,13 +489,149 @@
           <w:numId w:val="1000"/>
         </w:numPr>
       </w:pPr>
-      <w:r>
-        <w:t xml:space="preserve">→</w:t>
-      </w:r>
+      <w:hyperlink r:id="rId76">
+        <w:r>
+          <w:rPr>
+            <w:rStyle w:val="Hyperlink"/>
+          </w:rPr>
+          <w:t xml:space="preserve">Graf 10</w:t>
+        </w:r>
+      </w:hyperlink>
       <w:r>
         <w:t xml:space="preserve"> </w:t>
       </w:r>
-      <w:hyperlink r:id="rId69">
+      <w:r>
+        <w:drawing>
+          <wp:inline>
+            <wp:extent cx="114300" cy="114300"/>
+            <wp:effectExtent b="0" l="0" r="0" t="0"/>
+            <wp:docPr descr="" title="" id="77" name="Picture"/>
+            <a:graphic>
+              <a:graphicData uri="http://schemas.openxmlformats.org/drawingml/2006/picture">
+                <pic:pic>
+                  <pic:nvPicPr>
+                    <pic:cNvPr descr="report-files/sipka.svg" id="78" name="Picture"/>
+                    <pic:cNvPicPr>
+                      <a:picLocks noChangeArrowheads="1" noChangeAspect="1"/>
+                    </pic:cNvPicPr>
+                  </pic:nvPicPr>
+                  <pic:blipFill>
+                    <a:blip r:embed="rId79">
+                      <a:extLst>
+                        <a:ext uri="{28A0092B-C50C-407E-A947-70E740481C1C}">
+                          <a14:useLocalDpi xmlns:a14="http://schemas.microsoft.com/office/drawing/2010/main" val="0"/>
+                        </a:ext>
+                        <a:ext uri="{96DAC541-7B7A-43D3-8B79-37D633B846F1}">
+                          <asvg:svgBlip xmlns:asvg="http://schemas.microsoft.com/office/drawing/2016/SVG/main" r:embed="rId67"/>
+                        </a:ext>
+                      </a:extLst>
+                    </a:blip>
+                    <a:stretch>
+                      <a:fillRect/>
+                    </a:stretch>
+                  </pic:blipFill>
+                  <pic:spPr bwMode="auto">
+                    <a:xfrm>
+                      <a:off x="0" y="0"/>
+                      <a:ext cx="114300" cy="114300"/>
+                    </a:xfrm>
+                    <a:prstGeom prst="rect">
+                      <a:avLst/>
+                    </a:prstGeom>
+                    <a:noFill/>
+                    <a:ln w="9525">
+                      <a:noFill/>
+                      <a:headEnd/>
+                      <a:tailEnd/>
+                    </a:ln>
+                  </pic:spPr>
+                </pic:pic>
+              </a:graphicData>
+            </a:graphic>
+          </wp:inline>
+        </w:drawing>
+      </w:r>
+    </w:p>
+    <w:p>
+      <w:pPr>
+        <w:numPr>
+          <w:ilvl w:val="1"/>
+          <w:numId w:val="1004"/>
+        </w:numPr>
+      </w:pPr>
+      <w:r>
+        <w:t xml:space="preserve">Počet státních úředníků velmi mírně klesl (o 300 osob, 0.3 %); mírné nárůsty na ústředních úřadech více než kompenzovaly úbytky zaměstnanců velkých neústředních úřadů.</w:t>
+      </w:r>
+    </w:p>
+    <w:p>
+      <w:pPr>
+        <w:numPr>
+          <w:ilvl w:val="1"/>
+          <w:numId w:val="1004"/>
+        </w:numPr>
+      </w:pPr>
+      <w:r>
+        <w:t xml:space="preserve">Počet zaměstnanců ministerstev vzrostl o zhruba 300.</w:t>
+      </w:r>
+    </w:p>
+    <w:p>
+      <w:pPr>
+        <w:numPr>
+          <w:ilvl w:val="1"/>
+          <w:numId w:val="1004"/>
+        </w:numPr>
+      </w:pPr>
+      <w:r>
+        <w:t xml:space="preserve">Počet zaměstnanců ostatních ústředních orgánů vzrostl o zhruba 50 (+1 %).</w:t>
+      </w:r>
+    </w:p>
+    <w:p>
+      <w:pPr>
+        <w:numPr>
+          <w:ilvl w:val="1"/>
+          <w:numId w:val="1004"/>
+        </w:numPr>
+      </w:pPr>
+      <w:r>
+        <w:t xml:space="preserve">Výrazně přibylo zaměstnanců regionálního školství zhruba o 3 800 (+1,4 %).</w:t>
+      </w:r>
+    </w:p>
+    <w:p>
+      <w:pPr>
+        <w:numPr>
+          <w:ilvl w:val="0"/>
+          <w:numId w:val="1003"/>
+        </w:numPr>
+      </w:pPr>
+      <w:r>
+        <w:rPr>
+          <w:b/>
+          <w:bCs/>
+        </w:rPr>
+        <w:t xml:space="preserve">Sektor školství spadající pod MŠMT (příspěvkové organizace) za poslední dekádu přispěl k celkovému nárůstu počtu zaměstnanců státu nejvíce.</w:t>
+      </w:r>
+      <w:r>
+        <w:t xml:space="preserve"> </w:t>
+      </w:r>
+      <w:r>
+        <w:t xml:space="preserve">Od roku 2017 se meziroční nárůsty pohybovaly mezi 3,8 až 14,9 tisíci zaměstnanců, což ale s ohledem na celkově vysoké počty zaměstnanců znamená růsty pouze v řádu 1 % až 3 %.</w:t>
+      </w:r>
+      <w:r>
+        <w:t xml:space="preserve"> </w:t>
+      </w:r>
+      <w:r>
+        <w:t xml:space="preserve">Souviselo to jak s demograficky taženým růstem počtu dětí školního věku v tomto období, tak se zaváděním inkluze, která dříve v českém školství absentovala.</w:t>
+      </w:r>
+    </w:p>
+    <w:p>
+      <w:pPr>
+        <w:pStyle w:val="nospacepara"/>
+        <w:numPr>
+          <w:ilvl w:val="0"/>
+          <w:numId w:val="1000"/>
+        </w:numPr>
+      </w:pPr>
+      <w:hyperlink r:id="rId76">
         <w:r>
           <w:rPr>
             <w:rStyle w:val="Hyperlink"/>
@@ -411,50 +643,6 @@
     <w:p>
       <w:pPr>
         <w:numPr>
-          <w:ilvl w:val="1"/>
-          <w:numId w:val="1004"/>
-        </w:numPr>
-      </w:pPr>
-      <w:r>
-        <w:t xml:space="preserve">Počet státních úředníků velmi mírně klesl (o 300 osob, 0.3 %); mírné nárůsty na ústředních úřadech více než kompenzovaly úbytky zaměstnanců velkých neústředních úřadů.</w:t>
-      </w:r>
-    </w:p>
-    <w:p>
-      <w:pPr>
-        <w:numPr>
-          <w:ilvl w:val="1"/>
-          <w:numId w:val="1004"/>
-        </w:numPr>
-      </w:pPr>
-      <w:r>
-        <w:t xml:space="preserve">Počet zaměstnanců ministerstev vzrostl o zhruba 300.</w:t>
-      </w:r>
-    </w:p>
-    <w:p>
-      <w:pPr>
-        <w:numPr>
-          <w:ilvl w:val="1"/>
-          <w:numId w:val="1004"/>
-        </w:numPr>
-      </w:pPr>
-      <w:r>
-        <w:t xml:space="preserve">Počet zaměstnanců ostatních ústředních orgánů vzrostl o zhruba 50 (+1 %).</w:t>
-      </w:r>
-    </w:p>
-    <w:p>
-      <w:pPr>
-        <w:numPr>
-          <w:ilvl w:val="1"/>
-          <w:numId w:val="1004"/>
-        </w:numPr>
-      </w:pPr>
-      <w:r>
-        <w:t xml:space="preserve">Výrazně přibylo zaměstnanců regionálního školství zhruba o 3 800 (+1,4 %).</w:t>
-      </w:r>
-    </w:p>
-    <w:p>
-      <w:pPr>
-        <w:numPr>
           <w:ilvl w:val="0"/>
           <w:numId w:val="1003"/>
         </w:numPr>
@@ -464,19 +652,28 @@
           <w:b/>
           <w:bCs/>
         </w:rPr>
-        <w:t xml:space="preserve">Sektor školství spadající pod MŠMT (příspěvkové organizace) za poslední dekádu přispěl k celkovému nárůstu počtu zaměstnanců státu nejvíce.</w:t>
+        <w:t xml:space="preserve">Státních úředníků je mezi zaměstnanci státu cca 75 tisíc (15 % zaměstnanců státu)</w:t>
+      </w:r>
+      <w:r>
+        <w:t xml:space="preserve">.</w:t>
       </w:r>
       <w:r>
         <w:t xml:space="preserve"> </w:t>
       </w:r>
       <w:r>
-        <w:t xml:space="preserve">Od roku 2017 se meziroční nárůsty pohybovaly mezi 3,8 až 14,9 tisíci zaměstnanců, což ale s ohledem na celkově vysoké počty zaměstnanců znamená růsty pouze v řádu 1 % až 3 %.</w:t>
+        <w:t xml:space="preserve">Většina z nich pracuje v ‚Neústřední státní správě’, tj. v organizacích, jako jsou finanční úřady či správa sociálního zabezpečení, úřady práce, tedy často na pobočkách mimo Prahu.</w:t>
       </w:r>
       <w:r>
         <w:t xml:space="preserve"> </w:t>
       </w:r>
       <w:r>
-        <w:t xml:space="preserve">Souviselo to jak s demograficky taženým růstem počtu dětí školního věku v tomto období, tak se zaváděním inkluze, která dříve v českém školství absentovala.</w:t>
+        <w:t xml:space="preserve">Na ministerstvech pak pracuje necelých 23 tis. osob, představují necelých 5 % zaměstnanců státu a necelého půl procenta pracovní síly v ekonomice (toto číslo zahrnuje i příslušníky a zaměstnance bezpečnostních sborů evidované na Ministerstvu vnitra (MV ČR), které nelze v těchto datech odlišit).</w:t>
+      </w:r>
+      <w:r>
+        <w:t xml:space="preserve"> </w:t>
+      </w:r>
+      <w:r>
+        <w:t xml:space="preserve">Státních úředníků je tedy mnohem méně, než jaké jsou laické představy a případná očekávání ohledně rozsahu možných úspor v této oblasti.</w:t>
       </w:r>
     </w:p>
     <w:p>
@@ -487,55 +684,67 @@
           <w:numId w:val="1000"/>
         </w:numPr>
       </w:pPr>
-      <w:r>
-        <w:t xml:space="preserve">→</w:t>
-      </w:r>
-      <w:r>
-        <w:t xml:space="preserve"> </w:t>
-      </w:r>
-      <w:hyperlink r:id="rId69">
+      <w:hyperlink r:id="rId66">
         <w:r>
           <w:rPr>
             <w:rStyle w:val="Hyperlink"/>
           </w:rPr>
-          <w:t xml:space="preserve">Graf 10. Změny počtu zaměstnanců ve sféře rozpočtové regulace, podle kategorií</w:t>
+          <w:t xml:space="preserve">Graf 1a</w:t>
         </w:r>
       </w:hyperlink>
-    </w:p>
-    <w:p>
-      <w:pPr>
-        <w:numPr>
-          <w:ilvl w:val="0"/>
-          <w:numId w:val="1003"/>
-        </w:numPr>
-      </w:pPr>
-      <w:r>
-        <w:rPr>
-          <w:b/>
-          <w:bCs/>
-        </w:rPr>
-        <w:t xml:space="preserve">Státních úředníků je mezi zaměstnanci státu cca 75 tisíc (15 % zaměstnanců státu)</w:t>
-      </w:r>
-      <w:r>
-        <w:t xml:space="preserve">.</w:t>
-      </w:r>
       <w:r>
         <w:t xml:space="preserve"> </w:t>
       </w:r>
       <w:r>
-        <w:t xml:space="preserve">Většina z nich pracuje v ‚Neústřední státní správě’, tj. v organizacích, jako jsou finanční úřady či správa sociálního zabezpečení, úřady práce, tedy často na pobočkách mimo Prahu.</w:t>
-      </w:r>
-      <w:r>
-        <w:t xml:space="preserve"> </w:t>
-      </w:r>
-      <w:r>
-        <w:t xml:space="preserve">Na ministerstvech pak pracuje necelých 23 tis. osob, představují necelých 5 % zaměstnanců státu a necelého půl procenta pracovní síly v ekonomice (toto číslo zahrnuje i příslušníky a zaměstnance bezpečnostních sborů evidované na Ministerstvu vnitra (MV ČR), které nelze v těchto datech odlišit).</w:t>
-      </w:r>
-      <w:r>
-        <w:t xml:space="preserve"> </w:t>
-      </w:r>
-      <w:r>
-        <w:t xml:space="preserve">Státních úředníků je tedy mnohem méně, než jaké jsou laické představy a případná očekávání ohledně rozsahu možných úspor v této oblasti.</w:t>
+        <w:drawing>
+          <wp:inline>
+            <wp:extent cx="114300" cy="114300"/>
+            <wp:effectExtent b="0" l="0" r="0" t="0"/>
+            <wp:docPr descr="" title="" id="80" name="Picture"/>
+            <a:graphic>
+              <a:graphicData uri="http://schemas.openxmlformats.org/drawingml/2006/picture">
+                <pic:pic>
+                  <pic:nvPicPr>
+                    <pic:cNvPr descr="report-files/sipka.svg" id="81" name="Picture"/>
+                    <pic:cNvPicPr>
+                      <a:picLocks noChangeArrowheads="1" noChangeAspect="1"/>
+                    </pic:cNvPicPr>
+                  </pic:nvPicPr>
+                  <pic:blipFill>
+                    <a:blip r:embed="rId82">
+                      <a:extLst>
+                        <a:ext uri="{28A0092B-C50C-407E-A947-70E740481C1C}">
+                          <a14:useLocalDpi xmlns:a14="http://schemas.microsoft.com/office/drawing/2010/main" val="0"/>
+                        </a:ext>
+                        <a:ext uri="{96DAC541-7B7A-43D3-8B79-37D633B846F1}">
+                          <asvg:svgBlip xmlns:asvg="http://schemas.microsoft.com/office/drawing/2016/SVG/main" r:embed="rId67"/>
+                        </a:ext>
+                      </a:extLst>
+                    </a:blip>
+                    <a:stretch>
+                      <a:fillRect/>
+                    </a:stretch>
+                  </pic:blipFill>
+                  <pic:spPr bwMode="auto">
+                    <a:xfrm>
+                      <a:off x="0" y="0"/>
+                      <a:ext cx="114300" cy="114300"/>
+                    </a:xfrm>
+                    <a:prstGeom prst="rect">
+                      <a:avLst/>
+                    </a:prstGeom>
+                    <a:noFill/>
+                    <a:ln w="9525">
+                      <a:noFill/>
+                      <a:headEnd/>
+                      <a:tailEnd/>
+                    </a:ln>
+                  </pic:spPr>
+                </pic:pic>
+              </a:graphicData>
+            </a:graphic>
+          </wp:inline>
+        </w:drawing>
       </w:r>
     </w:p>
     <w:p>
@@ -546,20 +755,68 @@
           <w:numId w:val="1000"/>
         </w:numPr>
       </w:pPr>
-      <w:r>
-        <w:t xml:space="preserve">→</w:t>
-      </w:r>
-      <w:r>
-        <w:t xml:space="preserve"> </w:t>
-      </w:r>
-      <w:hyperlink r:id="rId66">
+      <w:hyperlink r:id="rId83">
         <w:r>
           <w:rPr>
             <w:rStyle w:val="Hyperlink"/>
           </w:rPr>
-          <w:t xml:space="preserve">Graf 1a. Počet zaměstnanců státu dle regulace zaměstnanosti</w:t>
+          <w:t xml:space="preserve">Graf 4a</w:t>
         </w:r>
       </w:hyperlink>
+      <w:r>
+        <w:t xml:space="preserve"> </w:t>
+      </w:r>
+      <w:r>
+        <w:drawing>
+          <wp:inline>
+            <wp:extent cx="114300" cy="114300"/>
+            <wp:effectExtent b="0" l="0" r="0" t="0"/>
+            <wp:docPr descr="" title="" id="84" name="Picture"/>
+            <a:graphic>
+              <a:graphicData uri="http://schemas.openxmlformats.org/drawingml/2006/picture">
+                <pic:pic>
+                  <pic:nvPicPr>
+                    <pic:cNvPr descr="report-files/sipka.svg" id="85" name="Picture"/>
+                    <pic:cNvPicPr>
+                      <a:picLocks noChangeArrowheads="1" noChangeAspect="1"/>
+                    </pic:cNvPicPr>
+                  </pic:nvPicPr>
+                  <pic:blipFill>
+                    <a:blip r:embed="rId86">
+                      <a:extLst>
+                        <a:ext uri="{28A0092B-C50C-407E-A947-70E740481C1C}">
+                          <a14:useLocalDpi xmlns:a14="http://schemas.microsoft.com/office/drawing/2010/main" val="0"/>
+                        </a:ext>
+                        <a:ext uri="{96DAC541-7B7A-43D3-8B79-37D633B846F1}">
+                          <asvg:svgBlip xmlns:asvg="http://schemas.microsoft.com/office/drawing/2016/SVG/main" r:embed="rId67"/>
+                        </a:ext>
+                      </a:extLst>
+                    </a:blip>
+                    <a:stretch>
+                      <a:fillRect/>
+                    </a:stretch>
+                  </pic:blipFill>
+                  <pic:spPr bwMode="auto">
+                    <a:xfrm>
+                      <a:off x="0" y="0"/>
+                      <a:ext cx="114300" cy="114300"/>
+                    </a:xfrm>
+                    <a:prstGeom prst="rect">
+                      <a:avLst/>
+                    </a:prstGeom>
+                    <a:noFill/>
+                    <a:ln w="9525">
+                      <a:noFill/>
+                      <a:headEnd/>
+                      <a:tailEnd/>
+                    </a:ln>
+                  </pic:spPr>
+                </pic:pic>
+              </a:graphicData>
+            </a:graphic>
+          </wp:inline>
+        </w:drawing>
+      </w:r>
     </w:p>
     <w:p>
       <w:pPr>
@@ -569,20 +826,119 @@
           <w:numId w:val="1000"/>
         </w:numPr>
       </w:pPr>
-      <w:r>
-        <w:t xml:space="preserve">→</w:t>
-      </w:r>
-      <w:r>
-        <w:t xml:space="preserve"> </w:t>
-      </w:r>
-      <w:hyperlink r:id="rId70">
+      <w:hyperlink r:id="rId87">
         <w:r>
           <w:rPr>
             <w:rStyle w:val="Hyperlink"/>
           </w:rPr>
-          <w:t xml:space="preserve">Graf 4a. Počet státních úředníků 2003–2025</w:t>
+          <w:t xml:space="preserve">Graf 4b</w:t>
         </w:r>
       </w:hyperlink>
+      <w:r>
+        <w:t xml:space="preserve"> </w:t>
+      </w:r>
+      <w:r>
+        <w:drawing>
+          <wp:inline>
+            <wp:extent cx="114300" cy="114300"/>
+            <wp:effectExtent b="0" l="0" r="0" t="0"/>
+            <wp:docPr descr="" title="" id="88" name="Picture"/>
+            <a:graphic>
+              <a:graphicData uri="http://schemas.openxmlformats.org/drawingml/2006/picture">
+                <pic:pic>
+                  <pic:nvPicPr>
+                    <pic:cNvPr descr="report-files/sipka.svg" id="89" name="Picture"/>
+                    <pic:cNvPicPr>
+                      <a:picLocks noChangeArrowheads="1" noChangeAspect="1"/>
+                    </pic:cNvPicPr>
+                  </pic:nvPicPr>
+                  <pic:blipFill>
+                    <a:blip r:embed="rId90">
+                      <a:extLst>
+                        <a:ext uri="{28A0092B-C50C-407E-A947-70E740481C1C}">
+                          <a14:useLocalDpi xmlns:a14="http://schemas.microsoft.com/office/drawing/2010/main" val="0"/>
+                        </a:ext>
+                        <a:ext uri="{96DAC541-7B7A-43D3-8B79-37D633B846F1}">
+                          <asvg:svgBlip xmlns:asvg="http://schemas.microsoft.com/office/drawing/2016/SVG/main" r:embed="rId67"/>
+                        </a:ext>
+                      </a:extLst>
+                    </a:blip>
+                    <a:stretch>
+                      <a:fillRect/>
+                    </a:stretch>
+                  </pic:blipFill>
+                  <pic:spPr bwMode="auto">
+                    <a:xfrm>
+                      <a:off x="0" y="0"/>
+                      <a:ext cx="114300" cy="114300"/>
+                    </a:xfrm>
+                    <a:prstGeom prst="rect">
+                      <a:avLst/>
+                    </a:prstGeom>
+                    <a:noFill/>
+                    <a:ln w="9525">
+                      <a:noFill/>
+                      <a:headEnd/>
+                      <a:tailEnd/>
+                    </a:ln>
+                  </pic:spPr>
+                </pic:pic>
+              </a:graphicData>
+            </a:graphic>
+          </wp:inline>
+        </w:drawing>
+      </w:r>
+    </w:p>
+    <w:p>
+      <w:pPr>
+        <w:numPr>
+          <w:ilvl w:val="0"/>
+          <w:numId w:val="1003"/>
+        </w:numPr>
+      </w:pPr>
+      <w:r>
+        <w:rPr>
+          <w:b/>
+          <w:bCs/>
+        </w:rPr>
+        <w:t xml:space="preserve">Počty státních úředníků</w:t>
+      </w:r>
+      <w:r>
+        <w:t xml:space="preserve"> </w:t>
+      </w:r>
+      <w:r>
+        <w:t xml:space="preserve">se poslední dvě dekády pohybovaly v rozmezí 71 tis. (rok 2012) a 79 tis. (rok 2019).</w:t>
+      </w:r>
+      <w:r>
+        <w:t xml:space="preserve"> </w:t>
+      </w:r>
+      <w:r>
+        <w:t xml:space="preserve">Do dlouhodobých trendů se promítly snahy o konsolidaci veřejných rozpočtů po roce 2010 a po roce 2021.</w:t>
+      </w:r>
+      <w:r>
+        <w:t xml:space="preserve"> </w:t>
+      </w:r>
+      <w:r>
+        <w:t xml:space="preserve">Za mírným poklesem počtu státních úředníků po roce 2021 o zhruba 3 000 stály hlavně poklesy v sektoru ‚Neústřední státní správy’, která zahrnuje organizace podřízené ministerstvům jako např.</w:t>
+      </w:r>
+      <w:r>
+        <w:t xml:space="preserve"> </w:t>
+      </w:r>
+      <w:r>
+        <w:t xml:space="preserve">finanční správa nebo úřady práce.</w:t>
+      </w:r>
+      <w:r>
+        <w:t xml:space="preserve"> </w:t>
+      </w:r>
+      <w:r>
+        <w:t xml:space="preserve">‚Neústřední státní správa’ zaměstnává většinu státních úředníků (63 %).</w:t>
+      </w:r>
+      <w:r>
+        <w:t xml:space="preserve"> </w:t>
+      </w:r>
+      <w:r>
+        <w:t xml:space="preserve">Naopak počet státních úředníků přímo na ministerstvech po roce 2021 mírně narostl z 22 729 na 23 130 v roce 2025 (toto číslo zahrnuje i příslušníky a zaměstnance bezpečnostních sborů evidované pod IČO Ministerstva vnitra, které nelze v těchto datech odlišit).</w:t>
+      </w:r>
     </w:p>
     <w:p>
       <w:pPr>
@@ -592,20 +948,68 @@
           <w:numId w:val="1000"/>
         </w:numPr>
       </w:pPr>
-      <w:r>
-        <w:t xml:space="preserve">→</w:t>
-      </w:r>
-      <w:r>
-        <w:t xml:space="preserve"> </w:t>
-      </w:r>
-      <w:hyperlink r:id="rId71">
+      <w:hyperlink r:id="rId87">
         <w:r>
           <w:rPr>
             <w:rStyle w:val="Hyperlink"/>
           </w:rPr>
-          <w:t xml:space="preserve">Graf 4b. Počet státních úředníků 2003–2025, včetně MV a MZV</w:t>
+          <w:t xml:space="preserve">Graf 4b</w:t>
         </w:r>
       </w:hyperlink>
+      <w:r>
+        <w:t xml:space="preserve"> </w:t>
+      </w:r>
+      <w:r>
+        <w:drawing>
+          <wp:inline>
+            <wp:extent cx="114300" cy="114300"/>
+            <wp:effectExtent b="0" l="0" r="0" t="0"/>
+            <wp:docPr descr="" title="" id="91" name="Picture"/>
+            <a:graphic>
+              <a:graphicData uri="http://schemas.openxmlformats.org/drawingml/2006/picture">
+                <pic:pic>
+                  <pic:nvPicPr>
+                    <pic:cNvPr descr="report-files/sipka.svg" id="92" name="Picture"/>
+                    <pic:cNvPicPr>
+                      <a:picLocks noChangeArrowheads="1" noChangeAspect="1"/>
+                    </pic:cNvPicPr>
+                  </pic:nvPicPr>
+                  <pic:blipFill>
+                    <a:blip r:embed="rId93">
+                      <a:extLst>
+                        <a:ext uri="{28A0092B-C50C-407E-A947-70E740481C1C}">
+                          <a14:useLocalDpi xmlns:a14="http://schemas.microsoft.com/office/drawing/2010/main" val="0"/>
+                        </a:ext>
+                        <a:ext uri="{96DAC541-7B7A-43D3-8B79-37D633B846F1}">
+                          <asvg:svgBlip xmlns:asvg="http://schemas.microsoft.com/office/drawing/2016/SVG/main" r:embed="rId67"/>
+                        </a:ext>
+                      </a:extLst>
+                    </a:blip>
+                    <a:stretch>
+                      <a:fillRect/>
+                    </a:stretch>
+                  </pic:blipFill>
+                  <pic:spPr bwMode="auto">
+                    <a:xfrm>
+                      <a:off x="0" y="0"/>
+                      <a:ext cx="114300" cy="114300"/>
+                    </a:xfrm>
+                    <a:prstGeom prst="rect">
+                      <a:avLst/>
+                    </a:prstGeom>
+                    <a:noFill/>
+                    <a:ln w="9525">
+                      <a:noFill/>
+                      <a:headEnd/>
+                      <a:tailEnd/>
+                    </a:ln>
+                  </pic:spPr>
+                </pic:pic>
+              </a:graphicData>
+            </a:graphic>
+          </wp:inline>
+        </w:drawing>
+      </w:r>
     </w:p>
     <w:p>
       <w:pPr>
@@ -619,43 +1023,22 @@
           <w:b/>
           <w:bCs/>
         </w:rPr>
-        <w:t xml:space="preserve">Počty státních úředníků</w:t>
+        <w:t xml:space="preserve">Veřejný sektor, uváděný v některých statistikách ČSÚ</w:t>
+      </w:r>
+      <w:r>
+        <w:t xml:space="preserve">, představuje širší skupinu než jsou zaměstnanci státu, a navíc zahrnuje např. instituce veřejného zdravotnictví, veřejných vysokých škol a státní firmy.</w:t>
       </w:r>
       <w:r>
         <w:t xml:space="preserve"> </w:t>
       </w:r>
       <w:r>
-        <w:t xml:space="preserve">se poslední dvě dekády pohybovaly v rozmezí 71 tis. (rok 2012) a 79 tis. (rok 2019).</w:t>
+        <w:t xml:space="preserve">Zaměstnanost v takto definovaném sektoru dlouhodobě představuje zhruba 1 milion osob, tedy necelou pětinu pracovní síly v české ekonomice. Tento počet dlouhodobě mírně roste; v roce 2025 narostl o 14 tisíc (1,6 %) a za zhruba dvěma třetinami tohoto nárůstu stojí samosprávy, kde jsou započteny i nárůsty počtu zaměstnanců v regionálním školství.</w:t>
       </w:r>
       <w:r>
         <w:t xml:space="preserve"> </w:t>
       </w:r>
       <w:r>
-        <w:t xml:space="preserve">Do dlouhodobých trendů se promítly snahy o konsolidaci veřejných rozpočtů po roce 2010 a po roce 2021.</w:t>
-      </w:r>
-      <w:r>
-        <w:t xml:space="preserve"> </w:t>
-      </w:r>
-      <w:r>
-        <w:t xml:space="preserve">Za mírným poklesem počtu státních úředníků po roce 2021 o zhruba 3 000 stály hlavně poklesy v sektoru ‚Neústřední státní správy’, která zahrnuje organizace podřízené ministerstvům jako např.</w:t>
-      </w:r>
-      <w:r>
-        <w:t xml:space="preserve"> </w:t>
-      </w:r>
-      <w:r>
-        <w:t xml:space="preserve">finanční správa nebo úřady práce.</w:t>
-      </w:r>
-      <w:r>
-        <w:t xml:space="preserve"> </w:t>
-      </w:r>
-      <w:r>
-        <w:t xml:space="preserve">‚Neústřední státní správa’ zaměstnává většinu státních úředníků (63 %).</w:t>
-      </w:r>
-      <w:r>
-        <w:t xml:space="preserve"> </w:t>
-      </w:r>
-      <w:r>
-        <w:t xml:space="preserve">Naopak počet státních úředníků přímo na ministerstvech po roce 2021 mírně narostl z 22 729 na 23 130 v roce 2025 (toto číslo zahrnuje i příslušníky a zaměstnance bezpečnostních sborů evidované pod IČO Ministerstva vnitra, které nelze v těchto datech odlišit).</w:t>
+        <w:t xml:space="preserve">K nárůstu v ústředním státu přispívá i mírný setrvalý růst počtu vojáků.</w:t>
       </w:r>
     </w:p>
     <w:p>
@@ -666,26 +1049,84 @@
           <w:numId w:val="1000"/>
         </w:numPr>
       </w:pPr>
-      <w:r>
-        <w:t xml:space="preserve">→</w:t>
-      </w:r>
-      <w:r>
-        <w:t xml:space="preserve"> </w:t>
-      </w:r>
-      <w:hyperlink r:id="rId71">
+      <w:hyperlink r:id="rId94">
         <w:r>
           <w:rPr>
             <w:rStyle w:val="Hyperlink"/>
           </w:rPr>
-          <w:t xml:space="preserve">Graf 4b. Počet státních úředníků 2003–2025, včetně MV a MZV</w:t>
+          <w:t xml:space="preserve">Graf 9a</w:t>
         </w:r>
       </w:hyperlink>
+      <w:r>
+        <w:t xml:space="preserve"> </w:t>
+      </w:r>
+      <w:r>
+        <w:drawing>
+          <wp:inline>
+            <wp:extent cx="114300" cy="114300"/>
+            <wp:effectExtent b="0" l="0" r="0" t="0"/>
+            <wp:docPr descr="" title="" id="95" name="Picture"/>
+            <a:graphic>
+              <a:graphicData uri="http://schemas.openxmlformats.org/drawingml/2006/picture">
+                <pic:pic>
+                  <pic:nvPicPr>
+                    <pic:cNvPr descr="report-files/sipka.svg" id="96" name="Picture"/>
+                    <pic:cNvPicPr>
+                      <a:picLocks noChangeArrowheads="1" noChangeAspect="1"/>
+                    </pic:cNvPicPr>
+                  </pic:nvPicPr>
+                  <pic:blipFill>
+                    <a:blip r:embed="rId97">
+                      <a:extLst>
+                        <a:ext uri="{28A0092B-C50C-407E-A947-70E740481C1C}">
+                          <a14:useLocalDpi xmlns:a14="http://schemas.microsoft.com/office/drawing/2010/main" val="0"/>
+                        </a:ext>
+                        <a:ext uri="{96DAC541-7B7A-43D3-8B79-37D633B846F1}">
+                          <asvg:svgBlip xmlns:asvg="http://schemas.microsoft.com/office/drawing/2016/SVG/main" r:embed="rId67"/>
+                        </a:ext>
+                      </a:extLst>
+                    </a:blip>
+                    <a:stretch>
+                      <a:fillRect/>
+                    </a:stretch>
+                  </pic:blipFill>
+                  <pic:spPr bwMode="auto">
+                    <a:xfrm>
+                      <a:off x="0" y="0"/>
+                      <a:ext cx="114300" cy="114300"/>
+                    </a:xfrm>
+                    <a:prstGeom prst="rect">
+                      <a:avLst/>
+                    </a:prstGeom>
+                    <a:noFill/>
+                    <a:ln w="9525">
+                      <a:noFill/>
+                      <a:headEnd/>
+                      <a:tailEnd/>
+                    </a:ln>
+                  </pic:spPr>
+                </pic:pic>
+              </a:graphicData>
+            </a:graphic>
+          </wp:inline>
+        </w:drawing>
+      </w:r>
+    </w:p>
+    <w:bookmarkEnd w:id="98"/>
+    <w:bookmarkStart w:id="121" w:name="platy-zaměstnanců-státu"/>
+    <w:p>
+      <w:pPr>
+        <w:pStyle w:val="Heading2"/>
+      </w:pPr>
+      <w:r>
+        <w:t xml:space="preserve">Platy zaměstnanců státu</w:t>
+      </w:r>
     </w:p>
     <w:p>
       <w:pPr>
         <w:numPr>
           <w:ilvl w:val="0"/>
-          <w:numId w:val="1003"/>
+          <w:numId w:val="1005"/>
         </w:numPr>
       </w:pPr>
       <w:r>
@@ -693,22 +1134,43 @@
           <w:b/>
           <w:bCs/>
         </w:rPr>
-        <w:t xml:space="preserve">Veřejný sektor, uváděný v některých statistikách ČSÚ</w:t>
-      </w:r>
-      <w:r>
-        <w:t xml:space="preserve">, představuje širší skupinu než jsou zaměstnanci státu, a navíc zahrnuje např. instituce veřejného zdravotnictví, veřejných vysokých škol a státní firmy.</w:t>
+        <w:t xml:space="preserve">Průměrné reálné platy státních úředníků v roce 2025 poprvé od roku 2020 zaznamenaly nárůst</w:t>
       </w:r>
       <w:r>
         <w:t xml:space="preserve"> </w:t>
       </w:r>
       <w:r>
-        <w:t xml:space="preserve">Zaměstnanost v takto definovaném sektoru dlouhodobě představuje zhruba 1 milion osob, tedy necelou pětinu pracovní síly v české ekonomice. Tento počet dlouhodobě mírně roste; v roce 2025 narostl o 14 tisíc (1,6 %) a za zhruba dvěma třetinami tohoto nárůstu stojí samosprávy, kde jsou započteny i nárůsty počtu zaměstnanců v regionálním školství.</w:t>
+        <w:t xml:space="preserve">(ministerstva, ostatní ústřední orgány, neústřední úřady).</w:t>
       </w:r>
       <w:r>
         <w:t xml:space="preserve"> </w:t>
       </w:r>
       <w:r>
-        <w:t xml:space="preserve">K nárůstu v ústředním státu přispívá i mírný setrvalý růst počtu vojáků.</w:t>
+        <w:t xml:space="preserve">Platy na neministerských ústředních orgánech rostly (4,5 %) o něco rychleji než na neústředních úřadech (3,4 %) a ministerstvech (3,2 %).</w:t>
+      </w:r>
+      <w:r>
+        <w:t xml:space="preserve"> </w:t>
+      </w:r>
+      <w:r>
+        <w:t xml:space="preserve">K tomuto relativně rychlejším nárůstu v početně malé skupině zaměstnanců ostatních ústředních orgánů přispěl růst průměrného platu v Digitální a informační agentuře, spojený s nárůstem počtu jejích zaměstnanců.</w:t>
+      </w:r>
+      <w:r>
+        <w:t xml:space="preserve"> </w:t>
+      </w:r>
+      <w:r>
+        <w:t xml:space="preserve">Průměrné platy státních úředníků vůči průměrné mzdě v ekonomice ale opět poklesly– byť mírněji než v minulých letech – protože průměrná mzda v celé ekonomice rostla opět rychleji.</w:t>
+      </w:r>
+      <w:r>
+        <w:t xml:space="preserve"> </w:t>
+      </w:r>
+      <w:r>
+        <w:t xml:space="preserve">Nejvíce se propadly relativní mzdy na ministerstvech. Naopak se mírně zvýšily v ústředních orgánech, které je třeba srovnávat s platy v Praze.</w:t>
+      </w:r>
+      <w:r>
+        <w:t xml:space="preserve"> </w:t>
+      </w:r>
+      <w:r>
+        <w:t xml:space="preserve">Platová úroveň ministerstev a ústředních úřadů nyní dosahuje cca 95 % resp. 87 % pražského průměru, a to i přesto, že v těchto úřadech pracuje vyšší podíl např. vysokoškolsky vzdělaných lidí, než na celém trhu práce v Praze.</w:t>
       </w:r>
     </w:p>
     <w:p>
@@ -719,29 +1181,67 @@
           <w:numId w:val="1000"/>
         </w:numPr>
       </w:pPr>
-      <w:r>
-        <w:t xml:space="preserve">→</w:t>
-      </w:r>
-      <w:r>
-        <w:t xml:space="preserve"> </w:t>
-      </w:r>
-      <w:hyperlink r:id="rId72">
+      <w:hyperlink r:id="rId99">
         <w:r>
           <w:rPr>
             <w:rStyle w:val="Hyperlink"/>
           </w:rPr>
-          <w:t xml:space="preserve">Graf 9a. Počet zaměstnanců veřejného sektoru</w:t>
+          <w:t xml:space="preserve">Graf 5a</w:t>
         </w:r>
       </w:hyperlink>
-    </w:p>
-    <w:bookmarkEnd w:id="73"/>
-    <w:bookmarkStart w:id="78" w:name="platy-zaměstnanců-státu"/>
-    <w:p>
-      <w:pPr>
-        <w:pStyle w:val="Heading2"/>
-      </w:pPr>
-      <w:r>
-        <w:t xml:space="preserve">Platy zaměstnanců státu</w:t>
+      <w:r>
+        <w:t xml:space="preserve"> </w:t>
+      </w:r>
+      <w:r>
+        <w:drawing>
+          <wp:inline>
+            <wp:extent cx="114300" cy="114300"/>
+            <wp:effectExtent b="0" l="0" r="0" t="0"/>
+            <wp:docPr descr="" title="" id="100" name="Picture"/>
+            <a:graphic>
+              <a:graphicData uri="http://schemas.openxmlformats.org/drawingml/2006/picture">
+                <pic:pic>
+                  <pic:nvPicPr>
+                    <pic:cNvPr descr="report-files/sipka.svg" id="101" name="Picture"/>
+                    <pic:cNvPicPr>
+                      <a:picLocks noChangeArrowheads="1" noChangeAspect="1"/>
+                    </pic:cNvPicPr>
+                  </pic:nvPicPr>
+                  <pic:blipFill>
+                    <a:blip r:embed="rId102">
+                      <a:extLst>
+                        <a:ext uri="{28A0092B-C50C-407E-A947-70E740481C1C}">
+                          <a14:useLocalDpi xmlns:a14="http://schemas.microsoft.com/office/drawing/2010/main" val="0"/>
+                        </a:ext>
+                        <a:ext uri="{96DAC541-7B7A-43D3-8B79-37D633B846F1}">
+                          <asvg:svgBlip xmlns:asvg="http://schemas.microsoft.com/office/drawing/2016/SVG/main" r:embed="rId67"/>
+                        </a:ext>
+                      </a:extLst>
+                    </a:blip>
+                    <a:stretch>
+                      <a:fillRect/>
+                    </a:stretch>
+                  </pic:blipFill>
+                  <pic:spPr bwMode="auto">
+                    <a:xfrm>
+                      <a:off x="0" y="0"/>
+                      <a:ext cx="114300" cy="114300"/>
+                    </a:xfrm>
+                    <a:prstGeom prst="rect">
+                      <a:avLst/>
+                    </a:prstGeom>
+                    <a:noFill/>
+                    <a:ln w="9525">
+                      <a:noFill/>
+                      <a:headEnd/>
+                      <a:tailEnd/>
+                    </a:ln>
+                  </pic:spPr>
+                </pic:pic>
+              </a:graphicData>
+            </a:graphic>
+          </wp:inline>
+        </w:drawing>
       </w:r>
     </w:p>
     <w:p>
@@ -756,43 +1256,22 @@
           <w:b/>
           <w:bCs/>
         </w:rPr>
-        <w:t xml:space="preserve">Průměrné reálné platy státních úředníků v roce 2025 poprvé od roku 2020 zaznamenaly nárůst</w:t>
+        <w:t xml:space="preserve">Průměrné relativní platy státních úředníků</w:t>
+      </w:r>
+      <w:r>
+        <w:t xml:space="preserve">, tedy v poměru k průměrným platům v ekonomice, se poslední dvě dekády vyvíjely velmi cyklicky.</w:t>
       </w:r>
       <w:r>
         <w:t xml:space="preserve"> </w:t>
       </w:r>
       <w:r>
-        <w:t xml:space="preserve">(ministerstva, ostatní ústřední orgány, neústřední úřady).</w:t>
+        <w:t xml:space="preserve">Minima dosáhly v letech 2011–2012, maxima kolem roku 2018 a od té doby klesají.</w:t>
       </w:r>
       <w:r>
         <w:t xml:space="preserve"> </w:t>
       </w:r>
       <w:r>
-        <w:t xml:space="preserve">Platy na neministerských ústředních orgánech rostly (4,5 %) o něco rychleji než na neústředních úřadech (3,4 %) a ministerstvech (3,2 %).</w:t>
-      </w:r>
-      <w:r>
-        <w:t xml:space="preserve"> </w:t>
-      </w:r>
-      <w:r>
-        <w:t xml:space="preserve">K tomuto relativně rychlejším nárůstu v početně malé skupině zaměstnanců ostatních ústředních orgánů přispěl růst průměrného platu v Digitální a informační agentuře, spojený s nárůstem počtu jejích zaměstnanců.</w:t>
-      </w:r>
-      <w:r>
-        <w:t xml:space="preserve"> </w:t>
-      </w:r>
-      <w:r>
-        <w:t xml:space="preserve">Průměrné platy státních úředníků vůči průměrné mzdě v ekonomice ale opět poklesly– byť mírněji než v minulých letech – protože průměrná mzda v celé ekonomice rostla opět rychleji.</w:t>
-      </w:r>
-      <w:r>
-        <w:t xml:space="preserve"> </w:t>
-      </w:r>
-      <w:r>
-        <w:t xml:space="preserve">Nejvíce se propadly relativní mzdy na ministerstvech. Naopak se mírně zvýšily v ústředních orgánech, které je třeba srovnávat s platy v Praze.</w:t>
-      </w:r>
-      <w:r>
-        <w:t xml:space="preserve"> </w:t>
-      </w:r>
-      <w:r>
-        <w:t xml:space="preserve">Platová úroveň ministerstev a ústředních úřadů nyní dosahuje cca 95 % resp. 87 % pražského průměru, a to i přesto, že v těchto úřadech pracuje vyšší podíl např. vysokoškolsky vzdělaných lidí, než na celém trhu práce v Praze.</w:t>
+        <w:t xml:space="preserve">Letošní poklesy relativních platů ústředních úřadů a ministerstev přichází po ještě strmějších propadech v roce 2024 a následují dlouhodobý pokles, který začal v roce 2019.</w:t>
       </w:r>
     </w:p>
     <w:p>
@@ -803,20 +1282,68 @@
           <w:numId w:val="1000"/>
         </w:numPr>
       </w:pPr>
-      <w:r>
-        <w:t xml:space="preserve">→</w:t>
-      </w:r>
-      <w:r>
-        <w:t xml:space="preserve"> </w:t>
-      </w:r>
-      <w:hyperlink r:id="rId74">
+      <w:hyperlink r:id="rId103">
         <w:r>
           <w:rPr>
             <w:rStyle w:val="Hyperlink"/>
           </w:rPr>
-          <w:t xml:space="preserve">Graf 5a. Reálné průměrné platy státních úředníků 2004–2025</w:t>
+          <w:t xml:space="preserve">Graf 5b</w:t>
         </w:r>
       </w:hyperlink>
+      <w:r>
+        <w:t xml:space="preserve"> </w:t>
+      </w:r>
+      <w:r>
+        <w:drawing>
+          <wp:inline>
+            <wp:extent cx="114300" cy="114300"/>
+            <wp:effectExtent b="0" l="0" r="0" t="0"/>
+            <wp:docPr descr="" title="" id="104" name="Picture"/>
+            <a:graphic>
+              <a:graphicData uri="http://schemas.openxmlformats.org/drawingml/2006/picture">
+                <pic:pic>
+                  <pic:nvPicPr>
+                    <pic:cNvPr descr="report-files/sipka.svg" id="105" name="Picture"/>
+                    <pic:cNvPicPr>
+                      <a:picLocks noChangeArrowheads="1" noChangeAspect="1"/>
+                    </pic:cNvPicPr>
+                  </pic:nvPicPr>
+                  <pic:blipFill>
+                    <a:blip r:embed="rId106">
+                      <a:extLst>
+                        <a:ext uri="{28A0092B-C50C-407E-A947-70E740481C1C}">
+                          <a14:useLocalDpi xmlns:a14="http://schemas.microsoft.com/office/drawing/2010/main" val="0"/>
+                        </a:ext>
+                        <a:ext uri="{96DAC541-7B7A-43D3-8B79-37D633B846F1}">
+                          <asvg:svgBlip xmlns:asvg="http://schemas.microsoft.com/office/drawing/2016/SVG/main" r:embed="rId67"/>
+                        </a:ext>
+                      </a:extLst>
+                    </a:blip>
+                    <a:stretch>
+                      <a:fillRect/>
+                    </a:stretch>
+                  </pic:blipFill>
+                  <pic:spPr bwMode="auto">
+                    <a:xfrm>
+                      <a:off x="0" y="0"/>
+                      <a:ext cx="114300" cy="114300"/>
+                    </a:xfrm>
+                    <a:prstGeom prst="rect">
+                      <a:avLst/>
+                    </a:prstGeom>
+                    <a:noFill/>
+                    <a:ln w="9525">
+                      <a:noFill/>
+                      <a:headEnd/>
+                      <a:tailEnd/>
+                    </a:ln>
+                  </pic:spPr>
+                </pic:pic>
+              </a:graphicData>
+            </a:graphic>
+          </wp:inline>
+        </w:drawing>
+      </w:r>
     </w:p>
     <w:p>
       <w:pPr>
@@ -830,22 +1357,37 @@
           <w:b/>
           <w:bCs/>
         </w:rPr>
-        <w:t xml:space="preserve">Průměrné relativní platy státních úředníků</w:t>
-      </w:r>
-      <w:r>
-        <w:t xml:space="preserve">, tedy v poměru k průměrným platům v ekonomice, se poslední dvě dekády vyvíjely velmi cyklicky.</w:t>
+        <w:t xml:space="preserve">Průměrné reálné platy v sektoru státní správy v letech 2015–2018</w:t>
       </w:r>
       <w:r>
         <w:t xml:space="preserve"> </w:t>
       </w:r>
       <w:r>
-        <w:t xml:space="preserve">Minima dosáhly v letech 2011–2012, maxima kolem roku 2018 a od té doby klesají.</w:t>
+        <w:t xml:space="preserve">svým vývojem převyšovaly růst průměrných reálných mezd v ekonomice.</w:t>
       </w:r>
       <w:r>
         <w:t xml:space="preserve"> </w:t>
       </w:r>
       <w:r>
-        <w:t xml:space="preserve">Letošní poklesy relativních platů ústředních úřadů a ministerstev přichází po ještě strmějších propadech v roce 2024 a následují dlouhodobý pokles, který začal v roce 2019.</w:t>
+        <w:t xml:space="preserve">To přispělo k růstu relativních platů ve státní správě, a tedy i nákladů na tyto platy.</w:t>
+      </w:r>
+      <w:r>
+        <w:t xml:space="preserve"> </w:t>
+      </w:r>
+      <w:r>
+        <w:t xml:space="preserve">V roce 2021 došlo k velkému propadu reálných platů ve státní správě, zatímco reálné mzdy v ekonomice ještě rostly.</w:t>
+      </w:r>
+      <w:r>
+        <w:t xml:space="preserve"> </w:t>
+      </w:r>
+      <w:r>
+        <w:t xml:space="preserve">V letech 2022 a 2023 potom došlo k vysokým a podobným propadům reálných platů i mezd v ekonomice.</w:t>
+      </w:r>
+      <w:r>
+        <w:t xml:space="preserve"> </w:t>
+      </w:r>
+      <w:r>
+        <w:t xml:space="preserve">V roce 2024 státní správa na ekonomiku dále ztrácela, v roce 2025 se tento propad téměř zastavil. Výjimkou jsou bezpečnostní sbory a skupina zahrnující Armádu ČR, kde relativní platy v roce 2025 stouply.</w:t>
       </w:r>
     </w:p>
     <w:p>
@@ -856,88 +1398,68 @@
           <w:numId w:val="1000"/>
         </w:numPr>
       </w:pPr>
-      <w:r>
-        <w:t xml:space="preserve">→</w:t>
-      </w:r>
-      <w:r>
-        <w:t xml:space="preserve"> </w:t>
-      </w:r>
-      <w:hyperlink r:id="rId75">
+      <w:hyperlink r:id="rId99">
         <w:r>
           <w:rPr>
             <w:rStyle w:val="Hyperlink"/>
           </w:rPr>
-          <w:t xml:space="preserve">Graf 5b. Průměrné platy státních úředníků v poměru k průměrné mzdě v ekonomice</w:t>
+          <w:t xml:space="preserve">Graf 5a</w:t>
         </w:r>
       </w:hyperlink>
-    </w:p>
-    <w:p>
-      <w:pPr>
-        <w:numPr>
-          <w:ilvl w:val="0"/>
-          <w:numId w:val="1005"/>
-        </w:numPr>
-      </w:pPr>
-      <w:r>
-        <w:rPr>
-          <w:b/>
-          <w:bCs/>
-        </w:rPr>
-        <w:t xml:space="preserve">Průměrné reálné platy v sektoru státní správy v letech 2015–2018</w:t>
-      </w:r>
       <w:r>
         <w:t xml:space="preserve"> </w:t>
       </w:r>
       <w:r>
-        <w:t xml:space="preserve">svým vývojem převyšovaly růst průměrných reálných mezd v ekonomice.</w:t>
-      </w:r>
-      <w:r>
-        <w:t xml:space="preserve"> </w:t>
-      </w:r>
-      <w:r>
-        <w:t xml:space="preserve">To přispělo k růstu relativních platů ve státní správě, a tedy i nákladů na tyto platy.</w:t>
-      </w:r>
-      <w:r>
-        <w:t xml:space="preserve"> </w:t>
-      </w:r>
-      <w:r>
-        <w:t xml:space="preserve">V roce 2021 došlo k velkému propadu reálných platů ve státní správě, zatímco reálné mzdy v ekonomice ještě rostly.</w:t>
-      </w:r>
-      <w:r>
-        <w:t xml:space="preserve"> </w:t>
-      </w:r>
-      <w:r>
-        <w:t xml:space="preserve">V letech 2022 a 2023 potom došlo k vysokým a podobným propadům reálných platů i mezd v ekonomice.</w:t>
-      </w:r>
-      <w:r>
-        <w:t xml:space="preserve"> </w:t>
-      </w:r>
-      <w:r>
-        <w:t xml:space="preserve">V roce 2024 státní správa na ekonomiku dále ztrácela, v roce 2025 se tento propad téměř zastavil. Výjimkou jsou bezpečnostní sbory a skupina zahrnující Armádu ČR, kde relativní platy v roce 2025 stouply.</w:t>
-      </w:r>
-    </w:p>
-    <w:p>
-      <w:pPr>
-        <w:pStyle w:val="nospacepara"/>
-        <w:numPr>
-          <w:ilvl w:val="0"/>
-          <w:numId w:val="1000"/>
-        </w:numPr>
-      </w:pPr>
-      <w:r>
-        <w:t xml:space="preserve">→</w:t>
-      </w:r>
-      <w:r>
-        <w:t xml:space="preserve"> </w:t>
-      </w:r>
-      <w:hyperlink r:id="rId74">
-        <w:r>
-          <w:rPr>
-            <w:rStyle w:val="Hyperlink"/>
-          </w:rPr>
-          <w:t xml:space="preserve">Graf 5a. Reálné průměrné platy státních úředníků 2004–2025</w:t>
-        </w:r>
-      </w:hyperlink>
+        <w:drawing>
+          <wp:inline>
+            <wp:extent cx="114300" cy="114300"/>
+            <wp:effectExtent b="0" l="0" r="0" t="0"/>
+            <wp:docPr descr="" title="" id="107" name="Picture"/>
+            <a:graphic>
+              <a:graphicData uri="http://schemas.openxmlformats.org/drawingml/2006/picture">
+                <pic:pic>
+                  <pic:nvPicPr>
+                    <pic:cNvPr descr="report-files/sipka.svg" id="108" name="Picture"/>
+                    <pic:cNvPicPr>
+                      <a:picLocks noChangeArrowheads="1" noChangeAspect="1"/>
+                    </pic:cNvPicPr>
+                  </pic:nvPicPr>
+                  <pic:blipFill>
+                    <a:blip r:embed="rId109">
+                      <a:extLst>
+                        <a:ext uri="{28A0092B-C50C-407E-A947-70E740481C1C}">
+                          <a14:useLocalDpi xmlns:a14="http://schemas.microsoft.com/office/drawing/2010/main" val="0"/>
+                        </a:ext>
+                        <a:ext uri="{96DAC541-7B7A-43D3-8B79-37D633B846F1}">
+                          <asvg:svgBlip xmlns:asvg="http://schemas.microsoft.com/office/drawing/2016/SVG/main" r:embed="rId67"/>
+                        </a:ext>
+                      </a:extLst>
+                    </a:blip>
+                    <a:stretch>
+                      <a:fillRect/>
+                    </a:stretch>
+                  </pic:blipFill>
+                  <pic:spPr bwMode="auto">
+                    <a:xfrm>
+                      <a:off x="0" y="0"/>
+                      <a:ext cx="114300" cy="114300"/>
+                    </a:xfrm>
+                    <a:prstGeom prst="rect">
+                      <a:avLst/>
+                    </a:prstGeom>
+                    <a:noFill/>
+                    <a:ln w="9525">
+                      <a:noFill/>
+                      <a:headEnd/>
+                      <a:tailEnd/>
+                    </a:ln>
+                  </pic:spPr>
+                </pic:pic>
+              </a:graphicData>
+            </a:graphic>
+          </wp:inline>
+        </w:drawing>
+      </w:r>
     </w:p>
     <w:p>
       <w:pPr>
@@ -990,7 +1512,7 @@
       <w:r>
         <w:t xml:space="preserve"> </w:t>
       </w:r>
-      <w:hyperlink r:id="rId76">
+      <w:hyperlink r:id="rId110">
         <w:r>
           <w:rPr>
             <w:rStyle w:val="Hyperlink"/>
@@ -1010,20 +1532,68 @@
           <w:numId w:val="1000"/>
         </w:numPr>
       </w:pPr>
-      <w:r>
-        <w:t xml:space="preserve">→</w:t>
-      </w:r>
-      <w:r>
-        <w:t xml:space="preserve"> </w:t>
-      </w:r>
-      <w:hyperlink r:id="rId77">
+      <w:hyperlink r:id="rId111">
         <w:r>
           <w:rPr>
             <w:rStyle w:val="Hyperlink"/>
           </w:rPr>
-          <w:t xml:space="preserve">Graf 3a. Průměrné platy zaměstnanců státu dle rozp. kapitoly (2025)</w:t>
+          <w:t xml:space="preserve">Graf 3a</w:t>
         </w:r>
       </w:hyperlink>
+      <w:r>
+        <w:t xml:space="preserve"> </w:t>
+      </w:r>
+      <w:r>
+        <w:drawing>
+          <wp:inline>
+            <wp:extent cx="114300" cy="114300"/>
+            <wp:effectExtent b="0" l="0" r="0" t="0"/>
+            <wp:docPr descr="" title="" id="112" name="Picture"/>
+            <a:graphic>
+              <a:graphicData uri="http://schemas.openxmlformats.org/drawingml/2006/picture">
+                <pic:pic>
+                  <pic:nvPicPr>
+                    <pic:cNvPr descr="report-files/sipka.svg" id="113" name="Picture"/>
+                    <pic:cNvPicPr>
+                      <a:picLocks noChangeArrowheads="1" noChangeAspect="1"/>
+                    </pic:cNvPicPr>
+                  </pic:nvPicPr>
+                  <pic:blipFill>
+                    <a:blip r:embed="rId114">
+                      <a:extLst>
+                        <a:ext uri="{28A0092B-C50C-407E-A947-70E740481C1C}">
+                          <a14:useLocalDpi xmlns:a14="http://schemas.microsoft.com/office/drawing/2010/main" val="0"/>
+                        </a:ext>
+                        <a:ext uri="{96DAC541-7B7A-43D3-8B79-37D633B846F1}">
+                          <asvg:svgBlip xmlns:asvg="http://schemas.microsoft.com/office/drawing/2016/SVG/main" r:embed="rId67"/>
+                        </a:ext>
+                      </a:extLst>
+                    </a:blip>
+                    <a:stretch>
+                      <a:fillRect/>
+                    </a:stretch>
+                  </pic:blipFill>
+                  <pic:spPr bwMode="auto">
+                    <a:xfrm>
+                      <a:off x="0" y="0"/>
+                      <a:ext cx="114300" cy="114300"/>
+                    </a:xfrm>
+                    <a:prstGeom prst="rect">
+                      <a:avLst/>
+                    </a:prstGeom>
+                    <a:noFill/>
+                    <a:ln w="9525">
+                      <a:noFill/>
+                      <a:headEnd/>
+                      <a:tailEnd/>
+                    </a:ln>
+                  </pic:spPr>
+                </pic:pic>
+              </a:graphicData>
+            </a:graphic>
+          </wp:inline>
+        </w:drawing>
+      </w:r>
     </w:p>
     <w:p>
       <w:pPr>
@@ -1066,20 +1636,68 @@
           <w:numId w:val="1000"/>
         </w:numPr>
       </w:pPr>
-      <w:r>
-        <w:t xml:space="preserve">→</w:t>
-      </w:r>
-      <w:r>
-        <w:t xml:space="preserve"> </w:t>
-      </w:r>
-      <w:hyperlink r:id="rId77">
+      <w:hyperlink r:id="rId111">
         <w:r>
           <w:rPr>
             <w:rStyle w:val="Hyperlink"/>
           </w:rPr>
-          <w:t xml:space="preserve">Graf 3a. Průměrné platy zaměstnanců státu dle rozp. kapitoly (2025)</w:t>
+          <w:t xml:space="preserve">Graf 3a</w:t>
         </w:r>
       </w:hyperlink>
+      <w:r>
+        <w:t xml:space="preserve"> </w:t>
+      </w:r>
+      <w:r>
+        <w:drawing>
+          <wp:inline>
+            <wp:extent cx="114300" cy="114300"/>
+            <wp:effectExtent b="0" l="0" r="0" t="0"/>
+            <wp:docPr descr="" title="" id="115" name="Picture"/>
+            <a:graphic>
+              <a:graphicData uri="http://schemas.openxmlformats.org/drawingml/2006/picture">
+                <pic:pic>
+                  <pic:nvPicPr>
+                    <pic:cNvPr descr="report-files/sipka.svg" id="116" name="Picture"/>
+                    <pic:cNvPicPr>
+                      <a:picLocks noChangeArrowheads="1" noChangeAspect="1"/>
+                    </pic:cNvPicPr>
+                  </pic:nvPicPr>
+                  <pic:blipFill>
+                    <a:blip r:embed="rId117">
+                      <a:extLst>
+                        <a:ext uri="{28A0092B-C50C-407E-A947-70E740481C1C}">
+                          <a14:useLocalDpi xmlns:a14="http://schemas.microsoft.com/office/drawing/2010/main" val="0"/>
+                        </a:ext>
+                        <a:ext uri="{96DAC541-7B7A-43D3-8B79-37D633B846F1}">
+                          <asvg:svgBlip xmlns:asvg="http://schemas.microsoft.com/office/drawing/2016/SVG/main" r:embed="rId67"/>
+                        </a:ext>
+                      </a:extLst>
+                    </a:blip>
+                    <a:stretch>
+                      <a:fillRect/>
+                    </a:stretch>
+                  </pic:blipFill>
+                  <pic:spPr bwMode="auto">
+                    <a:xfrm>
+                      <a:off x="0" y="0"/>
+                      <a:ext cx="114300" cy="114300"/>
+                    </a:xfrm>
+                    <a:prstGeom prst="rect">
+                      <a:avLst/>
+                    </a:prstGeom>
+                    <a:noFill/>
+                    <a:ln w="9525">
+                      <a:noFill/>
+                      <a:headEnd/>
+                      <a:tailEnd/>
+                    </a:ln>
+                  </pic:spPr>
+                </pic:pic>
+              </a:graphicData>
+            </a:graphic>
+          </wp:inline>
+        </w:drawing>
+      </w:r>
     </w:p>
     <w:p>
       <w:pPr>
@@ -1122,23 +1740,71 @@
           <w:numId w:val="1000"/>
         </w:numPr>
       </w:pPr>
-      <w:r>
-        <w:t xml:space="preserve">→</w:t>
-      </w:r>
-      <w:r>
-        <w:t xml:space="preserve"> </w:t>
-      </w:r>
-      <w:hyperlink r:id="rId77">
+      <w:hyperlink r:id="rId111">
         <w:r>
           <w:rPr>
             <w:rStyle w:val="Hyperlink"/>
           </w:rPr>
-          <w:t xml:space="preserve">Graf 3a. Průměrné platy zaměstnanců státu dle rozp. kapitoly (2025)</w:t>
+          <w:t xml:space="preserve">Graf 3a</w:t>
         </w:r>
       </w:hyperlink>
+      <w:r>
+        <w:t xml:space="preserve"> </w:t>
+      </w:r>
+      <w:r>
+        <w:drawing>
+          <wp:inline>
+            <wp:extent cx="114300" cy="114300"/>
+            <wp:effectExtent b="0" l="0" r="0" t="0"/>
+            <wp:docPr descr="" title="" id="118" name="Picture"/>
+            <a:graphic>
+              <a:graphicData uri="http://schemas.openxmlformats.org/drawingml/2006/picture">
+                <pic:pic>
+                  <pic:nvPicPr>
+                    <pic:cNvPr descr="report-files/sipka.svg" id="119" name="Picture"/>
+                    <pic:cNvPicPr>
+                      <a:picLocks noChangeArrowheads="1" noChangeAspect="1"/>
+                    </pic:cNvPicPr>
+                  </pic:nvPicPr>
+                  <pic:blipFill>
+                    <a:blip r:embed="rId120">
+                      <a:extLst>
+                        <a:ext uri="{28A0092B-C50C-407E-A947-70E740481C1C}">
+                          <a14:useLocalDpi xmlns:a14="http://schemas.microsoft.com/office/drawing/2010/main" val="0"/>
+                        </a:ext>
+                        <a:ext uri="{96DAC541-7B7A-43D3-8B79-37D633B846F1}">
+                          <asvg:svgBlip xmlns:asvg="http://schemas.microsoft.com/office/drawing/2016/SVG/main" r:embed="rId67"/>
+                        </a:ext>
+                      </a:extLst>
+                    </a:blip>
+                    <a:stretch>
+                      <a:fillRect/>
+                    </a:stretch>
+                  </pic:blipFill>
+                  <pic:spPr bwMode="auto">
+                    <a:xfrm>
+                      <a:off x="0" y="0"/>
+                      <a:ext cx="114300" cy="114300"/>
+                    </a:xfrm>
+                    <a:prstGeom prst="rect">
+                      <a:avLst/>
+                    </a:prstGeom>
+                    <a:noFill/>
+                    <a:ln w="9525">
+                      <a:noFill/>
+                      <a:headEnd/>
+                      <a:tailEnd/>
+                    </a:ln>
+                  </pic:spPr>
+                </pic:pic>
+              </a:graphicData>
+            </a:graphic>
+          </wp:inline>
+        </w:drawing>
+      </w:r>
     </w:p>
-    <w:bookmarkEnd w:id="78"/>
-    <w:bookmarkStart w:id="81" w:name="výdaje-na-platy-zaměstnanců-státu"/>
+    <w:bookmarkEnd w:id="121"/>
+    <w:bookmarkStart w:id="136" w:name="výdaje-na-platy-zaměstnanců-státu"/>
     <w:p>
       <w:pPr>
         <w:pStyle w:val="Heading2"/>
@@ -1182,20 +1848,68 @@
           <w:numId w:val="1000"/>
         </w:numPr>
       </w:pPr>
-      <w:r>
-        <w:t xml:space="preserve">→</w:t>
-      </w:r>
-      <w:r>
-        <w:t xml:space="preserve"> </w:t>
-      </w:r>
-      <w:hyperlink r:id="rId79">
+      <w:hyperlink r:id="rId122">
         <w:r>
           <w:rPr>
             <w:rStyle w:val="Hyperlink"/>
           </w:rPr>
-          <w:t xml:space="preserve">Graf 1b. Výdaje na platy zaměstnanců státu dle regulace zaměstnanosti</w:t>
+          <w:t xml:space="preserve">Graf 1b</w:t>
         </w:r>
       </w:hyperlink>
+      <w:r>
+        <w:t xml:space="preserve"> </w:t>
+      </w:r>
+      <w:r>
+        <w:drawing>
+          <wp:inline>
+            <wp:extent cx="114300" cy="114300"/>
+            <wp:effectExtent b="0" l="0" r="0" t="0"/>
+            <wp:docPr descr="" title="" id="123" name="Picture"/>
+            <a:graphic>
+              <a:graphicData uri="http://schemas.openxmlformats.org/drawingml/2006/picture">
+                <pic:pic>
+                  <pic:nvPicPr>
+                    <pic:cNvPr descr="report-files/sipka.svg" id="124" name="Picture"/>
+                    <pic:cNvPicPr>
+                      <a:picLocks noChangeArrowheads="1" noChangeAspect="1"/>
+                    </pic:cNvPicPr>
+                  </pic:nvPicPr>
+                  <pic:blipFill>
+                    <a:blip r:embed="rId125">
+                      <a:extLst>
+                        <a:ext uri="{28A0092B-C50C-407E-A947-70E740481C1C}">
+                          <a14:useLocalDpi xmlns:a14="http://schemas.microsoft.com/office/drawing/2010/main" val="0"/>
+                        </a:ext>
+                        <a:ext uri="{96DAC541-7B7A-43D3-8B79-37D633B846F1}">
+                          <asvg:svgBlip xmlns:asvg="http://schemas.microsoft.com/office/drawing/2016/SVG/main" r:embed="rId67"/>
+                        </a:ext>
+                      </a:extLst>
+                    </a:blip>
+                    <a:stretch>
+                      <a:fillRect/>
+                    </a:stretch>
+                  </pic:blipFill>
+                  <pic:spPr bwMode="auto">
+                    <a:xfrm>
+                      <a:off x="0" y="0"/>
+                      <a:ext cx="114300" cy="114300"/>
+                    </a:xfrm>
+                    <a:prstGeom prst="rect">
+                      <a:avLst/>
+                    </a:prstGeom>
+                    <a:noFill/>
+                    <a:ln w="9525">
+                      <a:noFill/>
+                      <a:headEnd/>
+                      <a:tailEnd/>
+                    </a:ln>
+                  </pic:spPr>
+                </pic:pic>
+              </a:graphicData>
+            </a:graphic>
+          </wp:inline>
+        </w:drawing>
+      </w:r>
     </w:p>
     <w:p>
       <w:pPr>
@@ -1232,20 +1946,68 @@
           <w:numId w:val="1000"/>
         </w:numPr>
       </w:pPr>
-      <w:r>
-        <w:t xml:space="preserve">→</w:t>
-      </w:r>
-      <w:r>
-        <w:t xml:space="preserve"> </w:t>
-      </w:r>
-      <w:hyperlink r:id="rId79">
+      <w:hyperlink r:id="rId122">
         <w:r>
           <w:rPr>
             <w:rStyle w:val="Hyperlink"/>
           </w:rPr>
-          <w:t xml:space="preserve">Graf 1b. Výdaje na platy zaměstnanců státu dle regulace zaměstnanosti</w:t>
+          <w:t xml:space="preserve">Graf 1b</w:t>
         </w:r>
       </w:hyperlink>
+      <w:r>
+        <w:t xml:space="preserve"> </w:t>
+      </w:r>
+      <w:r>
+        <w:drawing>
+          <wp:inline>
+            <wp:extent cx="114300" cy="114300"/>
+            <wp:effectExtent b="0" l="0" r="0" t="0"/>
+            <wp:docPr descr="" title="" id="126" name="Picture"/>
+            <a:graphic>
+              <a:graphicData uri="http://schemas.openxmlformats.org/drawingml/2006/picture">
+                <pic:pic>
+                  <pic:nvPicPr>
+                    <pic:cNvPr descr="report-files/sipka.svg" id="127" name="Picture"/>
+                    <pic:cNvPicPr>
+                      <a:picLocks noChangeArrowheads="1" noChangeAspect="1"/>
+                    </pic:cNvPicPr>
+                  </pic:nvPicPr>
+                  <pic:blipFill>
+                    <a:blip r:embed="rId128">
+                      <a:extLst>
+                        <a:ext uri="{28A0092B-C50C-407E-A947-70E740481C1C}">
+                          <a14:useLocalDpi xmlns:a14="http://schemas.microsoft.com/office/drawing/2010/main" val="0"/>
+                        </a:ext>
+                        <a:ext uri="{96DAC541-7B7A-43D3-8B79-37D633B846F1}">
+                          <asvg:svgBlip xmlns:asvg="http://schemas.microsoft.com/office/drawing/2016/SVG/main" r:embed="rId67"/>
+                        </a:ext>
+                      </a:extLst>
+                    </a:blip>
+                    <a:stretch>
+                      <a:fillRect/>
+                    </a:stretch>
+                  </pic:blipFill>
+                  <pic:spPr bwMode="auto">
+                    <a:xfrm>
+                      <a:off x="0" y="0"/>
+                      <a:ext cx="114300" cy="114300"/>
+                    </a:xfrm>
+                    <a:prstGeom prst="rect">
+                      <a:avLst/>
+                    </a:prstGeom>
+                    <a:noFill/>
+                    <a:ln w="9525">
+                      <a:noFill/>
+                      <a:headEnd/>
+                      <a:tailEnd/>
+                    </a:ln>
+                  </pic:spPr>
+                </pic:pic>
+              </a:graphicData>
+            </a:graphic>
+          </wp:inline>
+        </w:drawing>
+      </w:r>
     </w:p>
     <w:p>
       <w:pPr>
@@ -1294,20 +2056,68 @@
           <w:numId w:val="1000"/>
         </w:numPr>
       </w:pPr>
-      <w:r>
-        <w:t xml:space="preserve">→</w:t>
-      </w:r>
-      <w:r>
-        <w:t xml:space="preserve"> </w:t>
-      </w:r>
-      <w:hyperlink r:id="rId80">
+      <w:hyperlink r:id="rId129">
         <w:r>
           <w:rPr>
             <w:rStyle w:val="Hyperlink"/>
           </w:rPr>
-          <w:t xml:space="preserve">Graf 4c. Výdaje na platy státních úředníků</w:t>
+          <w:t xml:space="preserve">Graf 4c</w:t>
         </w:r>
       </w:hyperlink>
+      <w:r>
+        <w:t xml:space="preserve"> </w:t>
+      </w:r>
+      <w:r>
+        <w:drawing>
+          <wp:inline>
+            <wp:extent cx="114300" cy="114300"/>
+            <wp:effectExtent b="0" l="0" r="0" t="0"/>
+            <wp:docPr descr="" title="" id="130" name="Picture"/>
+            <a:graphic>
+              <a:graphicData uri="http://schemas.openxmlformats.org/drawingml/2006/picture">
+                <pic:pic>
+                  <pic:nvPicPr>
+                    <pic:cNvPr descr="report-files/sipka.svg" id="131" name="Picture"/>
+                    <pic:cNvPicPr>
+                      <a:picLocks noChangeArrowheads="1" noChangeAspect="1"/>
+                    </pic:cNvPicPr>
+                  </pic:nvPicPr>
+                  <pic:blipFill>
+                    <a:blip r:embed="rId132">
+                      <a:extLst>
+                        <a:ext uri="{28A0092B-C50C-407E-A947-70E740481C1C}">
+                          <a14:useLocalDpi xmlns:a14="http://schemas.microsoft.com/office/drawing/2010/main" val="0"/>
+                        </a:ext>
+                        <a:ext uri="{96DAC541-7B7A-43D3-8B79-37D633B846F1}">
+                          <asvg:svgBlip xmlns:asvg="http://schemas.microsoft.com/office/drawing/2016/SVG/main" r:embed="rId67"/>
+                        </a:ext>
+                      </a:extLst>
+                    </a:blip>
+                    <a:stretch>
+                      <a:fillRect/>
+                    </a:stretch>
+                  </pic:blipFill>
+                  <pic:spPr bwMode="auto">
+                    <a:xfrm>
+                      <a:off x="0" y="0"/>
+                      <a:ext cx="114300" cy="114300"/>
+                    </a:xfrm>
+                    <a:prstGeom prst="rect">
+                      <a:avLst/>
+                    </a:prstGeom>
+                    <a:noFill/>
+                    <a:ln w="9525">
+                      <a:noFill/>
+                      <a:headEnd/>
+                      <a:tailEnd/>
+                    </a:ln>
+                  </pic:spPr>
+                </pic:pic>
+              </a:graphicData>
+            </a:graphic>
+          </wp:inline>
+        </w:drawing>
+      </w:r>
     </w:p>
     <w:p>
       <w:pPr>
@@ -1356,23 +2166,71 @@
           <w:numId w:val="1000"/>
         </w:numPr>
       </w:pPr>
-      <w:r>
-        <w:t xml:space="preserve">→</w:t>
-      </w:r>
-      <w:r>
-        <w:t xml:space="preserve"> </w:t>
-      </w:r>
-      <w:hyperlink r:id="rId74">
+      <w:hyperlink r:id="rId99">
         <w:r>
           <w:rPr>
             <w:rStyle w:val="Hyperlink"/>
           </w:rPr>
-          <w:t xml:space="preserve">Graf 5a. Reálné průměrné platy státních úředníků 2004–2025</w:t>
+          <w:t xml:space="preserve">Graf 5a</w:t>
         </w:r>
       </w:hyperlink>
+      <w:r>
+        <w:t xml:space="preserve"> </w:t>
+      </w:r>
+      <w:r>
+        <w:drawing>
+          <wp:inline>
+            <wp:extent cx="114300" cy="114300"/>
+            <wp:effectExtent b="0" l="0" r="0" t="0"/>
+            <wp:docPr descr="" title="" id="133" name="Picture"/>
+            <a:graphic>
+              <a:graphicData uri="http://schemas.openxmlformats.org/drawingml/2006/picture">
+                <pic:pic>
+                  <pic:nvPicPr>
+                    <pic:cNvPr descr="report-files/sipka.svg" id="134" name="Picture"/>
+                    <pic:cNvPicPr>
+                      <a:picLocks noChangeArrowheads="1" noChangeAspect="1"/>
+                    </pic:cNvPicPr>
+                  </pic:nvPicPr>
+                  <pic:blipFill>
+                    <a:blip r:embed="rId135">
+                      <a:extLst>
+                        <a:ext uri="{28A0092B-C50C-407E-A947-70E740481C1C}">
+                          <a14:useLocalDpi xmlns:a14="http://schemas.microsoft.com/office/drawing/2010/main" val="0"/>
+                        </a:ext>
+                        <a:ext uri="{96DAC541-7B7A-43D3-8B79-37D633B846F1}">
+                          <asvg:svgBlip xmlns:asvg="http://schemas.microsoft.com/office/drawing/2016/SVG/main" r:embed="rId67"/>
+                        </a:ext>
+                      </a:extLst>
+                    </a:blip>
+                    <a:stretch>
+                      <a:fillRect/>
+                    </a:stretch>
+                  </pic:blipFill>
+                  <pic:spPr bwMode="auto">
+                    <a:xfrm>
+                      <a:off x="0" y="0"/>
+                      <a:ext cx="114300" cy="114300"/>
+                    </a:xfrm>
+                    <a:prstGeom prst="rect">
+                      <a:avLst/>
+                    </a:prstGeom>
+                    <a:noFill/>
+                    <a:ln w="9525">
+                      <a:noFill/>
+                      <a:headEnd/>
+                      <a:tailEnd/>
+                    </a:ln>
+                  </pic:spPr>
+                </pic:pic>
+              </a:graphicData>
+            </a:graphic>
+          </wp:inline>
+        </w:drawing>
+      </w:r>
     </w:p>
-    <w:bookmarkEnd w:id="81"/>
-    <w:bookmarkEnd w:id="82"/>
+    <w:bookmarkEnd w:id="136"/>
+    <w:bookmarkEnd w:id="137"/>
     <w:sectPr>
       <w:headerReference r:id="rId46" w:type="default"/>
       <w:footerReference r:id="rId47" w:type="default"/>

</xml_diff>

<commit_message>
graf 10 link in shrnuti
</commit_message>
<xml_diff>
--- a/word-docs/urednici-shrnuti_2026.docx
+++ b/word-docs/urednici-shrnuti_2026.docx
@@ -145,7 +145,7 @@
         <w:t xml:space="preserve"> </w:t>
       </w:r>
     </w:p>
-    <w:bookmarkStart w:id="137" w:name="shrnutí-klíčových-poznatků"/>
+    <w:bookmarkStart w:id="140" w:name="shrnutí-klíčových-poznatků"/>
     <w:p>
       <w:pPr>
         <w:pStyle w:val="Heading1"/>
@@ -451,7 +451,7 @@
       </w:r>
     </w:p>
     <w:bookmarkEnd w:id="75"/>
-    <w:bookmarkStart w:id="98" w:name="počty-zaměstnanců-státu"/>
+    <w:bookmarkStart w:id="101" w:name="počty-zaměstnanců-státu"/>
     <w:p>
       <w:pPr>
         <w:pStyle w:val="Heading2"/>
@@ -636,60 +636,7 @@
           <w:rPr>
             <w:rStyle w:val="Hyperlink"/>
           </w:rPr>
-          <w:t xml:space="preserve">Graf 10. Změny počtu zaměstnanců ve sféře rozpočtové regulace, podle kategorií</w:t>
-        </w:r>
-      </w:hyperlink>
-    </w:p>
-    <w:p>
-      <w:pPr>
-        <w:numPr>
-          <w:ilvl w:val="0"/>
-          <w:numId w:val="1003"/>
-        </w:numPr>
-      </w:pPr>
-      <w:r>
-        <w:rPr>
-          <w:b/>
-          <w:bCs/>
-        </w:rPr>
-        <w:t xml:space="preserve">Státních úředníků je mezi zaměstnanci státu cca 75 tisíc (15 % zaměstnanců státu)</w:t>
-      </w:r>
-      <w:r>
-        <w:t xml:space="preserve">.</w:t>
-      </w:r>
-      <w:r>
-        <w:t xml:space="preserve"> </w:t>
-      </w:r>
-      <w:r>
-        <w:t xml:space="preserve">Většina z nich pracuje v ‚Neústřední státní správě’, tj. v organizacích, jako jsou finanční úřady či správa sociálního zabezpečení, úřady práce, tedy často na pobočkách mimo Prahu.</w:t>
-      </w:r>
-      <w:r>
-        <w:t xml:space="preserve"> </w:t>
-      </w:r>
-      <w:r>
-        <w:t xml:space="preserve">Na ministerstvech pak pracuje necelých 23 tis. osob, představují necelých 5 % zaměstnanců státu a necelého půl procenta pracovní síly v ekonomice (toto číslo zahrnuje i příslušníky a zaměstnance bezpečnostních sborů evidované na Ministerstvu vnitra (MV ČR), které nelze v těchto datech odlišit).</w:t>
-      </w:r>
-      <w:r>
-        <w:t xml:space="preserve"> </w:t>
-      </w:r>
-      <w:r>
-        <w:t xml:space="preserve">Státních úředníků je tedy mnohem méně, než jaké jsou laické představy a případná očekávání ohledně rozsahu možných úspor v této oblasti.</w:t>
-      </w:r>
-    </w:p>
-    <w:p>
-      <w:pPr>
-        <w:pStyle w:val="nospacepara"/>
-        <w:numPr>
-          <w:ilvl w:val="0"/>
-          <w:numId w:val="1000"/>
-        </w:numPr>
-      </w:pPr>
-      <w:hyperlink r:id="rId66">
-        <w:r>
-          <w:rPr>
-            <w:rStyle w:val="Hyperlink"/>
-          </w:rPr>
-          <w:t xml:space="preserve">Graf 1a</w:t>
+          <w:t xml:space="preserve">Graf 10</w:t>
         </w:r>
       </w:hyperlink>
       <w:r>
@@ -749,18 +696,54 @@
     </w:p>
     <w:p>
       <w:pPr>
+        <w:numPr>
+          <w:ilvl w:val="0"/>
+          <w:numId w:val="1003"/>
+        </w:numPr>
+      </w:pPr>
+      <w:r>
+        <w:rPr>
+          <w:b/>
+          <w:bCs/>
+        </w:rPr>
+        <w:t xml:space="preserve">Státních úředníků je mezi zaměstnanci státu cca 75 tisíc (15 % zaměstnanců státu)</w:t>
+      </w:r>
+      <w:r>
+        <w:t xml:space="preserve">.</w:t>
+      </w:r>
+      <w:r>
+        <w:t xml:space="preserve"> </w:t>
+      </w:r>
+      <w:r>
+        <w:t xml:space="preserve">Většina z nich pracuje v ‚Neústřední státní správě’, tj. v organizacích, jako jsou finanční úřady či správa sociálního zabezpečení, úřady práce, tedy často na pobočkách mimo Prahu.</w:t>
+      </w:r>
+      <w:r>
+        <w:t xml:space="preserve"> </w:t>
+      </w:r>
+      <w:r>
+        <w:t xml:space="preserve">Na ministerstvech pak pracuje necelých 23 tis. osob, představují necelých 5 % zaměstnanců státu a necelého půl procenta pracovní síly v ekonomice (toto číslo zahrnuje i příslušníky a zaměstnance bezpečnostních sborů evidované na Ministerstvu vnitra (MV ČR), které nelze v těchto datech odlišit).</w:t>
+      </w:r>
+      <w:r>
+        <w:t xml:space="preserve"> </w:t>
+      </w:r>
+      <w:r>
+        <w:t xml:space="preserve">Státních úředníků je tedy mnohem méně, než jaké jsou laické představy a případná očekávání ohledně rozsahu možných úspor v této oblasti.</w:t>
+      </w:r>
+    </w:p>
+    <w:p>
+      <w:pPr>
         <w:pStyle w:val="nospacepara"/>
         <w:numPr>
           <w:ilvl w:val="0"/>
           <w:numId w:val="1000"/>
         </w:numPr>
       </w:pPr>
-      <w:hyperlink r:id="rId83">
+      <w:hyperlink r:id="rId66">
         <w:r>
           <w:rPr>
             <w:rStyle w:val="Hyperlink"/>
           </w:rPr>
-          <w:t xml:space="preserve">Graf 4a</w:t>
+          <w:t xml:space="preserve">Graf 1a</w:t>
         </w:r>
       </w:hyperlink>
       <w:r>
@@ -771,18 +754,18 @@
           <wp:inline>
             <wp:extent cx="114300" cy="114300"/>
             <wp:effectExtent b="0" l="0" r="0" t="0"/>
-            <wp:docPr descr="" title="" id="84" name="Picture"/>
+            <wp:docPr descr="" title="" id="83" name="Picture"/>
             <a:graphic>
               <a:graphicData uri="http://schemas.openxmlformats.org/drawingml/2006/picture">
                 <pic:pic>
                   <pic:nvPicPr>
-                    <pic:cNvPr descr="report-files/sipka.svg" id="85" name="Picture"/>
+                    <pic:cNvPr descr="report-files/sipka.svg" id="84" name="Picture"/>
                     <pic:cNvPicPr>
                       <a:picLocks noChangeArrowheads="1" noChangeAspect="1"/>
                     </pic:cNvPicPr>
                   </pic:nvPicPr>
                   <pic:blipFill>
-                    <a:blip r:embed="rId86">
+                    <a:blip r:embed="rId85">
                       <a:extLst>
                         <a:ext uri="{28A0092B-C50C-407E-A947-70E740481C1C}">
                           <a14:useLocalDpi xmlns:a14="http://schemas.microsoft.com/office/drawing/2010/main" val="0"/>
@@ -826,12 +809,12 @@
           <w:numId w:val="1000"/>
         </w:numPr>
       </w:pPr>
-      <w:hyperlink r:id="rId87">
+      <w:hyperlink r:id="rId86">
         <w:r>
           <w:rPr>
             <w:rStyle w:val="Hyperlink"/>
           </w:rPr>
-          <w:t xml:space="preserve">Graf 4b</w:t>
+          <w:t xml:space="preserve">Graf 4a</w:t>
         </w:r>
       </w:hyperlink>
       <w:r>
@@ -842,18 +825,18 @@
           <wp:inline>
             <wp:extent cx="114300" cy="114300"/>
             <wp:effectExtent b="0" l="0" r="0" t="0"/>
-            <wp:docPr descr="" title="" id="88" name="Picture"/>
+            <wp:docPr descr="" title="" id="87" name="Picture"/>
             <a:graphic>
               <a:graphicData uri="http://schemas.openxmlformats.org/drawingml/2006/picture">
                 <pic:pic>
                   <pic:nvPicPr>
-                    <pic:cNvPr descr="report-files/sipka.svg" id="89" name="Picture"/>
+                    <pic:cNvPr descr="report-files/sipka.svg" id="88" name="Picture"/>
                     <pic:cNvPicPr>
                       <a:picLocks noChangeArrowheads="1" noChangeAspect="1"/>
                     </pic:cNvPicPr>
                   </pic:nvPicPr>
                   <pic:blipFill>
-                    <a:blip r:embed="rId90">
+                    <a:blip r:embed="rId89">
                       <a:extLst>
                         <a:ext uri="{28A0092B-C50C-407E-A947-70E740481C1C}">
                           <a14:useLocalDpi xmlns:a14="http://schemas.microsoft.com/office/drawing/2010/main" val="0"/>
@@ -891,64 +874,13 @@
     </w:p>
     <w:p>
       <w:pPr>
-        <w:numPr>
-          <w:ilvl w:val="0"/>
-          <w:numId w:val="1003"/>
-        </w:numPr>
-      </w:pPr>
-      <w:r>
-        <w:rPr>
-          <w:b/>
-          <w:bCs/>
-        </w:rPr>
-        <w:t xml:space="preserve">Počty státních úředníků</w:t>
-      </w:r>
-      <w:r>
-        <w:t xml:space="preserve"> </w:t>
-      </w:r>
-      <w:r>
-        <w:t xml:space="preserve">se poslední dvě dekády pohybovaly v rozmezí 71 tis. (rok 2012) a 79 tis. (rok 2019).</w:t>
-      </w:r>
-      <w:r>
-        <w:t xml:space="preserve"> </w:t>
-      </w:r>
-      <w:r>
-        <w:t xml:space="preserve">Do dlouhodobých trendů se promítly snahy o konsolidaci veřejných rozpočtů po roce 2010 a po roce 2021.</w:t>
-      </w:r>
-      <w:r>
-        <w:t xml:space="preserve"> </w:t>
-      </w:r>
-      <w:r>
-        <w:t xml:space="preserve">Za mírným poklesem počtu státních úředníků po roce 2021 o zhruba 3 000 stály hlavně poklesy v sektoru ‚Neústřední státní správy’, která zahrnuje organizace podřízené ministerstvům jako např.</w:t>
-      </w:r>
-      <w:r>
-        <w:t xml:space="preserve"> </w:t>
-      </w:r>
-      <w:r>
-        <w:t xml:space="preserve">finanční správa nebo úřady práce.</w:t>
-      </w:r>
-      <w:r>
-        <w:t xml:space="preserve"> </w:t>
-      </w:r>
-      <w:r>
-        <w:t xml:space="preserve">‚Neústřední státní správa’ zaměstnává většinu státních úředníků (63 %).</w:t>
-      </w:r>
-      <w:r>
-        <w:t xml:space="preserve"> </w:t>
-      </w:r>
-      <w:r>
-        <w:t xml:space="preserve">Naopak počet státních úředníků přímo na ministerstvech po roce 2021 mírně narostl z 22 729 na 23 130 v roce 2025 (toto číslo zahrnuje i příslušníky a zaměstnance bezpečnostních sborů evidované pod IČO Ministerstva vnitra, které nelze v těchto datech odlišit).</w:t>
-      </w:r>
-    </w:p>
-    <w:p>
-      <w:pPr>
         <w:pStyle w:val="nospacepara"/>
         <w:numPr>
           <w:ilvl w:val="0"/>
           <w:numId w:val="1000"/>
         </w:numPr>
       </w:pPr>
-      <w:hyperlink r:id="rId87">
+      <w:hyperlink r:id="rId90">
         <w:r>
           <w:rPr>
             <w:rStyle w:val="Hyperlink"/>
@@ -1023,22 +955,43 @@
           <w:b/>
           <w:bCs/>
         </w:rPr>
-        <w:t xml:space="preserve">Veřejný sektor, uváděný v některých statistikách ČSÚ</w:t>
-      </w:r>
-      <w:r>
-        <w:t xml:space="preserve">, představuje širší skupinu než jsou zaměstnanci státu, a navíc zahrnuje např. instituce veřejného zdravotnictví, veřejných vysokých škol a státní firmy.</w:t>
+        <w:t xml:space="preserve">Počty státních úředníků</w:t>
       </w:r>
       <w:r>
         <w:t xml:space="preserve"> </w:t>
       </w:r>
       <w:r>
-        <w:t xml:space="preserve">Zaměstnanost v takto definovaném sektoru dlouhodobě představuje zhruba 1 milion osob, tedy necelou pětinu pracovní síly v české ekonomice. Tento počet dlouhodobě mírně roste; v roce 2025 narostl o 14 tisíc (1,6 %) a za zhruba dvěma třetinami tohoto nárůstu stojí samosprávy, kde jsou započteny i nárůsty počtu zaměstnanců v regionálním školství.</w:t>
+        <w:t xml:space="preserve">se poslední dvě dekády pohybovaly v rozmezí 71 tis. (rok 2012) a 79 tis. (rok 2019).</w:t>
       </w:r>
       <w:r>
         <w:t xml:space="preserve"> </w:t>
       </w:r>
       <w:r>
-        <w:t xml:space="preserve">K nárůstu v ústředním státu přispívá i mírný setrvalý růst počtu vojáků.</w:t>
+        <w:t xml:space="preserve">Do dlouhodobých trendů se promítly snahy o konsolidaci veřejných rozpočtů po roce 2010 a po roce 2021.</w:t>
+      </w:r>
+      <w:r>
+        <w:t xml:space="preserve"> </w:t>
+      </w:r>
+      <w:r>
+        <w:t xml:space="preserve">Za mírným poklesem počtu státních úředníků po roce 2021 o zhruba 3 000 stály hlavně poklesy v sektoru ‚Neústřední státní správy’, která zahrnuje organizace podřízené ministerstvům jako např.</w:t>
+      </w:r>
+      <w:r>
+        <w:t xml:space="preserve"> </w:t>
+      </w:r>
+      <w:r>
+        <w:t xml:space="preserve">finanční správa nebo úřady práce.</w:t>
+      </w:r>
+      <w:r>
+        <w:t xml:space="preserve"> </w:t>
+      </w:r>
+      <w:r>
+        <w:t xml:space="preserve">‚Neústřední státní správa’ zaměstnává většinu státních úředníků (63 %).</w:t>
+      </w:r>
+      <w:r>
+        <w:t xml:space="preserve"> </w:t>
+      </w:r>
+      <w:r>
+        <w:t xml:space="preserve">Naopak počet státních úředníků přímo na ministerstvech po roce 2021 mírně narostl z 22 729 na 23 130 v roce 2025 (toto číslo zahrnuje i příslušníky a zaměstnance bezpečnostních sborů evidované pod IČO Ministerstva vnitra, které nelze v těchto datech odlišit).</w:t>
       </w:r>
     </w:p>
     <w:p>
@@ -1049,12 +1002,12 @@
           <w:numId w:val="1000"/>
         </w:numPr>
       </w:pPr>
-      <w:hyperlink r:id="rId94">
+      <w:hyperlink r:id="rId90">
         <w:r>
           <w:rPr>
             <w:rStyle w:val="Hyperlink"/>
           </w:rPr>
-          <w:t xml:space="preserve">Graf 9a</w:t>
+          <w:t xml:space="preserve">Graf 4b</w:t>
         </w:r>
       </w:hyperlink>
       <w:r>
@@ -1065,18 +1018,18 @@
           <wp:inline>
             <wp:extent cx="114300" cy="114300"/>
             <wp:effectExtent b="0" l="0" r="0" t="0"/>
-            <wp:docPr descr="" title="" id="95" name="Picture"/>
+            <wp:docPr descr="" title="" id="94" name="Picture"/>
             <a:graphic>
               <a:graphicData uri="http://schemas.openxmlformats.org/drawingml/2006/picture">
                 <pic:pic>
                   <pic:nvPicPr>
-                    <pic:cNvPr descr="report-files/sipka.svg" id="96" name="Picture"/>
+                    <pic:cNvPr descr="report-files/sipka.svg" id="95" name="Picture"/>
                     <pic:cNvPicPr>
                       <a:picLocks noChangeArrowheads="1" noChangeAspect="1"/>
                     </pic:cNvPicPr>
                   </pic:nvPicPr>
                   <pic:blipFill>
-                    <a:blip r:embed="rId97">
+                    <a:blip r:embed="rId96">
                       <a:extLst>
                         <a:ext uri="{28A0092B-C50C-407E-A947-70E740481C1C}">
                           <a14:useLocalDpi xmlns:a14="http://schemas.microsoft.com/office/drawing/2010/main" val="0"/>
@@ -1112,21 +1065,11 @@
         </w:drawing>
       </w:r>
     </w:p>
-    <w:bookmarkEnd w:id="98"/>
-    <w:bookmarkStart w:id="121" w:name="platy-zaměstnanců-státu"/>
-    <w:p>
-      <w:pPr>
-        <w:pStyle w:val="Heading2"/>
-      </w:pPr>
-      <w:r>
-        <w:t xml:space="preserve">Platy zaměstnanců státu</w:t>
-      </w:r>
-    </w:p>
     <w:p>
       <w:pPr>
         <w:numPr>
           <w:ilvl w:val="0"/>
-          <w:numId w:val="1005"/>
+          <w:numId w:val="1003"/>
         </w:numPr>
       </w:pPr>
       <w:r>
@@ -1134,43 +1077,22 @@
           <w:b/>
           <w:bCs/>
         </w:rPr>
-        <w:t xml:space="preserve">Průměrné reálné platy státních úředníků v roce 2025 poprvé od roku 2020 zaznamenaly nárůst</w:t>
+        <w:t xml:space="preserve">Veřejný sektor, uváděný v některých statistikách ČSÚ</w:t>
+      </w:r>
+      <w:r>
+        <w:t xml:space="preserve">, představuje širší skupinu než jsou zaměstnanci státu, a navíc zahrnuje např. instituce veřejného zdravotnictví, veřejných vysokých škol a státní firmy.</w:t>
       </w:r>
       <w:r>
         <w:t xml:space="preserve"> </w:t>
       </w:r>
       <w:r>
-        <w:t xml:space="preserve">(ministerstva, ostatní ústřední orgány, neústřední úřady).</w:t>
+        <w:t xml:space="preserve">Zaměstnanost v takto definovaném sektoru dlouhodobě představuje zhruba 1 milion osob, tedy necelou pětinu pracovní síly v české ekonomice. Tento počet dlouhodobě mírně roste; v roce 2025 narostl o 14 tisíc (1,6 %) a za zhruba dvěma třetinami tohoto nárůstu stojí samosprávy, kde jsou započteny i nárůsty počtu zaměstnanců v regionálním školství.</w:t>
       </w:r>
       <w:r>
         <w:t xml:space="preserve"> </w:t>
       </w:r>
       <w:r>
-        <w:t xml:space="preserve">Platy na neministerských ústředních orgánech rostly (4,5 %) o něco rychleji než na neústředních úřadech (3,4 %) a ministerstvech (3,2 %).</w:t>
-      </w:r>
-      <w:r>
-        <w:t xml:space="preserve"> </w:t>
-      </w:r>
-      <w:r>
-        <w:t xml:space="preserve">K tomuto relativně rychlejším nárůstu v početně malé skupině zaměstnanců ostatních ústředních orgánů přispěl růst průměrného platu v Digitální a informační agentuře, spojený s nárůstem počtu jejích zaměstnanců.</w:t>
-      </w:r>
-      <w:r>
-        <w:t xml:space="preserve"> </w:t>
-      </w:r>
-      <w:r>
-        <w:t xml:space="preserve">Průměrné platy státních úředníků vůči průměrné mzdě v ekonomice ale opět poklesly– byť mírněji než v minulých letech – protože průměrná mzda v celé ekonomice rostla opět rychleji.</w:t>
-      </w:r>
-      <w:r>
-        <w:t xml:space="preserve"> </w:t>
-      </w:r>
-      <w:r>
-        <w:t xml:space="preserve">Nejvíce se propadly relativní mzdy na ministerstvech. Naopak se mírně zvýšily v ústředních orgánech, které je třeba srovnávat s platy v Praze.</w:t>
-      </w:r>
-      <w:r>
-        <w:t xml:space="preserve"> </w:t>
-      </w:r>
-      <w:r>
-        <w:t xml:space="preserve">Platová úroveň ministerstev a ústředních úřadů nyní dosahuje cca 95 % resp. 87 % pražského průměru, a to i přesto, že v těchto úřadech pracuje vyšší podíl např. vysokoškolsky vzdělaných lidí, než na celém trhu práce v Praze.</w:t>
+        <w:t xml:space="preserve">K nárůstu v ústředním státu přispívá i mírný setrvalý růst počtu vojáků.</w:t>
       </w:r>
     </w:p>
     <w:p>
@@ -1181,12 +1103,12 @@
           <w:numId w:val="1000"/>
         </w:numPr>
       </w:pPr>
-      <w:hyperlink r:id="rId99">
+      <w:hyperlink r:id="rId97">
         <w:r>
           <w:rPr>
             <w:rStyle w:val="Hyperlink"/>
           </w:rPr>
-          <w:t xml:space="preserve">Graf 5a</w:t>
+          <w:t xml:space="preserve">Graf 9a</w:t>
         </w:r>
       </w:hyperlink>
       <w:r>
@@ -1197,18 +1119,18 @@
           <wp:inline>
             <wp:extent cx="114300" cy="114300"/>
             <wp:effectExtent b="0" l="0" r="0" t="0"/>
-            <wp:docPr descr="" title="" id="100" name="Picture"/>
+            <wp:docPr descr="" title="" id="98" name="Picture"/>
             <a:graphic>
               <a:graphicData uri="http://schemas.openxmlformats.org/drawingml/2006/picture">
                 <pic:pic>
                   <pic:nvPicPr>
-                    <pic:cNvPr descr="report-files/sipka.svg" id="101" name="Picture"/>
+                    <pic:cNvPr descr="report-files/sipka.svg" id="99" name="Picture"/>
                     <pic:cNvPicPr>
                       <a:picLocks noChangeArrowheads="1" noChangeAspect="1"/>
                     </pic:cNvPicPr>
                   </pic:nvPicPr>
                   <pic:blipFill>
-                    <a:blip r:embed="rId102">
+                    <a:blip r:embed="rId100">
                       <a:extLst>
                         <a:ext uri="{28A0092B-C50C-407E-A947-70E740481C1C}">
                           <a14:useLocalDpi xmlns:a14="http://schemas.microsoft.com/office/drawing/2010/main" val="0"/>
@@ -1244,6 +1166,16 @@
         </w:drawing>
       </w:r>
     </w:p>
+    <w:bookmarkEnd w:id="101"/>
+    <w:bookmarkStart w:id="124" w:name="platy-zaměstnanců-státu"/>
+    <w:p>
+      <w:pPr>
+        <w:pStyle w:val="Heading2"/>
+      </w:pPr>
+      <w:r>
+        <w:t xml:space="preserve">Platy zaměstnanců státu</w:t>
+      </w:r>
+    </w:p>
     <w:p>
       <w:pPr>
         <w:numPr>
@@ -1256,22 +1188,43 @@
           <w:b/>
           <w:bCs/>
         </w:rPr>
-        <w:t xml:space="preserve">Průměrné relativní platy státních úředníků</w:t>
-      </w:r>
-      <w:r>
-        <w:t xml:space="preserve">, tedy v poměru k průměrným platům v ekonomice, se poslední dvě dekády vyvíjely velmi cyklicky.</w:t>
+        <w:t xml:space="preserve">Průměrné reálné platy státních úředníků v roce 2025 poprvé od roku 2020 zaznamenaly nárůst</w:t>
       </w:r>
       <w:r>
         <w:t xml:space="preserve"> </w:t>
       </w:r>
       <w:r>
-        <w:t xml:space="preserve">Minima dosáhly v letech 2011–2012, maxima kolem roku 2018 a od té doby klesají.</w:t>
+        <w:t xml:space="preserve">(ministerstva, ostatní ústřední orgány, neústřední úřady).</w:t>
       </w:r>
       <w:r>
         <w:t xml:space="preserve"> </w:t>
       </w:r>
       <w:r>
-        <w:t xml:space="preserve">Letošní poklesy relativních platů ústředních úřadů a ministerstev přichází po ještě strmějších propadech v roce 2024 a následují dlouhodobý pokles, který začal v roce 2019.</w:t>
+        <w:t xml:space="preserve">Platy na neministerských ústředních orgánech rostly (4,5 %) o něco rychleji než na neústředních úřadech (3,4 %) a ministerstvech (3,2 %).</w:t>
+      </w:r>
+      <w:r>
+        <w:t xml:space="preserve"> </w:t>
+      </w:r>
+      <w:r>
+        <w:t xml:space="preserve">K tomuto relativně rychlejším nárůstu v početně malé skupině zaměstnanců ostatních ústředních orgánů přispěl růst průměrného platu v Digitální a informační agentuře, spojený s nárůstem počtu jejích zaměstnanců.</w:t>
+      </w:r>
+      <w:r>
+        <w:t xml:space="preserve"> </w:t>
+      </w:r>
+      <w:r>
+        <w:t xml:space="preserve">Průměrné platy státních úředníků vůči průměrné mzdě v ekonomice ale opět poklesly– byť mírněji než v minulých letech – protože průměrná mzda v celé ekonomice rostla opět rychleji.</w:t>
+      </w:r>
+      <w:r>
+        <w:t xml:space="preserve"> </w:t>
+      </w:r>
+      <w:r>
+        <w:t xml:space="preserve">Nejvíce se propadly relativní mzdy na ministerstvech. Naopak se mírně zvýšily v ústředních orgánech, které je třeba srovnávat s platy v Praze.</w:t>
+      </w:r>
+      <w:r>
+        <w:t xml:space="preserve"> </w:t>
+      </w:r>
+      <w:r>
+        <w:t xml:space="preserve">Platová úroveň ministerstev a ústředních úřadů nyní dosahuje cca 95 % resp. 87 % pražského průměru, a to i přesto, že v těchto úřadech pracuje vyšší podíl např. vysokoškolsky vzdělaných lidí, než na celém trhu práce v Praze.</w:t>
       </w:r>
     </w:p>
     <w:p>
@@ -1282,12 +1235,12 @@
           <w:numId w:val="1000"/>
         </w:numPr>
       </w:pPr>
-      <w:hyperlink r:id="rId103">
+      <w:hyperlink r:id="rId102">
         <w:r>
           <w:rPr>
             <w:rStyle w:val="Hyperlink"/>
           </w:rPr>
-          <w:t xml:space="preserve">Graf 5b</w:t>
+          <w:t xml:space="preserve">Graf 5a</w:t>
         </w:r>
       </w:hyperlink>
       <w:r>
@@ -1298,18 +1251,18 @@
           <wp:inline>
             <wp:extent cx="114300" cy="114300"/>
             <wp:effectExtent b="0" l="0" r="0" t="0"/>
-            <wp:docPr descr="" title="" id="104" name="Picture"/>
+            <wp:docPr descr="" title="" id="103" name="Picture"/>
             <a:graphic>
               <a:graphicData uri="http://schemas.openxmlformats.org/drawingml/2006/picture">
                 <pic:pic>
                   <pic:nvPicPr>
-                    <pic:cNvPr descr="report-files/sipka.svg" id="105" name="Picture"/>
+                    <pic:cNvPr descr="report-files/sipka.svg" id="104" name="Picture"/>
                     <pic:cNvPicPr>
                       <a:picLocks noChangeArrowheads="1" noChangeAspect="1"/>
                     </pic:cNvPicPr>
                   </pic:nvPicPr>
                   <pic:blipFill>
-                    <a:blip r:embed="rId106">
+                    <a:blip r:embed="rId105">
                       <a:extLst>
                         <a:ext uri="{28A0092B-C50C-407E-A947-70E740481C1C}">
                           <a14:useLocalDpi xmlns:a14="http://schemas.microsoft.com/office/drawing/2010/main" val="0"/>
@@ -1357,37 +1310,22 @@
           <w:b/>
           <w:bCs/>
         </w:rPr>
-        <w:t xml:space="preserve">Průměrné reálné platy v sektoru státní správy v letech 2015–2018</w:t>
+        <w:t xml:space="preserve">Průměrné relativní platy státních úředníků</w:t>
+      </w:r>
+      <w:r>
+        <w:t xml:space="preserve">, tedy v poměru k průměrným platům v ekonomice, se poslední dvě dekády vyvíjely velmi cyklicky.</w:t>
       </w:r>
       <w:r>
         <w:t xml:space="preserve"> </w:t>
       </w:r>
       <w:r>
-        <w:t xml:space="preserve">svým vývojem převyšovaly růst průměrných reálných mezd v ekonomice.</w:t>
+        <w:t xml:space="preserve">Minima dosáhly v letech 2011–2012, maxima kolem roku 2018 a od té doby klesají.</w:t>
       </w:r>
       <w:r>
         <w:t xml:space="preserve"> </w:t>
       </w:r>
       <w:r>
-        <w:t xml:space="preserve">To přispělo k růstu relativních platů ve státní správě, a tedy i nákladů na tyto platy.</w:t>
-      </w:r>
-      <w:r>
-        <w:t xml:space="preserve"> </w:t>
-      </w:r>
-      <w:r>
-        <w:t xml:space="preserve">V roce 2021 došlo k velkému propadu reálných platů ve státní správě, zatímco reálné mzdy v ekonomice ještě rostly.</w:t>
-      </w:r>
-      <w:r>
-        <w:t xml:space="preserve"> </w:t>
-      </w:r>
-      <w:r>
-        <w:t xml:space="preserve">V letech 2022 a 2023 potom došlo k vysokým a podobným propadům reálných platů i mezd v ekonomice.</w:t>
-      </w:r>
-      <w:r>
-        <w:t xml:space="preserve"> </w:t>
-      </w:r>
-      <w:r>
-        <w:t xml:space="preserve">V roce 2024 státní správa na ekonomiku dále ztrácela, v roce 2025 se tento propad téměř zastavil. Výjimkou jsou bezpečnostní sbory a skupina zahrnující Armádu ČR, kde relativní platy v roce 2025 stouply.</w:t>
+        <w:t xml:space="preserve">Letošní poklesy relativních platů ústředních úřadů a ministerstev přichází po ještě strmějších propadech v roce 2024 a následují dlouhodobý pokles, který začal v roce 2019.</w:t>
       </w:r>
     </w:p>
     <w:p>
@@ -1398,12 +1336,12 @@
           <w:numId w:val="1000"/>
         </w:numPr>
       </w:pPr>
-      <w:hyperlink r:id="rId99">
+      <w:hyperlink r:id="rId106">
         <w:r>
           <w:rPr>
             <w:rStyle w:val="Hyperlink"/>
           </w:rPr>
-          <w:t xml:space="preserve">Graf 5a</w:t>
+          <w:t xml:space="preserve">Graf 5b</w:t>
         </w:r>
       </w:hyperlink>
       <w:r>
@@ -1473,55 +1411,37 @@
           <w:b/>
           <w:bCs/>
         </w:rPr>
-        <w:t xml:space="preserve">Průměrné platy</w:t>
+        <w:t xml:space="preserve">Průměrné reálné platy v sektoru státní správy v letech 2015–2018</w:t>
       </w:r>
       <w:r>
         <w:t xml:space="preserve"> </w:t>
       </w:r>
       <w:r>
-        <w:t xml:space="preserve">se výrazně liší jak mezi kategoriemi organizací, tak mezi organizacemi uvnitř těchto kategorií.</w:t>
+        <w:t xml:space="preserve">svým vývojem převyšovaly růst průměrných reálných mezd v ekonomice.</w:t>
       </w:r>
       <w:r>
         <w:t xml:space="preserve"> </w:t>
       </w:r>
       <w:r>
-        <w:t xml:space="preserve">Naše srovnání založená na datech</w:t>
+        <w:t xml:space="preserve">To přispělo k růstu relativních platů ve státní správě, a tedy i nákladů na tyto platy.</w:t>
       </w:r>
       <w:r>
         <w:t xml:space="preserve"> </w:t>
       </w:r>
       <w:r>
-        <w:rPr>
-          <w:i/>
-          <w:iCs/>
-        </w:rPr>
-        <w:t xml:space="preserve">Státního závěrečného účtu</w:t>
+        <w:t xml:space="preserve">V roce 2021 došlo k velkému propadu reálných platů ve státní správě, zatímco reálné mzdy v ekonomice ještě rostly.</w:t>
       </w:r>
       <w:r>
         <w:t xml:space="preserve"> </w:t>
       </w:r>
       <w:r>
-        <w:t xml:space="preserve">ale nemohou zohlednit vzdělanostní a další rozdíly, které se do platů a mezd promítají, což je třeba u prezentovaných srovnání brát v úvahu.</w:t>
+        <w:t xml:space="preserve">V letech 2022 a 2023 potom došlo k vysokým a podobným propadům reálných platů i mezd v ekonomice.</w:t>
       </w:r>
       <w:r>
         <w:t xml:space="preserve"> </w:t>
       </w:r>
       <w:r>
-        <w:t xml:space="preserve">Srovnání platů a mezd, které zohledňuje rozdíly vykonávaných profesí, úrovně vzdělání, věku, pohlaví a regionu nabízí</w:t>
-      </w:r>
-      <w:r>
-        <w:t xml:space="preserve"> </w:t>
-      </w:r>
-      <w:hyperlink r:id="rId110">
-        <w:r>
-          <w:rPr>
-            <w:rStyle w:val="Hyperlink"/>
-          </w:rPr>
-          <w:t xml:space="preserve">studie IDEA (2025)</w:t>
-        </w:r>
-      </w:hyperlink>
-      <w:r>
-        <w:t xml:space="preserve">.</w:t>
+        <w:t xml:space="preserve">V roce 2024 státní správa na ekonomiku dále ztrácela, v roce 2025 se tento propad téměř zastavil. Výjimkou jsou bezpečnostní sbory a skupina zahrnující Armádu ČR, kde relativní platy v roce 2025 stouply.</w:t>
       </w:r>
     </w:p>
     <w:p>
@@ -1532,12 +1452,12 @@
           <w:numId w:val="1000"/>
         </w:numPr>
       </w:pPr>
-      <w:hyperlink r:id="rId111">
+      <w:hyperlink r:id="rId102">
         <w:r>
           <w:rPr>
             <w:rStyle w:val="Hyperlink"/>
           </w:rPr>
-          <w:t xml:space="preserve">Graf 3a</w:t>
+          <w:t xml:space="preserve">Graf 5a</w:t>
         </w:r>
       </w:hyperlink>
       <w:r>
@@ -1548,18 +1468,18 @@
           <wp:inline>
             <wp:extent cx="114300" cy="114300"/>
             <wp:effectExtent b="0" l="0" r="0" t="0"/>
-            <wp:docPr descr="" title="" id="112" name="Picture"/>
+            <wp:docPr descr="" title="" id="110" name="Picture"/>
             <a:graphic>
               <a:graphicData uri="http://schemas.openxmlformats.org/drawingml/2006/picture">
                 <pic:pic>
                   <pic:nvPicPr>
-                    <pic:cNvPr descr="report-files/sipka.svg" id="113" name="Picture"/>
+                    <pic:cNvPr descr="report-files/sipka.svg" id="111" name="Picture"/>
                     <pic:cNvPicPr>
                       <a:picLocks noChangeArrowheads="1" noChangeAspect="1"/>
                     </pic:cNvPicPr>
                   </pic:nvPicPr>
                   <pic:blipFill>
-                    <a:blip r:embed="rId114">
+                    <a:blip r:embed="rId112">
                       <a:extLst>
                         <a:ext uri="{28A0092B-C50C-407E-A947-70E740481C1C}">
                           <a14:useLocalDpi xmlns:a14="http://schemas.microsoft.com/office/drawing/2010/main" val="0"/>
@@ -1607,25 +1527,55 @@
           <w:b/>
           <w:bCs/>
         </w:rPr>
-        <w:t xml:space="preserve">Nejvyšší průměrné měsíční platy</w:t>
+        <w:t xml:space="preserve">Průměrné platy</w:t>
       </w:r>
       <w:r>
         <w:t xml:space="preserve"> </w:t>
       </w:r>
       <w:r>
-        <w:t xml:space="preserve">měli v roce 2025 zaměstnanci ministerstev (62 tis. Kč), dále pak zaměstnanci ‚Ostatních ústředních orgánů’ (56 tis. Kč).</w:t>
+        <w:t xml:space="preserve">se výrazně liší jak mezi kategoriemi organizací, tak mezi organizacemi uvnitř těchto kategorií.</w:t>
       </w:r>
       <w:r>
         <w:t xml:space="preserve"> </w:t>
       </w:r>
       <w:r>
-        <w:t xml:space="preserve">Široký rozptyl měly průměrné platy organizací zařazených do kategorie ‚Ostatní organizační složky státu’, což odráží velkou rozmanitost funkcí a personálního složení těchto organizací.</w:t>
+        <w:t xml:space="preserve">Naše srovnání založená na datech</w:t>
       </w:r>
       <w:r>
         <w:t xml:space="preserve"> </w:t>
       </w:r>
       <w:r>
-        <w:t xml:space="preserve">Nejnižší platy pak mají zaměstnanci ‚Neústřední státní správy’, tedy převážně organizací poskytujících přímé služby občanům.</w:t>
+        <w:rPr>
+          <w:i/>
+          <w:iCs/>
+        </w:rPr>
+        <w:t xml:space="preserve">Státního závěrečného účtu</w:t>
+      </w:r>
+      <w:r>
+        <w:t xml:space="preserve"> </w:t>
+      </w:r>
+      <w:r>
+        <w:t xml:space="preserve">ale nemohou zohlednit vzdělanostní a další rozdíly, které se do platů a mezd promítají, což je třeba u prezentovaných srovnání brát v úvahu.</w:t>
+      </w:r>
+      <w:r>
+        <w:t xml:space="preserve"> </w:t>
+      </w:r>
+      <w:r>
+        <w:t xml:space="preserve">Srovnání platů a mezd, které zohledňuje rozdíly vykonávaných profesí, úrovně vzdělání, věku, pohlaví a regionu nabízí</w:t>
+      </w:r>
+      <w:r>
+        <w:t xml:space="preserve"> </w:t>
+      </w:r>
+      <w:hyperlink r:id="rId113">
+        <w:r>
+          <w:rPr>
+            <w:rStyle w:val="Hyperlink"/>
+          </w:rPr>
+          <w:t xml:space="preserve">studie IDEA (2025)</w:t>
+        </w:r>
+      </w:hyperlink>
+      <w:r>
+        <w:t xml:space="preserve">.</w:t>
       </w:r>
     </w:p>
     <w:p>
@@ -1636,7 +1586,7 @@
           <w:numId w:val="1000"/>
         </w:numPr>
       </w:pPr>
-      <w:hyperlink r:id="rId111">
+      <w:hyperlink r:id="rId114">
         <w:r>
           <w:rPr>
             <w:rStyle w:val="Hyperlink"/>
@@ -1711,25 +1661,25 @@
           <w:b/>
           <w:bCs/>
         </w:rPr>
-        <w:t xml:space="preserve">Průměrné platy zaměstnanců ministerstev</w:t>
+        <w:t xml:space="preserve">Nejvyšší průměrné měsíční platy</w:t>
       </w:r>
       <w:r>
         <w:t xml:space="preserve"> </w:t>
       </w:r>
       <w:r>
-        <w:t xml:space="preserve">(sídlících většinou v Praze) se liší od průměrné mzdy v Praze v rozpětí +5/-15 % (vyšší je rozdíl u MZV, kde je systém odměňování specifický).</w:t>
+        <w:t xml:space="preserve">měli v roce 2025 zaměstnanci ministerstev (62 tis. Kč), dále pak zaměstnanci ‚Ostatních ústředních orgánů’ (56 tis. Kč).</w:t>
       </w:r>
       <w:r>
         <w:t xml:space="preserve"> </w:t>
       </w:r>
       <w:r>
-        <w:t xml:space="preserve">Přesné důvody této platové nerovnosti nelze z dostupných dat vysledovat.</w:t>
+        <w:t xml:space="preserve">Široký rozptyl měly průměrné platy organizací zařazených do kategorie ‚Ostatní organizační složky státu’, což odráží velkou rozmanitost funkcí a personálního složení těchto organizací.</w:t>
       </w:r>
       <w:r>
         <w:t xml:space="preserve"> </w:t>
       </w:r>
       <w:r>
-        <w:t xml:space="preserve">Obecně ale hraje roli rozdílné personální složení co do odbornosti i věkové struktury a také zřejmě historicky dané rozdíly, které systém rozpočtování a platové politiky jednotlivých úřadů v průběhu času zachovávají.</w:t>
+        <w:t xml:space="preserve">Nejnižší platy pak mají zaměstnanci ‚Neústřední státní správy’, tedy převážně organizací poskytujících přímé služby občanům.</w:t>
       </w:r>
     </w:p>
     <w:p>
@@ -1740,7 +1690,7 @@
           <w:numId w:val="1000"/>
         </w:numPr>
       </w:pPr>
-      <w:hyperlink r:id="rId111">
+      <w:hyperlink r:id="rId114">
         <w:r>
           <w:rPr>
             <w:rStyle w:val="Hyperlink"/>
@@ -1803,21 +1753,11 @@
         </w:drawing>
       </w:r>
     </w:p>
-    <w:bookmarkEnd w:id="121"/>
-    <w:bookmarkStart w:id="136" w:name="výdaje-na-platy-zaměstnanců-státu"/>
-    <w:p>
-      <w:pPr>
-        <w:pStyle w:val="Heading2"/>
-      </w:pPr>
-      <w:r>
-        <w:t xml:space="preserve">Výdaje na platy zaměstnanců státu</w:t>
-      </w:r>
-    </w:p>
     <w:p>
       <w:pPr>
         <w:numPr>
           <w:ilvl w:val="0"/>
-          <w:numId w:val="1006"/>
+          <w:numId w:val="1005"/>
         </w:numPr>
       </w:pPr>
       <w:r>
@@ -1825,19 +1765,25 @@
           <w:b/>
           <w:bCs/>
         </w:rPr>
-        <w:t xml:space="preserve">Výdaje na platy zaměstnanců státu</w:t>
+        <w:t xml:space="preserve">Průměrné platy zaměstnanců ministerstev</w:t>
       </w:r>
       <w:r>
         <w:t xml:space="preserve"> </w:t>
       </w:r>
       <w:r>
-        <w:t xml:space="preserve">regulované státním rozpočtem (SR) v roce 2025 činily 284 miliard Kč, což představuje 12 % výdajů státního rozpočtu a 3,3 % HDP.</w:t>
+        <w:t xml:space="preserve">(sídlících většinou v Praze) se liší od průměrné mzdy v Praze v rozpětí +5/-15 % (vyšší je rozdíl u MZV, kde je systém odměňování specifický).</w:t>
       </w:r>
       <w:r>
         <w:t xml:space="preserve"> </w:t>
       </w:r>
       <w:r>
-        <w:t xml:space="preserve">Rozložení nákladů mezi jednotlivé oblasti zaměstnanosti zhruba odpovídá počtům tam pracujících zaměstnanců státu.</w:t>
+        <w:t xml:space="preserve">Přesné důvody této platové nerovnosti nelze z dostupných dat vysledovat.</w:t>
+      </w:r>
+      <w:r>
+        <w:t xml:space="preserve"> </w:t>
+      </w:r>
+      <w:r>
+        <w:t xml:space="preserve">Obecně ale hraje roli rozdílné personální složení co do odbornosti i věkové struktury a také zřejmě historicky dané rozdíly, které systém rozpočtování a platové politiky jednotlivých úřadů v průběhu času zachovávají.</w:t>
       </w:r>
     </w:p>
     <w:p>
@@ -1848,12 +1794,12 @@
           <w:numId w:val="1000"/>
         </w:numPr>
       </w:pPr>
-      <w:hyperlink r:id="rId122">
+      <w:hyperlink r:id="rId114">
         <w:r>
           <w:rPr>
             <w:rStyle w:val="Hyperlink"/>
           </w:rPr>
-          <w:t xml:space="preserve">Graf 1b</w:t>
+          <w:t xml:space="preserve">Graf 3a</w:t>
         </w:r>
       </w:hyperlink>
       <w:r>
@@ -1864,18 +1810,18 @@
           <wp:inline>
             <wp:extent cx="114300" cy="114300"/>
             <wp:effectExtent b="0" l="0" r="0" t="0"/>
-            <wp:docPr descr="" title="" id="123" name="Picture"/>
+            <wp:docPr descr="" title="" id="121" name="Picture"/>
             <a:graphic>
               <a:graphicData uri="http://schemas.openxmlformats.org/drawingml/2006/picture">
                 <pic:pic>
                   <pic:nvPicPr>
-                    <pic:cNvPr descr="report-files/sipka.svg" id="124" name="Picture"/>
+                    <pic:cNvPr descr="report-files/sipka.svg" id="122" name="Picture"/>
                     <pic:cNvPicPr>
                       <a:picLocks noChangeArrowheads="1" noChangeAspect="1"/>
                     </pic:cNvPicPr>
                   </pic:nvPicPr>
                   <pic:blipFill>
-                    <a:blip r:embed="rId125">
+                    <a:blip r:embed="rId123">
                       <a:extLst>
                         <a:ext uri="{28A0092B-C50C-407E-A947-70E740481C1C}">
                           <a14:useLocalDpi xmlns:a14="http://schemas.microsoft.com/office/drawing/2010/main" val="0"/>
@@ -1911,6 +1857,16 @@
         </w:drawing>
       </w:r>
     </w:p>
+    <w:bookmarkEnd w:id="124"/>
+    <w:bookmarkStart w:id="139" w:name="výdaje-na-platy-zaměstnanců-státu"/>
+    <w:p>
+      <w:pPr>
+        <w:pStyle w:val="Heading2"/>
+      </w:pPr>
+      <w:r>
+        <w:t xml:space="preserve">Výdaje na platy zaměstnanců státu</w:t>
+      </w:r>
+    </w:p>
     <w:p>
       <w:pPr>
         <w:numPr>
@@ -1923,19 +1879,19 @@
           <w:b/>
           <w:bCs/>
         </w:rPr>
-        <w:t xml:space="preserve">Výdaje na platy státních úředníků</w:t>
+        <w:t xml:space="preserve">Výdaje na platy zaměstnanců státu</w:t>
       </w:r>
       <w:r>
         <w:t xml:space="preserve"> </w:t>
       </w:r>
       <w:r>
-        <w:t xml:space="preserve">v roce 2025 činily zhruba 43,5 mld. Kč, což představuje 1,8 % státního rozpočtu a 0,51 % HDP.</w:t>
+        <w:t xml:space="preserve">regulované státním rozpočtem (SR) v roce 2025 činily 284 miliard Kč, což představuje 12 % výdajů státního rozpočtu a 3,3 % HDP.</w:t>
       </w:r>
       <w:r>
         <w:t xml:space="preserve"> </w:t>
       </w:r>
       <w:r>
-        <w:t xml:space="preserve">Náklady na platy úředníků ministerstev (opět včetně všech osob na MV ČR) představovaly 17,3 mld. Kč, tedy 38 % celkových nákladů na úředníky státu (bez bezpečnostních sborů uvnitř MV ČR odhadem 10 mld., tedy 22 % nákladů na státní úředníky).</w:t>
+        <w:t xml:space="preserve">Rozložení nákladů mezi jednotlivé oblasti zaměstnanosti zhruba odpovídá počtům tam pracujících zaměstnanců státu.</w:t>
       </w:r>
     </w:p>
     <w:p>
@@ -1946,7 +1902,7 @@
           <w:numId w:val="1000"/>
         </w:numPr>
       </w:pPr>
-      <w:hyperlink r:id="rId122">
+      <w:hyperlink r:id="rId125">
         <w:r>
           <w:rPr>
             <w:rStyle w:val="Hyperlink"/>
@@ -2021,31 +1977,19 @@
           <w:b/>
           <w:bCs/>
         </w:rPr>
-        <w:t xml:space="preserve">Nominální výdaje na platy státních úředníků poslední dvě dekády,</w:t>
+        <w:t xml:space="preserve">Výdaje na platy státních úředníků</w:t>
       </w:r>
       <w:r>
         <w:t xml:space="preserve"> </w:t>
       </w:r>
       <w:r>
-        <w:t xml:space="preserve">kromě let 2010 a 2011, rostly.</w:t>
+        <w:t xml:space="preserve">v roce 2025 činily zhruba 43,5 mld. Kč, což představuje 1,8 % státního rozpočtu a 0,51 % HDP.</w:t>
       </w:r>
       <w:r>
         <w:t xml:space="preserve"> </w:t>
       </w:r>
       <w:r>
-        <w:t xml:space="preserve">To je přirozené s ohledem na průběžnou inflaci, a hlavně průběžný růst nominálních platů v ekonomice.</w:t>
-      </w:r>
-      <w:r>
-        <w:t xml:space="preserve"> </w:t>
-      </w:r>
-      <w:r>
-        <w:t xml:space="preserve">Výdaje nejvíce rostly v období let 2012 až 2019, kdy růst platových nákladů odrážel jak růst počtu zaměstnanců, tak reálných průměrných platů (po zohlednění inflace).</w:t>
-      </w:r>
-      <w:r>
-        <w:t xml:space="preserve"> </w:t>
-      </w:r>
-      <w:r>
-        <w:t xml:space="preserve">Nárůst nominálních výdajů po roce 2021 byl tažen snahou alespoň částečně kompenzovat inflaci a omezovat výrazný pokles reálné hodnoty platů.</w:t>
+        <w:t xml:space="preserve">Náklady na platy úředníků ministerstev (opět včetně všech osob na MV ČR) představovaly 17,3 mld. Kč, tedy 38 % celkových nákladů na úředníky státu (bez bezpečnostních sborů uvnitř MV ČR odhadem 10 mld., tedy 22 % nákladů na státní úředníky).</w:t>
       </w:r>
     </w:p>
     <w:p>
@@ -2056,12 +2000,12 @@
           <w:numId w:val="1000"/>
         </w:numPr>
       </w:pPr>
-      <w:hyperlink r:id="rId129">
+      <w:hyperlink r:id="rId125">
         <w:r>
           <w:rPr>
             <w:rStyle w:val="Hyperlink"/>
           </w:rPr>
-          <w:t xml:space="preserve">Graf 4c</w:t>
+          <w:t xml:space="preserve">Graf 1b</w:t>
         </w:r>
       </w:hyperlink>
       <w:r>
@@ -2072,18 +2016,18 @@
           <wp:inline>
             <wp:extent cx="114300" cy="114300"/>
             <wp:effectExtent b="0" l="0" r="0" t="0"/>
-            <wp:docPr descr="" title="" id="130" name="Picture"/>
+            <wp:docPr descr="" title="" id="129" name="Picture"/>
             <a:graphic>
               <a:graphicData uri="http://schemas.openxmlformats.org/drawingml/2006/picture">
                 <pic:pic>
                   <pic:nvPicPr>
-                    <pic:cNvPr descr="report-files/sipka.svg" id="131" name="Picture"/>
+                    <pic:cNvPr descr="report-files/sipka.svg" id="130" name="Picture"/>
                     <pic:cNvPicPr>
                       <a:picLocks noChangeArrowheads="1" noChangeAspect="1"/>
                     </pic:cNvPicPr>
                   </pic:nvPicPr>
                   <pic:blipFill>
-                    <a:blip r:embed="rId132">
+                    <a:blip r:embed="rId131">
                       <a:extLst>
                         <a:ext uri="{28A0092B-C50C-407E-A947-70E740481C1C}">
                           <a14:useLocalDpi xmlns:a14="http://schemas.microsoft.com/office/drawing/2010/main" val="0"/>
@@ -2131,31 +2075,31 @@
           <w:b/>
           <w:bCs/>
         </w:rPr>
-        <w:t xml:space="preserve">Reálné výdaje na platy státních úředníků,</w:t>
+        <w:t xml:space="preserve">Nominální výdaje na platy státních úředníků poslední dvě dekády,</w:t>
       </w:r>
       <w:r>
         <w:t xml:space="preserve"> </w:t>
       </w:r>
       <w:r>
-        <w:t xml:space="preserve">tedy ve stálých cenách, poslední dvě dekády výrazně fluktuovaly.</w:t>
+        <w:t xml:space="preserve">kromě let 2010 a 2011, rostly.</w:t>
       </w:r>
       <w:r>
         <w:t xml:space="preserve"> </w:t>
       </w:r>
       <w:r>
-        <w:t xml:space="preserve">K nejrychlejšímu poklesu došlo po roce 2021 v důsledku inflační vlny a snahy o konsolidaci výdajů SR.</w:t>
+        <w:t xml:space="preserve">To je přirozené s ohledem na průběžnou inflaci, a hlavně průběžný růst nominálních platů v ekonomice.</w:t>
       </w:r>
       <w:r>
         <w:t xml:space="preserve"> </w:t>
       </w:r>
       <w:r>
-        <w:t xml:space="preserve">V roce 2025 tak byly výdaje v reálném vyjádření na platy cca o 2 mld. vyšší než v roce 2009, tedy před světovou finanční krizí.</w:t>
+        <w:t xml:space="preserve">Výdaje nejvíce rostly v období let 2012 až 2019, kdy růst platových nákladů odrážel jak růst počtu zaměstnanců, tak reálných průměrných platů (po zohlednění inflace).</w:t>
       </w:r>
       <w:r>
         <w:t xml:space="preserve"> </w:t>
       </w:r>
       <w:r>
-        <w:t xml:space="preserve">V mezidobí však výrazně narostla reálná hodnota HDP i příjmů a výdajů SR.</w:t>
+        <w:t xml:space="preserve">Nárůst nominálních výdajů po roce 2021 byl tažen snahou alespoň částečně kompenzovat inflaci a omezovat výrazný pokles reálné hodnoty platů.</w:t>
       </w:r>
     </w:p>
     <w:p>
@@ -2166,12 +2110,12 @@
           <w:numId w:val="1000"/>
         </w:numPr>
       </w:pPr>
-      <w:hyperlink r:id="rId99">
+      <w:hyperlink r:id="rId132">
         <w:r>
           <w:rPr>
             <w:rStyle w:val="Hyperlink"/>
           </w:rPr>
-          <w:t xml:space="preserve">Graf 5a</w:t>
+          <w:t xml:space="preserve">Graf 4c</w:t>
         </w:r>
       </w:hyperlink>
       <w:r>
@@ -2229,8 +2173,118 @@
         </w:drawing>
       </w:r>
     </w:p>
-    <w:bookmarkEnd w:id="136"/>
-    <w:bookmarkEnd w:id="137"/>
+    <w:p>
+      <w:pPr>
+        <w:numPr>
+          <w:ilvl w:val="0"/>
+          <w:numId w:val="1006"/>
+        </w:numPr>
+      </w:pPr>
+      <w:r>
+        <w:rPr>
+          <w:b/>
+          <w:bCs/>
+        </w:rPr>
+        <w:t xml:space="preserve">Reálné výdaje na platy státních úředníků,</w:t>
+      </w:r>
+      <w:r>
+        <w:t xml:space="preserve"> </w:t>
+      </w:r>
+      <w:r>
+        <w:t xml:space="preserve">tedy ve stálých cenách, poslední dvě dekády výrazně fluktuovaly.</w:t>
+      </w:r>
+      <w:r>
+        <w:t xml:space="preserve"> </w:t>
+      </w:r>
+      <w:r>
+        <w:t xml:space="preserve">K nejrychlejšímu poklesu došlo po roce 2021 v důsledku inflační vlny a snahy o konsolidaci výdajů SR.</w:t>
+      </w:r>
+      <w:r>
+        <w:t xml:space="preserve"> </w:t>
+      </w:r>
+      <w:r>
+        <w:t xml:space="preserve">V roce 2025 tak byly výdaje v reálném vyjádření na platy cca o 2 mld. vyšší než v roce 2009, tedy před světovou finanční krizí.</w:t>
+      </w:r>
+      <w:r>
+        <w:t xml:space="preserve"> </w:t>
+      </w:r>
+      <w:r>
+        <w:t xml:space="preserve">V mezidobí však výrazně narostla reálná hodnota HDP i příjmů a výdajů SR.</w:t>
+      </w:r>
+    </w:p>
+    <w:p>
+      <w:pPr>
+        <w:pStyle w:val="nospacepara"/>
+        <w:numPr>
+          <w:ilvl w:val="0"/>
+          <w:numId w:val="1000"/>
+        </w:numPr>
+      </w:pPr>
+      <w:hyperlink r:id="rId102">
+        <w:r>
+          <w:rPr>
+            <w:rStyle w:val="Hyperlink"/>
+          </w:rPr>
+          <w:t xml:space="preserve">Graf 5a</w:t>
+        </w:r>
+      </w:hyperlink>
+      <w:r>
+        <w:t xml:space="preserve"> </w:t>
+      </w:r>
+      <w:r>
+        <w:drawing>
+          <wp:inline>
+            <wp:extent cx="114300" cy="114300"/>
+            <wp:effectExtent b="0" l="0" r="0" t="0"/>
+            <wp:docPr descr="" title="" id="136" name="Picture"/>
+            <a:graphic>
+              <a:graphicData uri="http://schemas.openxmlformats.org/drawingml/2006/picture">
+                <pic:pic>
+                  <pic:nvPicPr>
+                    <pic:cNvPr descr="report-files/sipka.svg" id="137" name="Picture"/>
+                    <pic:cNvPicPr>
+                      <a:picLocks noChangeArrowheads="1" noChangeAspect="1"/>
+                    </pic:cNvPicPr>
+                  </pic:nvPicPr>
+                  <pic:blipFill>
+                    <a:blip r:embed="rId138">
+                      <a:extLst>
+                        <a:ext uri="{28A0092B-C50C-407E-A947-70E740481C1C}">
+                          <a14:useLocalDpi xmlns:a14="http://schemas.microsoft.com/office/drawing/2010/main" val="0"/>
+                        </a:ext>
+                        <a:ext uri="{96DAC541-7B7A-43D3-8B79-37D633B846F1}">
+                          <asvg:svgBlip xmlns:asvg="http://schemas.microsoft.com/office/drawing/2016/SVG/main" r:embed="rId67"/>
+                        </a:ext>
+                      </a:extLst>
+                    </a:blip>
+                    <a:stretch>
+                      <a:fillRect/>
+                    </a:stretch>
+                  </pic:blipFill>
+                  <pic:spPr bwMode="auto">
+                    <a:xfrm>
+                      <a:off x="0" y="0"/>
+                      <a:ext cx="114300" cy="114300"/>
+                    </a:xfrm>
+                    <a:prstGeom prst="rect">
+                      <a:avLst/>
+                    </a:prstGeom>
+                    <a:noFill/>
+                    <a:ln w="9525">
+                      <a:noFill/>
+                      <a:headEnd/>
+                      <a:tailEnd/>
+                    </a:ln>
+                  </pic:spPr>
+                </pic:pic>
+              </a:graphicData>
+            </a:graphic>
+          </wp:inline>
+        </w:drawing>
+      </w:r>
+    </w:p>
+    <w:bookmarkEnd w:id="139"/>
+    <w:bookmarkEnd w:id="140"/>
     <w:sectPr>
       <w:headerReference r:id="rId46" w:type="default"/>
       <w:footerReference r:id="rId47" w:type="default"/>

</xml_diff>